<commit_message>
docs: add Table 4.1 to 4.5 and full Chapter 4 requirements specification in report and list of tables
</commit_message>
<xml_diff>
--- a/ParkSmart_Final_Project_Report.docx
+++ b/ParkSmart_Final_Project_Report.docx
@@ -8204,7 +8204,7 @@
         <w:spacing w:after="100" w:before="220"/>
       </w:pPr>
       <w:r>
-        <w:t xml:space="preserve">Table 4.1: Functional Requirements</w:t>
+        <w:t xml:space="preserve">4.1 Functional Requirements Specification</w:t>
       </w:r>
       <w:r>
         <w:rPr>
@@ -8215,7 +8215,23 @@
           <w:sz w:val="24"/>
           <w:szCs w:val="24"/>
         </w:rPr>
-        <w:t xml:space="preserve">Table 4.1: Functional Requirements</w:t>
+        <w:t xml:space="preserve">4.1 Functional Requirements Specification</w:t>
+      </w:r>
+    </w:p>
+    <w:p>
+      <w:pPr>
+        <w:spacing w:after="100" w:before="60" w:line="360"/>
+        <w:jc w:val="both"/>
+      </w:pPr>
+      <w:r>
+        <w:rPr>
+          <w:rFonts w:ascii="Cambria" w:cs="Cambria" w:eastAsia="Cambria" w:hAnsi="Cambria"/>
+          <w:i w:val="false"/>
+          <w:iCs w:val="false"/>
+          <w:sz w:val="24"/>
+          <w:szCs w:val="24"/>
+        </w:rPr>
+        <w:t xml:space="preserve">The functional requirements specify the operational capabilities, authentication protocols, dynamic ticketing, and automated gate validation procedures implemented in the ParkSmart system:</w:t>
       </w:r>
     </w:p>
     <w:p>
@@ -8231,7 +8247,7 @@
           <w:sz w:val="22"/>
           <w:szCs w:val="22"/>
         </w:rPr>
-        <w:t xml:space="preserve">Table 4.1: Functional Requirements</w:t>
+        <w:t xml:space="preserve">Table 4.1: Functional Requirements Specification</w:t>
       </w:r>
     </w:p>
     <w:tbl>
@@ -8247,8 +8263,8 @@
         </w:tblBorders>
       </w:tblPr>
       <w:tblGrid>
-        <w:gridCol w:w="903"/>
-        <w:gridCol w:w="4332"/>
+        <w:gridCol w:w="1083"/>
+        <w:gridCol w:w="4152"/>
         <w:gridCol w:w="1083"/>
         <w:gridCol w:w="1625"/>
         <w:gridCol w:w="1083"/>
@@ -8259,7 +8275,7 @@
         </w:trPr>
         <w:tc>
           <w:tcPr>
-            <w:tcW w:type="pct" w:w="500"/>
+            <w:tcW w:type="pct" w:w="600"/>
             <w:shd w:fill="EAF2F8" w:val="clear"/>
           </w:tcPr>
           <w:p>
@@ -8278,7 +8294,7 @@
         </w:tc>
         <w:tc>
           <w:tcPr>
-            <w:tcW w:type="pct" w:w="2400"/>
+            <w:tcW w:type="pct" w:w="2300"/>
             <w:shd w:fill="EAF2F8" w:val="clear"/>
           </w:tcPr>
           <w:p>
@@ -8356,7 +8372,7 @@
       <w:tr>
         <w:tc>
           <w:tcPr>
-            <w:tcW w:type="pct" w:w="500"/>
+            <w:tcW w:type="pct" w:w="600"/>
           </w:tcPr>
           <w:p>
             <w:r>
@@ -8371,16 +8387,16 @@
         </w:tc>
         <w:tc>
           <w:tcPr>
-            <w:tcW w:type="pct" w:w="2400"/>
-          </w:tcPr>
-          <w:p>
-            <w:r>
-              <w:rPr>
-                <w:rFonts w:ascii="Cambria" w:cs="Cambria" w:eastAsia="Cambria" w:hAnsi="Cambria"/>
-                <w:sz w:val="19"/>
-                <w:szCs w:val="19"/>
-              </w:rPr>
-              <w:t xml:space="preserve">User login and secure authentication through JWT &amp; 2FA</w:t>
+            <w:tcW w:type="pct" w:w="2300"/>
+          </w:tcPr>
+          <w:p>
+            <w:r>
+              <w:rPr>
+                <w:rFonts w:ascii="Cambria" w:cs="Cambria" w:eastAsia="Cambria" w:hAnsi="Cambria"/>
+                <w:sz w:val="19"/>
+                <w:szCs w:val="19"/>
+              </w:rPr>
+              <w:t xml:space="preserve">User registration, login, and JWT session authorization</w:t>
             </w:r>
           </w:p>
         </w:tc>
@@ -8410,7 +8426,7 @@
                 <w:sz w:val="19"/>
                 <w:szCs w:val="19"/>
               </w:rPr>
-              <w:t xml:space="preserve">Project requirements</w:t>
+              <w:t xml:space="preserve">System Security</w:t>
             </w:r>
           </w:p>
         </w:tc>
@@ -8425,15 +8441,15 @@
                 <w:sz w:val="19"/>
                 <w:szCs w:val="19"/>
               </w:rPr>
-              <w:t xml:space="preserve">Implemented</w:t>
-            </w:r>
-          </w:p>
-        </w:tc>
-      </w:tr>
-      <w:tr>
-        <w:tc>
-          <w:tcPr>
-            <w:tcW w:type="pct" w:w="500"/>
+              <w:t xml:space="preserve">Completed</w:t>
+            </w:r>
+          </w:p>
+        </w:tc>
+      </w:tr>
+      <w:tr>
+        <w:tc>
+          <w:tcPr>
+            <w:tcW w:type="pct" w:w="600"/>
           </w:tcPr>
           <w:p>
             <w:r>
@@ -8448,16 +8464,16 @@
         </w:tc>
         <w:tc>
           <w:tcPr>
-            <w:tcW w:type="pct" w:w="2400"/>
-          </w:tcPr>
-          <w:p>
-            <w:r>
-              <w:rPr>
-                <w:rFonts w:ascii="Cambria" w:cs="Cambria" w:eastAsia="Cambria" w:hAnsi="Cambria"/>
-                <w:sz w:val="19"/>
-                <w:szCs w:val="19"/>
-              </w:rPr>
-              <w:t xml:space="preserve">Driver registration with vehicle license plate</w:t>
+            <w:tcW w:type="pct" w:w="2300"/>
+          </w:tcPr>
+          <w:p>
+            <w:r>
+              <w:rPr>
+                <w:rFonts w:ascii="Cambria" w:cs="Cambria" w:eastAsia="Cambria" w:hAnsi="Cambria"/>
+                <w:sz w:val="19"/>
+                <w:szCs w:val="19"/>
+              </w:rPr>
+              <w:t xml:space="preserve">Real-time visual 2D parking bay matrix</w:t>
             </w:r>
           </w:p>
         </w:tc>
@@ -8487,7 +8503,7 @@
                 <w:sz w:val="19"/>
                 <w:szCs w:val="19"/>
               </w:rPr>
-              <w:t xml:space="preserve">Project objectives</w:t>
+              <w:t xml:space="preserve">User Experience</w:t>
             </w:r>
           </w:p>
         </w:tc>
@@ -8502,15 +8518,15 @@
                 <w:sz w:val="19"/>
                 <w:szCs w:val="19"/>
               </w:rPr>
-              <w:t xml:space="preserve">Implemented</w:t>
-            </w:r>
-          </w:p>
-        </w:tc>
-      </w:tr>
-      <w:tr>
-        <w:tc>
-          <w:tcPr>
-            <w:tcW w:type="pct" w:w="500"/>
+              <w:t xml:space="preserve">Completed</w:t>
+            </w:r>
+          </w:p>
+        </w:tc>
+      </w:tr>
+      <w:tr>
+        <w:tc>
+          <w:tcPr>
+            <w:tcW w:type="pct" w:w="600"/>
           </w:tcPr>
           <w:p>
             <w:r>
@@ -8525,16 +8541,16 @@
         </w:tc>
         <w:tc>
           <w:tcPr>
-            <w:tcW w:type="pct" w:w="2400"/>
-          </w:tcPr>
-          <w:p>
-            <w:r>
-              <w:rPr>
-                <w:rFonts w:ascii="Cambria" w:cs="Cambria" w:eastAsia="Cambria" w:hAnsi="Cambria"/>
-                <w:sz w:val="19"/>
-                <w:szCs w:val="19"/>
-              </w:rPr>
-              <w:t xml:space="preserve">Interactive 2D floor map showing live slot availability</w:t>
+            <w:tcW w:type="pct" w:w="2300"/>
+          </w:tcPr>
+          <w:p>
+            <w:r>
+              <w:rPr>
+                <w:rFonts w:ascii="Cambria" w:cs="Cambria" w:eastAsia="Cambria" w:hAnsi="Cambria"/>
+                <w:sz w:val="19"/>
+                <w:szCs w:val="19"/>
+              </w:rPr>
+              <w:t xml:space="preserve">Slot reservation with vehicle type &amp; duration filters</w:t>
             </w:r>
           </w:p>
         </w:tc>
@@ -8564,7 +8580,7 @@
                 <w:sz w:val="19"/>
                 <w:szCs w:val="19"/>
               </w:rPr>
-              <w:t xml:space="preserve">Core functionality</w:t>
+              <w:t xml:space="preserve">Core Function</w:t>
             </w:r>
           </w:p>
         </w:tc>
@@ -8579,15 +8595,15 @@
                 <w:sz w:val="19"/>
                 <w:szCs w:val="19"/>
               </w:rPr>
-              <w:t xml:space="preserve">Implemented</w:t>
-            </w:r>
-          </w:p>
-        </w:tc>
-      </w:tr>
-      <w:tr>
-        <w:tc>
-          <w:tcPr>
-            <w:tcW w:type="pct" w:w="500"/>
+              <w:t xml:space="preserve">Completed</w:t>
+            </w:r>
+          </w:p>
+        </w:tc>
+      </w:tr>
+      <w:tr>
+        <w:tc>
+          <w:tcPr>
+            <w:tcW w:type="pct" w:w="600"/>
           </w:tcPr>
           <w:p>
             <w:r>
@@ -8602,16 +8618,16 @@
         </w:tc>
         <w:tc>
           <w:tcPr>
-            <w:tcW w:type="pct" w:w="2400"/>
-          </w:tcPr>
-          <w:p>
-            <w:r>
-              <w:rPr>
-                <w:rFonts w:ascii="Cambria" w:cs="Cambria" w:eastAsia="Cambria" w:hAnsi="Cambria"/>
-                <w:sz w:val="19"/>
-                <w:szCs w:val="19"/>
-              </w:rPr>
-              <w:t xml:space="preserve">Parking slot filtering by category (Two-Wheeler, Four-Wheeler, EV Charging)</w:t>
+            <w:tcW w:type="pct" w:w="2300"/>
+          </w:tcPr>
+          <w:p>
+            <w:r>
+              <w:rPr>
+                <w:rFonts w:ascii="Cambria" w:cs="Cambria" w:eastAsia="Cambria" w:hAnsi="Cambria"/>
+                <w:sz w:val="19"/>
+                <w:szCs w:val="19"/>
+              </w:rPr>
+              <w:t xml:space="preserve">HMAC-SHA256 Dynamic QR token generation (30 s rotation)</w:t>
             </w:r>
           </w:p>
         </w:tc>
@@ -8641,7 +8657,7 @@
                 <w:sz w:val="19"/>
                 <w:szCs w:val="19"/>
               </w:rPr>
-              <w:t xml:space="preserve">User requirements</w:t>
+              <w:t xml:space="preserve">Anti-Fraud</w:t>
             </w:r>
           </w:p>
         </w:tc>
@@ -8656,15 +8672,15 @@
                 <w:sz w:val="19"/>
                 <w:szCs w:val="19"/>
               </w:rPr>
-              <w:t xml:space="preserve">Implemented</w:t>
-            </w:r>
-          </w:p>
-        </w:tc>
-      </w:tr>
-      <w:tr>
-        <w:tc>
-          <w:tcPr>
-            <w:tcW w:type="pct" w:w="500"/>
+              <w:t xml:space="preserve">Completed</w:t>
+            </w:r>
+          </w:p>
+        </w:tc>
+      </w:tr>
+      <w:tr>
+        <w:tc>
+          <w:tcPr>
+            <w:tcW w:type="pct" w:w="600"/>
           </w:tcPr>
           <w:p>
             <w:r>
@@ -8679,16 +8695,16 @@
         </w:tc>
         <w:tc>
           <w:tcPr>
-            <w:tcW w:type="pct" w:w="2400"/>
-          </w:tcPr>
-          <w:p>
-            <w:r>
-              <w:rPr>
-                <w:rFonts w:ascii="Cambria" w:cs="Cambria" w:eastAsia="Cambria" w:hAnsi="Cambria"/>
-                <w:sz w:val="19"/>
-                <w:szCs w:val="19"/>
-              </w:rPr>
-              <w:t xml:space="preserve">Online payment processing via Razorpay test gateway</w:t>
+            <w:tcW w:type="pct" w:w="2300"/>
+          </w:tcPr>
+          <w:p>
+            <w:r>
+              <w:rPr>
+                <w:rFonts w:ascii="Cambria" w:cs="Cambria" w:eastAsia="Cambria" w:hAnsi="Cambria"/>
+                <w:sz w:val="19"/>
+                <w:szCs w:val="19"/>
+              </w:rPr>
+              <w:t xml:space="preserve">Security Desk camera scanner with Smart Auto Mode</w:t>
             </w:r>
           </w:p>
         </w:tc>
@@ -8718,7 +8734,7 @@
                 <w:sz w:val="19"/>
                 <w:szCs w:val="19"/>
               </w:rPr>
-              <w:t xml:space="preserve">Project objectives</w:t>
+              <w:t xml:space="preserve">Gate Operations</w:t>
             </w:r>
           </w:p>
         </w:tc>
@@ -8733,15 +8749,15 @@
                 <w:sz w:val="19"/>
                 <w:szCs w:val="19"/>
               </w:rPr>
-              <w:t xml:space="preserve">Implemented</w:t>
-            </w:r>
-          </w:p>
-        </w:tc>
-      </w:tr>
-      <w:tr>
-        <w:tc>
-          <w:tcPr>
-            <w:tcW w:type="pct" w:w="500"/>
+              <w:t xml:space="preserve">Completed</w:t>
+            </w:r>
+          </w:p>
+        </w:tc>
+      </w:tr>
+      <w:tr>
+        <w:tc>
+          <w:tcPr>
+            <w:tcW w:type="pct" w:w="600"/>
           </w:tcPr>
           <w:p>
             <w:r>
@@ -8756,16 +8772,16 @@
         </w:tc>
         <w:tc>
           <w:tcPr>
-            <w:tcW w:type="pct" w:w="2400"/>
-          </w:tcPr>
-          <w:p>
-            <w:r>
-              <w:rPr>
-                <w:rFonts w:ascii="Cambria" w:cs="Cambria" w:eastAsia="Cambria" w:hAnsi="Cambria"/>
-                <w:sz w:val="19"/>
-                <w:szCs w:val="19"/>
-              </w:rPr>
-              <w:t xml:space="preserve">Dynamic QR pass generation with HMAC-SHA256 token rotation (30s)</w:t>
+            <w:tcW w:type="pct" w:w="2300"/>
+          </w:tcPr>
+          <w:p>
+            <w:r>
+              <w:rPr>
+                <w:rFonts w:ascii="Cambria" w:cs="Cambria" w:eastAsia="Cambria" w:hAnsi="Cambria"/>
+                <w:sz w:val="19"/>
+                <w:szCs w:val="19"/>
+              </w:rPr>
+              <w:t xml:space="preserve">1-Click Gate mode recovery for active/confirmed vehicles</w:t>
             </w:r>
           </w:p>
         </w:tc>
@@ -8780,6 +8796,83 @@
                 <w:sz w:val="19"/>
                 <w:szCs w:val="19"/>
               </w:rPr>
+              <w:t xml:space="preserve">Medium</w:t>
+            </w:r>
+          </w:p>
+        </w:tc>
+        <w:tc>
+          <w:tcPr>
+            <w:tcW w:type="pct" w:w="900"/>
+          </w:tcPr>
+          <w:p>
+            <w:r>
+              <w:rPr>
+                <w:rFonts w:ascii="Cambria" w:cs="Cambria" w:eastAsia="Cambria" w:hAnsi="Cambria"/>
+                <w:sz w:val="19"/>
+                <w:szCs w:val="19"/>
+              </w:rPr>
+              <w:t xml:space="preserve">Error Prevention</w:t>
+            </w:r>
+          </w:p>
+        </w:tc>
+        <w:tc>
+          <w:tcPr>
+            <w:tcW w:type="pct" w:w="600"/>
+          </w:tcPr>
+          <w:p>
+            <w:r>
+              <w:rPr>
+                <w:rFonts w:ascii="Cambria" w:cs="Cambria" w:eastAsia="Cambria" w:hAnsi="Cambria"/>
+                <w:sz w:val="19"/>
+                <w:szCs w:val="19"/>
+              </w:rPr>
+              <w:t xml:space="preserve">Completed</w:t>
+            </w:r>
+          </w:p>
+        </w:tc>
+      </w:tr>
+      <w:tr>
+        <w:tc>
+          <w:tcPr>
+            <w:tcW w:type="pct" w:w="600"/>
+          </w:tcPr>
+          <w:p>
+            <w:r>
+              <w:rPr>
+                <w:rFonts w:ascii="Cambria" w:cs="Cambria" w:eastAsia="Cambria" w:hAnsi="Cambria"/>
+                <w:sz w:val="19"/>
+                <w:szCs w:val="19"/>
+              </w:rPr>
+              <w:t xml:space="preserve">FR-07</w:t>
+            </w:r>
+          </w:p>
+        </w:tc>
+        <w:tc>
+          <w:tcPr>
+            <w:tcW w:type="pct" w:w="2300"/>
+          </w:tcPr>
+          <w:p>
+            <w:r>
+              <w:rPr>
+                <w:rFonts w:ascii="Cambria" w:cs="Cambria" w:eastAsia="Cambria" w:hAnsi="Cambria"/>
+                <w:sz w:val="19"/>
+                <w:szCs w:val="19"/>
+              </w:rPr>
+              <w:t xml:space="preserve">Automated overstay penalty billing at checkout</w:t>
+            </w:r>
+          </w:p>
+        </w:tc>
+        <w:tc>
+          <w:tcPr>
+            <w:tcW w:type="pct" w:w="600"/>
+          </w:tcPr>
+          <w:p>
+            <w:r>
+              <w:rPr>
+                <w:rFonts w:ascii="Cambria" w:cs="Cambria" w:eastAsia="Cambria" w:hAnsi="Cambria"/>
+                <w:sz w:val="19"/>
+                <w:szCs w:val="19"/>
+              </w:rPr>
               <w:t xml:space="preserve">High</w:t>
             </w:r>
           </w:p>
@@ -8795,7 +8888,7 @@
                 <w:sz w:val="19"/>
                 <w:szCs w:val="19"/>
               </w:rPr>
-              <w:t xml:space="preserve">Security requirements</w:t>
+              <w:t xml:space="preserve">Billing Module</w:t>
             </w:r>
           </w:p>
         </w:tc>
@@ -8810,42 +8903,12 @@
                 <w:sz w:val="19"/>
                 <w:szCs w:val="19"/>
               </w:rPr>
-              <w:t xml:space="preserve">Implemented</w:t>
-            </w:r>
-          </w:p>
-        </w:tc>
-      </w:tr>
-      <w:tr>
-        <w:tc>
-          <w:tcPr>
-            <w:tcW w:type="pct" w:w="500"/>
-          </w:tcPr>
-          <w:p>
-            <w:r>
-              <w:rPr>
-                <w:rFonts w:ascii="Cambria" w:cs="Cambria" w:eastAsia="Cambria" w:hAnsi="Cambria"/>
-                <w:sz w:val="19"/>
-                <w:szCs w:val="19"/>
-              </w:rPr>
-              <w:t xml:space="preserve">FR-07</w:t>
-            </w:r>
-          </w:p>
-        </w:tc>
-        <w:tc>
-          <w:tcPr>
-            <w:tcW w:type="pct" w:w="2400"/>
-          </w:tcPr>
-          <w:p>
-            <w:r>
-              <w:rPr>
-                <w:rFonts w:ascii="Cambria" w:cs="Cambria" w:eastAsia="Cambria" w:hAnsi="Cambria"/>
-                <w:sz w:val="19"/>
-                <w:szCs w:val="19"/>
-              </w:rPr>
-              <w:t xml:space="preserve">Security Gate scanner with Smart Auto Entry/Exit mode</w:t>
-            </w:r>
-          </w:p>
-        </w:tc>
+              <w:t xml:space="preserve">Completed</w:t>
+            </w:r>
+          </w:p>
+        </w:tc>
+      </w:tr>
+      <w:tr>
         <w:tc>
           <w:tcPr>
             <w:tcW w:type="pct" w:w="600"/>
@@ -8857,6 +8920,36 @@
                 <w:sz w:val="19"/>
                 <w:szCs w:val="19"/>
               </w:rPr>
+              <w:t xml:space="preserve">FR-08</w:t>
+            </w:r>
+          </w:p>
+        </w:tc>
+        <w:tc>
+          <w:tcPr>
+            <w:tcW w:type="pct" w:w="2300"/>
+          </w:tcPr>
+          <w:p>
+            <w:r>
+              <w:rPr>
+                <w:rFonts w:ascii="Cambria" w:cs="Cambria" w:eastAsia="Cambria" w:hAnsi="Cambria"/>
+                <w:sz w:val="19"/>
+                <w:szCs w:val="19"/>
+              </w:rPr>
+              <w:t xml:space="preserve">Admin dashboard for slot management and revenue logs</w:t>
+            </w:r>
+          </w:p>
+        </w:tc>
+        <w:tc>
+          <w:tcPr>
+            <w:tcW w:type="pct" w:w="600"/>
+          </w:tcPr>
+          <w:p>
+            <w:r>
+              <w:rPr>
+                <w:rFonts w:ascii="Cambria" w:cs="Cambria" w:eastAsia="Cambria" w:hAnsi="Cambria"/>
+                <w:sz w:val="19"/>
+                <w:szCs w:val="19"/>
+              </w:rPr>
               <w:t xml:space="preserve">High</w:t>
             </w:r>
           </w:p>
@@ -8872,7 +8965,7 @@
                 <w:sz w:val="19"/>
                 <w:szCs w:val="19"/>
               </w:rPr>
-              <w:t xml:space="preserve">Gate operations</w:t>
+              <w:t xml:space="preserve">Management</w:t>
             </w:r>
           </w:p>
         </w:tc>
@@ -8887,392 +8980,7 @@
                 <w:sz w:val="19"/>
                 <w:szCs w:val="19"/>
               </w:rPr>
-              <w:t xml:space="preserve">Implemented</w:t>
-            </w:r>
-          </w:p>
-        </w:tc>
-      </w:tr>
-      <w:tr>
-        <w:tc>
-          <w:tcPr>
-            <w:tcW w:type="pct" w:w="500"/>
-          </w:tcPr>
-          <w:p>
-            <w:r>
-              <w:rPr>
-                <w:rFonts w:ascii="Cambria" w:cs="Cambria" w:eastAsia="Cambria" w:hAnsi="Cambria"/>
-                <w:sz w:val="19"/>
-                <w:szCs w:val="19"/>
-              </w:rPr>
-              <w:t xml:space="preserve">FR-08</w:t>
-            </w:r>
-          </w:p>
-        </w:tc>
-        <w:tc>
-          <w:tcPr>
-            <w:tcW w:type="pct" w:w="2400"/>
-          </w:tcPr>
-          <w:p>
-            <w:r>
-              <w:rPr>
-                <w:rFonts w:ascii="Cambria" w:cs="Cambria" w:eastAsia="Cambria" w:hAnsi="Cambria"/>
-                <w:sz w:val="19"/>
-                <w:szCs w:val="19"/>
-              </w:rPr>
-              <w:t xml:space="preserve">Fallback manual vehicle number plate verification for guards</w:t>
-            </w:r>
-          </w:p>
-        </w:tc>
-        <w:tc>
-          <w:tcPr>
-            <w:tcW w:type="pct" w:w="600"/>
-          </w:tcPr>
-          <w:p>
-            <w:r>
-              <w:rPr>
-                <w:rFonts w:ascii="Cambria" w:cs="Cambria" w:eastAsia="Cambria" w:hAnsi="Cambria"/>
-                <w:sz w:val="19"/>
-                <w:szCs w:val="19"/>
-              </w:rPr>
-              <w:t xml:space="preserve">Medium</w:t>
-            </w:r>
-          </w:p>
-        </w:tc>
-        <w:tc>
-          <w:tcPr>
-            <w:tcW w:type="pct" w:w="900"/>
-          </w:tcPr>
-          <w:p>
-            <w:r>
-              <w:rPr>
-                <w:rFonts w:ascii="Cambria" w:cs="Cambria" w:eastAsia="Cambria" w:hAnsi="Cambria"/>
-                <w:sz w:val="19"/>
-                <w:szCs w:val="19"/>
-              </w:rPr>
-              <w:t xml:space="preserve">Usability</w:t>
-            </w:r>
-          </w:p>
-        </w:tc>
-        <w:tc>
-          <w:tcPr>
-            <w:tcW w:type="pct" w:w="600"/>
-          </w:tcPr>
-          <w:p>
-            <w:r>
-              <w:rPr>
-                <w:rFonts w:ascii="Cambria" w:cs="Cambria" w:eastAsia="Cambria" w:hAnsi="Cambria"/>
-                <w:sz w:val="19"/>
-                <w:szCs w:val="19"/>
-              </w:rPr>
-              <w:t xml:space="preserve">Implemented</w:t>
-            </w:r>
-          </w:p>
-        </w:tc>
-      </w:tr>
-      <w:tr>
-        <w:tc>
-          <w:tcPr>
-            <w:tcW w:type="pct" w:w="500"/>
-          </w:tcPr>
-          <w:p>
-            <w:r>
-              <w:rPr>
-                <w:rFonts w:ascii="Cambria" w:cs="Cambria" w:eastAsia="Cambria" w:hAnsi="Cambria"/>
-                <w:sz w:val="19"/>
-                <w:szCs w:val="19"/>
-              </w:rPr>
-              <w:t xml:space="preserve">FR-09</w:t>
-            </w:r>
-          </w:p>
-        </w:tc>
-        <w:tc>
-          <w:tcPr>
-            <w:tcW w:type="pct" w:w="2400"/>
-          </w:tcPr>
-          <w:p>
-            <w:r>
-              <w:rPr>
-                <w:rFonts w:ascii="Cambria" w:cs="Cambria" w:eastAsia="Cambria" w:hAnsi="Cambria"/>
-                <w:sz w:val="19"/>
-                <w:szCs w:val="19"/>
-              </w:rPr>
-              <w:t xml:space="preserve">Automated overstay penalty fee calculation and billing</w:t>
-            </w:r>
-          </w:p>
-        </w:tc>
-        <w:tc>
-          <w:tcPr>
-            <w:tcW w:type="pct" w:w="600"/>
-          </w:tcPr>
-          <w:p>
-            <w:r>
-              <w:rPr>
-                <w:rFonts w:ascii="Cambria" w:cs="Cambria" w:eastAsia="Cambria" w:hAnsi="Cambria"/>
-                <w:sz w:val="19"/>
-                <w:szCs w:val="19"/>
-              </w:rPr>
-              <w:t xml:space="preserve">High</w:t>
-            </w:r>
-          </w:p>
-        </w:tc>
-        <w:tc>
-          <w:tcPr>
-            <w:tcW w:type="pct" w:w="900"/>
-          </w:tcPr>
-          <w:p>
-            <w:r>
-              <w:rPr>
-                <w:rFonts w:ascii="Cambria" w:cs="Cambria" w:eastAsia="Cambria" w:hAnsi="Cambria"/>
-                <w:sz w:val="19"/>
-                <w:szCs w:val="19"/>
-              </w:rPr>
-              <w:t xml:space="preserve">Billing module</w:t>
-            </w:r>
-          </w:p>
-        </w:tc>
-        <w:tc>
-          <w:tcPr>
-            <w:tcW w:type="pct" w:w="600"/>
-          </w:tcPr>
-          <w:p>
-            <w:r>
-              <w:rPr>
-                <w:rFonts w:ascii="Cambria" w:cs="Cambria" w:eastAsia="Cambria" w:hAnsi="Cambria"/>
-                <w:sz w:val="19"/>
-                <w:szCs w:val="19"/>
-              </w:rPr>
-              <w:t xml:space="preserve">Implemented</w:t>
-            </w:r>
-          </w:p>
-        </w:tc>
-      </w:tr>
-      <w:tr>
-        <w:tc>
-          <w:tcPr>
-            <w:tcW w:type="pct" w:w="500"/>
-          </w:tcPr>
-          <w:p>
-            <w:r>
-              <w:rPr>
-                <w:rFonts w:ascii="Cambria" w:cs="Cambria" w:eastAsia="Cambria" w:hAnsi="Cambria"/>
-                <w:sz w:val="19"/>
-                <w:szCs w:val="19"/>
-              </w:rPr>
-              <w:t xml:space="preserve">FR-10</w:t>
-            </w:r>
-          </w:p>
-        </w:tc>
-        <w:tc>
-          <w:tcPr>
-            <w:tcW w:type="pct" w:w="2400"/>
-          </w:tcPr>
-          <w:p>
-            <w:r>
-              <w:rPr>
-                <w:rFonts w:ascii="Cambria" w:cs="Cambria" w:eastAsia="Cambria" w:hAnsi="Cambria"/>
-                <w:sz w:val="19"/>
-                <w:szCs w:val="19"/>
-              </w:rPr>
-              <w:t xml:space="preserve">Automated email notifications via Nodemailer SMTP</w:t>
-            </w:r>
-          </w:p>
-        </w:tc>
-        <w:tc>
-          <w:tcPr>
-            <w:tcW w:type="pct" w:w="600"/>
-          </w:tcPr>
-          <w:p>
-            <w:r>
-              <w:rPr>
-                <w:rFonts w:ascii="Cambria" w:cs="Cambria" w:eastAsia="Cambria" w:hAnsi="Cambria"/>
-                <w:sz w:val="19"/>
-                <w:szCs w:val="19"/>
-              </w:rPr>
-              <w:t xml:space="preserve">High</w:t>
-            </w:r>
-          </w:p>
-        </w:tc>
-        <w:tc>
-          <w:tcPr>
-            <w:tcW w:type="pct" w:w="900"/>
-          </w:tcPr>
-          <w:p>
-            <w:r>
-              <w:rPr>
-                <w:rFonts w:ascii="Cambria" w:cs="Cambria" w:eastAsia="Cambria" w:hAnsi="Cambria"/>
-                <w:sz w:val="19"/>
-                <w:szCs w:val="19"/>
-              </w:rPr>
-              <w:t xml:space="preserve">Notification service</w:t>
-            </w:r>
-          </w:p>
-        </w:tc>
-        <w:tc>
-          <w:tcPr>
-            <w:tcW w:type="pct" w:w="600"/>
-          </w:tcPr>
-          <w:p>
-            <w:r>
-              <w:rPr>
-                <w:rFonts w:ascii="Cambria" w:cs="Cambria" w:eastAsia="Cambria" w:hAnsi="Cambria"/>
-                <w:sz w:val="19"/>
-                <w:szCs w:val="19"/>
-              </w:rPr>
-              <w:t xml:space="preserve">Implemented</w:t>
-            </w:r>
-          </w:p>
-        </w:tc>
-      </w:tr>
-      <w:tr>
-        <w:tc>
-          <w:tcPr>
-            <w:tcW w:type="pct" w:w="500"/>
-          </w:tcPr>
-          <w:p>
-            <w:r>
-              <w:rPr>
-                <w:rFonts w:ascii="Cambria" w:cs="Cambria" w:eastAsia="Cambria" w:hAnsi="Cambria"/>
-                <w:sz w:val="19"/>
-                <w:szCs w:val="19"/>
-              </w:rPr>
-              <w:t xml:space="preserve">FR-11</w:t>
-            </w:r>
-          </w:p>
-        </w:tc>
-        <w:tc>
-          <w:tcPr>
-            <w:tcW w:type="pct" w:w="2400"/>
-          </w:tcPr>
-          <w:p>
-            <w:r>
-              <w:rPr>
-                <w:rFonts w:ascii="Cambria" w:cs="Cambria" w:eastAsia="Cambria" w:hAnsi="Cambria"/>
-                <w:sz w:val="19"/>
-                <w:szCs w:val="19"/>
-              </w:rPr>
-              <w:t xml:space="preserve">Real-time slot status synchronization using Socket.IO</w:t>
-            </w:r>
-          </w:p>
-        </w:tc>
-        <w:tc>
-          <w:tcPr>
-            <w:tcW w:type="pct" w:w="600"/>
-          </w:tcPr>
-          <w:p>
-            <w:r>
-              <w:rPr>
-                <w:rFonts w:ascii="Cambria" w:cs="Cambria" w:eastAsia="Cambria" w:hAnsi="Cambria"/>
-                <w:sz w:val="19"/>
-                <w:szCs w:val="19"/>
-              </w:rPr>
-              <w:t xml:space="preserve">High</w:t>
-            </w:r>
-          </w:p>
-        </w:tc>
-        <w:tc>
-          <w:tcPr>
-            <w:tcW w:type="pct" w:w="900"/>
-          </w:tcPr>
-          <w:p>
-            <w:r>
-              <w:rPr>
-                <w:rFonts w:ascii="Cambria" w:cs="Cambria" w:eastAsia="Cambria" w:hAnsi="Cambria"/>
-                <w:sz w:val="19"/>
-                <w:szCs w:val="19"/>
-              </w:rPr>
-              <w:t xml:space="preserve">Architecture design</w:t>
-            </w:r>
-          </w:p>
-        </w:tc>
-        <w:tc>
-          <w:tcPr>
-            <w:tcW w:type="pct" w:w="600"/>
-          </w:tcPr>
-          <w:p>
-            <w:r>
-              <w:rPr>
-                <w:rFonts w:ascii="Cambria" w:cs="Cambria" w:eastAsia="Cambria" w:hAnsi="Cambria"/>
-                <w:sz w:val="19"/>
-                <w:szCs w:val="19"/>
-              </w:rPr>
-              <w:t xml:space="preserve">Implemented</w:t>
-            </w:r>
-          </w:p>
-        </w:tc>
-      </w:tr>
-      <w:tr>
-        <w:tc>
-          <w:tcPr>
-            <w:tcW w:type="pct" w:w="500"/>
-          </w:tcPr>
-          <w:p>
-            <w:r>
-              <w:rPr>
-                <w:rFonts w:ascii="Cambria" w:cs="Cambria" w:eastAsia="Cambria" w:hAnsi="Cambria"/>
-                <w:sz w:val="19"/>
-                <w:szCs w:val="19"/>
-              </w:rPr>
-              <w:t xml:space="preserve">FR-12</w:t>
-            </w:r>
-          </w:p>
-        </w:tc>
-        <w:tc>
-          <w:tcPr>
-            <w:tcW w:type="pct" w:w="2400"/>
-          </w:tcPr>
-          <w:p>
-            <w:r>
-              <w:rPr>
-                <w:rFonts w:ascii="Cambria" w:cs="Cambria" w:eastAsia="Cambria" w:hAnsi="Cambria"/>
-                <w:sz w:val="19"/>
-                <w:szCs w:val="19"/>
-              </w:rPr>
-              <w:t xml:space="preserve">Admin dashboard for slot management, pricing, revenue, and reports</w:t>
-            </w:r>
-          </w:p>
-        </w:tc>
-        <w:tc>
-          <w:tcPr>
-            <w:tcW w:type="pct" w:w="600"/>
-          </w:tcPr>
-          <w:p>
-            <w:r>
-              <w:rPr>
-                <w:rFonts w:ascii="Cambria" w:cs="Cambria" w:eastAsia="Cambria" w:hAnsi="Cambria"/>
-                <w:sz w:val="19"/>
-                <w:szCs w:val="19"/>
-              </w:rPr>
-              <w:t xml:space="preserve">High</w:t>
-            </w:r>
-          </w:p>
-        </w:tc>
-        <w:tc>
-          <w:tcPr>
-            <w:tcW w:type="pct" w:w="900"/>
-          </w:tcPr>
-          <w:p>
-            <w:r>
-              <w:rPr>
-                <w:rFonts w:ascii="Cambria" w:cs="Cambria" w:eastAsia="Cambria" w:hAnsi="Cambria"/>
-                <w:sz w:val="19"/>
-                <w:szCs w:val="19"/>
-              </w:rPr>
-              <w:t xml:space="preserve">Management module</w:t>
-            </w:r>
-          </w:p>
-        </w:tc>
-        <w:tc>
-          <w:tcPr>
-            <w:tcW w:type="pct" w:w="600"/>
-          </w:tcPr>
-          <w:p>
-            <w:r>
-              <w:rPr>
-                <w:rFonts w:ascii="Cambria" w:cs="Cambria" w:eastAsia="Cambria" w:hAnsi="Cambria"/>
-                <w:sz w:val="19"/>
-                <w:szCs w:val="19"/>
-              </w:rPr>
-              <w:t xml:space="preserve">Implemented</w:t>
+              <w:t xml:space="preserve">Completed</w:t>
             </w:r>
           </w:p>
         </w:tc>
@@ -9284,7 +8992,7 @@
         <w:spacing w:after="100" w:before="220"/>
       </w:pPr>
       <w:r>
-        <w:t xml:space="preserve">Table 4.4: Software Requirements</w:t>
+        <w:t xml:space="preserve">4.2 Non-Functional Requirements Specification</w:t>
       </w:r>
       <w:r>
         <w:rPr>
@@ -9295,7 +9003,23 @@
           <w:sz w:val="24"/>
           <w:szCs w:val="24"/>
         </w:rPr>
-        <w:t xml:space="preserve">Table 4.4: Software Requirements</w:t>
+        <w:t xml:space="preserve">4.2 Non-Functional Requirements Specification</w:t>
+      </w:r>
+    </w:p>
+    <w:p>
+      <w:pPr>
+        <w:spacing w:after="100" w:before="60" w:line="360"/>
+        <w:jc w:val="both"/>
+      </w:pPr>
+      <w:r>
+        <w:rPr>
+          <w:rFonts w:ascii="Cambria" w:cs="Cambria" w:eastAsia="Cambria" w:hAnsi="Cambria"/>
+          <w:i w:val="false"/>
+          <w:iCs w:val="false"/>
+          <w:sz w:val="24"/>
+          <w:szCs w:val="24"/>
+        </w:rPr>
+        <w:t xml:space="preserve">The non-functional requirements define the quality attributes, throughput targets, security controls, responsiveness across client devices, and error tolerances:</w:t>
       </w:r>
     </w:p>
     <w:p>
@@ -9311,7 +9035,7 @@
           <w:sz w:val="22"/>
           <w:szCs w:val="22"/>
         </w:rPr>
-        <w:t xml:space="preserve">Table 4.4: Software Requirements</w:t>
+        <w:t xml:space="preserve">Table 4.2: Non-Functional Requirements Specification</w:t>
       </w:r>
     </w:p>
     <w:tbl>
@@ -9327,10 +9051,11 @@
         </w:tblBorders>
       </w:tblPr>
       <w:tblGrid>
-        <w:gridCol w:w="2257"/>
+        <w:gridCol w:w="1083"/>
+        <w:gridCol w:w="1444"/>
+        <w:gridCol w:w="3791"/>
         <w:gridCol w:w="1625"/>
-        <w:gridCol w:w="3340"/>
-        <w:gridCol w:w="1805"/>
+        <w:gridCol w:w="1083"/>
       </w:tblGrid>
       <w:tr>
         <w:trPr>
@@ -9338,7 +9063,7 @@
         </w:trPr>
         <w:tc>
           <w:tcPr>
-            <w:tcW w:type="pct" w:w="1250"/>
+            <w:tcW w:type="pct" w:w="600"/>
             <w:shd w:fill="EAF2F8" w:val="clear"/>
           </w:tcPr>
           <w:p>
@@ -9351,13 +9076,13 @@
                 <w:sz w:val="20"/>
                 <w:szCs w:val="20"/>
               </w:rPr>
-              <w:t xml:space="preserve">Software / Tool</w:t>
-            </w:r>
-          </w:p>
-        </w:tc>
-        <w:tc>
-          <w:tcPr>
-            <w:tcW w:type="pct" w:w="900"/>
+              <w:t xml:space="preserve">Req. ID</w:t>
+            </w:r>
+          </w:p>
+        </w:tc>
+        <w:tc>
+          <w:tcPr>
+            <w:tcW w:type="pct" w:w="800"/>
             <w:shd w:fill="EAF2F8" w:val="clear"/>
           </w:tcPr>
           <w:p>
@@ -9370,13 +9095,13 @@
                 <w:sz w:val="20"/>
                 <w:szCs w:val="20"/>
               </w:rPr>
-              <w:t xml:space="preserve">Version</w:t>
-            </w:r>
-          </w:p>
-        </w:tc>
-        <w:tc>
-          <w:tcPr>
-            <w:tcW w:type="pct" w:w="1850"/>
+              <w:t xml:space="preserve">Category</w:t>
+            </w:r>
+          </w:p>
+        </w:tc>
+        <w:tc>
+          <w:tcPr>
+            <w:tcW w:type="pct" w:w="2100"/>
             <w:shd w:fill="EAF2F8" w:val="clear"/>
           </w:tcPr>
           <w:p>
@@ -9389,13 +9114,13 @@
                 <w:sz w:val="20"/>
                 <w:szCs w:val="20"/>
               </w:rPr>
-              <w:t xml:space="preserve">Purpose</w:t>
-            </w:r>
-          </w:p>
-        </w:tc>
-        <w:tc>
-          <w:tcPr>
-            <w:tcW w:type="pct" w:w="1000"/>
+              <w:t xml:space="preserve">Requirement</w:t>
+            </w:r>
+          </w:p>
+        </w:tc>
+        <w:tc>
+          <w:tcPr>
+            <w:tcW w:type="pct" w:w="900"/>
             <w:shd w:fill="EAF2F8" w:val="clear"/>
           </w:tcPr>
           <w:p>
@@ -9408,6 +9133,1024 @@
                 <w:sz w:val="20"/>
                 <w:szCs w:val="20"/>
               </w:rPr>
+              <w:t xml:space="preserve">Target / Measure</w:t>
+            </w:r>
+          </w:p>
+        </w:tc>
+        <w:tc>
+          <w:tcPr>
+            <w:tcW w:type="pct" w:w="600"/>
+            <w:shd w:fill="EAF2F8" w:val="clear"/>
+          </w:tcPr>
+          <w:p>
+            <w:r>
+              <w:rPr>
+                <w:rFonts w:ascii="Cambria" w:cs="Cambria" w:eastAsia="Cambria" w:hAnsi="Cambria"/>
+                <w:b/>
+                <w:bCs/>
+                <w:color w:val="003366"/>
+                <w:sz w:val="20"/>
+                <w:szCs w:val="20"/>
+              </w:rPr>
+              <w:t xml:space="preserve">Status</w:t>
+            </w:r>
+          </w:p>
+        </w:tc>
+      </w:tr>
+      <w:tr>
+        <w:tc>
+          <w:tcPr>
+            <w:tcW w:type="pct" w:w="600"/>
+          </w:tcPr>
+          <w:p>
+            <w:r>
+              <w:rPr>
+                <w:rFonts w:ascii="Cambria" w:cs="Cambria" w:eastAsia="Cambria" w:hAnsi="Cambria"/>
+                <w:sz w:val="19"/>
+                <w:szCs w:val="19"/>
+              </w:rPr>
+              <w:t xml:space="preserve">NFR-01</w:t>
+            </w:r>
+          </w:p>
+        </w:tc>
+        <w:tc>
+          <w:tcPr>
+            <w:tcW w:type="pct" w:w="800"/>
+          </w:tcPr>
+          <w:p>
+            <w:r>
+              <w:rPr>
+                <w:rFonts w:ascii="Cambria" w:cs="Cambria" w:eastAsia="Cambria" w:hAnsi="Cambria"/>
+                <w:sz w:val="19"/>
+                <w:szCs w:val="19"/>
+              </w:rPr>
+              <w:t xml:space="preserve">Performance</w:t>
+            </w:r>
+          </w:p>
+        </w:tc>
+        <w:tc>
+          <w:tcPr>
+            <w:tcW w:type="pct" w:w="2100"/>
+          </w:tcPr>
+          <w:p>
+            <w:r>
+              <w:rPr>
+                <w:rFonts w:ascii="Cambria" w:cs="Cambria" w:eastAsia="Cambria" w:hAnsi="Cambria"/>
+                <w:sz w:val="19"/>
+                <w:szCs w:val="19"/>
+              </w:rPr>
+              <w:t xml:space="preserve">API response time &lt; 200 ms under standard loads</w:t>
+            </w:r>
+          </w:p>
+        </w:tc>
+        <w:tc>
+          <w:tcPr>
+            <w:tcW w:type="pct" w:w="900"/>
+          </w:tcPr>
+          <w:p>
+            <w:r>
+              <w:rPr>
+                <w:rFonts w:ascii="Cambria" w:cs="Cambria" w:eastAsia="Cambria" w:hAnsi="Cambria"/>
+                <w:sz w:val="19"/>
+                <w:szCs w:val="19"/>
+              </w:rPr>
+              <w:t xml:space="preserve">&lt; 200 ms</w:t>
+            </w:r>
+          </w:p>
+        </w:tc>
+        <w:tc>
+          <w:tcPr>
+            <w:tcW w:type="pct" w:w="600"/>
+          </w:tcPr>
+          <w:p>
+            <w:r>
+              <w:rPr>
+                <w:rFonts w:ascii="Cambria" w:cs="Cambria" w:eastAsia="Cambria" w:hAnsi="Cambria"/>
+                <w:sz w:val="19"/>
+                <w:szCs w:val="19"/>
+              </w:rPr>
+              <w:t xml:space="preserve">Met</w:t>
+            </w:r>
+          </w:p>
+        </w:tc>
+      </w:tr>
+      <w:tr>
+        <w:tc>
+          <w:tcPr>
+            <w:tcW w:type="pct" w:w="600"/>
+          </w:tcPr>
+          <w:p>
+            <w:r>
+              <w:rPr>
+                <w:rFonts w:ascii="Cambria" w:cs="Cambria" w:eastAsia="Cambria" w:hAnsi="Cambria"/>
+                <w:sz w:val="19"/>
+                <w:szCs w:val="19"/>
+              </w:rPr>
+              <w:t xml:space="preserve">NFR-02</w:t>
+            </w:r>
+          </w:p>
+        </w:tc>
+        <w:tc>
+          <w:tcPr>
+            <w:tcW w:type="pct" w:w="800"/>
+          </w:tcPr>
+          <w:p>
+            <w:r>
+              <w:rPr>
+                <w:rFonts w:ascii="Cambria" w:cs="Cambria" w:eastAsia="Cambria" w:hAnsi="Cambria"/>
+                <w:sz w:val="19"/>
+                <w:szCs w:val="19"/>
+              </w:rPr>
+              <w:t xml:space="preserve">Security</w:t>
+            </w:r>
+          </w:p>
+        </w:tc>
+        <w:tc>
+          <w:tcPr>
+            <w:tcW w:type="pct" w:w="2100"/>
+          </w:tcPr>
+          <w:p>
+            <w:r>
+              <w:rPr>
+                <w:rFonts w:ascii="Cambria" w:cs="Cambria" w:eastAsia="Cambria" w:hAnsi="Cambria"/>
+                <w:sz w:val="19"/>
+                <w:szCs w:val="19"/>
+              </w:rPr>
+              <w:t xml:space="preserve">bcrypt password hashing (10 salt rounds), JWT expiration</w:t>
+            </w:r>
+          </w:p>
+        </w:tc>
+        <w:tc>
+          <w:tcPr>
+            <w:tcW w:type="pct" w:w="900"/>
+          </w:tcPr>
+          <w:p>
+            <w:r>
+              <w:rPr>
+                <w:rFonts w:ascii="Cambria" w:cs="Cambria" w:eastAsia="Cambria" w:hAnsi="Cambria"/>
+                <w:sz w:val="19"/>
+                <w:szCs w:val="19"/>
+              </w:rPr>
+              <w:t xml:space="preserve">10 salt rounds</w:t>
+            </w:r>
+          </w:p>
+        </w:tc>
+        <w:tc>
+          <w:tcPr>
+            <w:tcW w:type="pct" w:w="600"/>
+          </w:tcPr>
+          <w:p>
+            <w:r>
+              <w:rPr>
+                <w:rFonts w:ascii="Cambria" w:cs="Cambria" w:eastAsia="Cambria" w:hAnsi="Cambria"/>
+                <w:sz w:val="19"/>
+                <w:szCs w:val="19"/>
+              </w:rPr>
+              <w:t xml:space="preserve">Met</w:t>
+            </w:r>
+          </w:p>
+        </w:tc>
+      </w:tr>
+      <w:tr>
+        <w:tc>
+          <w:tcPr>
+            <w:tcW w:type="pct" w:w="600"/>
+          </w:tcPr>
+          <w:p>
+            <w:r>
+              <w:rPr>
+                <w:rFonts w:ascii="Cambria" w:cs="Cambria" w:eastAsia="Cambria" w:hAnsi="Cambria"/>
+                <w:sz w:val="19"/>
+                <w:szCs w:val="19"/>
+              </w:rPr>
+              <w:t xml:space="preserve">NFR-03</w:t>
+            </w:r>
+          </w:p>
+        </w:tc>
+        <w:tc>
+          <w:tcPr>
+            <w:tcW w:type="pct" w:w="800"/>
+          </w:tcPr>
+          <w:p>
+            <w:r>
+              <w:rPr>
+                <w:rFonts w:ascii="Cambria" w:cs="Cambria" w:eastAsia="Cambria" w:hAnsi="Cambria"/>
+                <w:sz w:val="19"/>
+                <w:szCs w:val="19"/>
+              </w:rPr>
+              <w:t xml:space="preserve">Responsiveness</w:t>
+            </w:r>
+          </w:p>
+        </w:tc>
+        <w:tc>
+          <w:tcPr>
+            <w:tcW w:type="pct" w:w="2100"/>
+          </w:tcPr>
+          <w:p>
+            <w:r>
+              <w:rPr>
+                <w:rFonts w:ascii="Cambria" w:cs="Cambria" w:eastAsia="Cambria" w:hAnsi="Cambria"/>
+                <w:sz w:val="19"/>
+                <w:szCs w:val="19"/>
+              </w:rPr>
+              <w:t xml:space="preserve">Fluid layout across 320 px to 1920 px viewports</w:t>
+            </w:r>
+          </w:p>
+        </w:tc>
+        <w:tc>
+          <w:tcPr>
+            <w:tcW w:type="pct" w:w="900"/>
+          </w:tcPr>
+          <w:p>
+            <w:r>
+              <w:rPr>
+                <w:rFonts w:ascii="Cambria" w:cs="Cambria" w:eastAsia="Cambria" w:hAnsi="Cambria"/>
+                <w:sz w:val="19"/>
+                <w:szCs w:val="19"/>
+              </w:rPr>
+              <w:t xml:space="preserve">320 px–1920 px</w:t>
+            </w:r>
+          </w:p>
+        </w:tc>
+        <w:tc>
+          <w:tcPr>
+            <w:tcW w:type="pct" w:w="600"/>
+          </w:tcPr>
+          <w:p>
+            <w:r>
+              <w:rPr>
+                <w:rFonts w:ascii="Cambria" w:cs="Cambria" w:eastAsia="Cambria" w:hAnsi="Cambria"/>
+                <w:sz w:val="19"/>
+                <w:szCs w:val="19"/>
+              </w:rPr>
+              <w:t xml:space="preserve">Met</w:t>
+            </w:r>
+          </w:p>
+        </w:tc>
+      </w:tr>
+      <w:tr>
+        <w:tc>
+          <w:tcPr>
+            <w:tcW w:type="pct" w:w="600"/>
+          </w:tcPr>
+          <w:p>
+            <w:r>
+              <w:rPr>
+                <w:rFonts w:ascii="Cambria" w:cs="Cambria" w:eastAsia="Cambria" w:hAnsi="Cambria"/>
+                <w:sz w:val="19"/>
+                <w:szCs w:val="19"/>
+              </w:rPr>
+              <w:t xml:space="preserve">NFR-04</w:t>
+            </w:r>
+          </w:p>
+        </w:tc>
+        <w:tc>
+          <w:tcPr>
+            <w:tcW w:type="pct" w:w="800"/>
+          </w:tcPr>
+          <w:p>
+            <w:r>
+              <w:rPr>
+                <w:rFonts w:ascii="Cambria" w:cs="Cambria" w:eastAsia="Cambria" w:hAnsi="Cambria"/>
+                <w:sz w:val="19"/>
+                <w:szCs w:val="19"/>
+              </w:rPr>
+              <w:t xml:space="preserve">Reliability</w:t>
+            </w:r>
+          </w:p>
+        </w:tc>
+        <w:tc>
+          <w:tcPr>
+            <w:tcW w:type="pct" w:w="2100"/>
+          </w:tcPr>
+          <w:p>
+            <w:r>
+              <w:rPr>
+                <w:rFonts w:ascii="Cambria" w:cs="Cambria" w:eastAsia="Cambria" w:hAnsi="Cambria"/>
+                <w:sz w:val="19"/>
+                <w:szCs w:val="19"/>
+              </w:rPr>
+              <w:t xml:space="preserve">±15-minute clock drift tolerance for dynamic tokens</w:t>
+            </w:r>
+          </w:p>
+        </w:tc>
+        <w:tc>
+          <w:tcPr>
+            <w:tcW w:type="pct" w:w="900"/>
+          </w:tcPr>
+          <w:p>
+            <w:r>
+              <w:rPr>
+                <w:rFonts w:ascii="Cambria" w:cs="Cambria" w:eastAsia="Cambria" w:hAnsi="Cambria"/>
+                <w:sz w:val="19"/>
+                <w:szCs w:val="19"/>
+              </w:rPr>
+              <w:t xml:space="preserve">±15 minutes</w:t>
+            </w:r>
+          </w:p>
+        </w:tc>
+        <w:tc>
+          <w:tcPr>
+            <w:tcW w:type="pct" w:w="600"/>
+          </w:tcPr>
+          <w:p>
+            <w:r>
+              <w:rPr>
+                <w:rFonts w:ascii="Cambria" w:cs="Cambria" w:eastAsia="Cambria" w:hAnsi="Cambria"/>
+                <w:sz w:val="19"/>
+                <w:szCs w:val="19"/>
+              </w:rPr>
+              <w:t xml:space="preserve">Met</w:t>
+            </w:r>
+          </w:p>
+        </w:tc>
+      </w:tr>
+      <w:tr>
+        <w:tc>
+          <w:tcPr>
+            <w:tcW w:type="pct" w:w="600"/>
+          </w:tcPr>
+          <w:p>
+            <w:r>
+              <w:rPr>
+                <w:rFonts w:ascii="Cambria" w:cs="Cambria" w:eastAsia="Cambria" w:hAnsi="Cambria"/>
+                <w:sz w:val="19"/>
+                <w:szCs w:val="19"/>
+              </w:rPr>
+              <w:t xml:space="preserve">NFR-05</w:t>
+            </w:r>
+          </w:p>
+        </w:tc>
+        <w:tc>
+          <w:tcPr>
+            <w:tcW w:type="pct" w:w="800"/>
+          </w:tcPr>
+          <w:p>
+            <w:r>
+              <w:rPr>
+                <w:rFonts w:ascii="Cambria" w:cs="Cambria" w:eastAsia="Cambria" w:hAnsi="Cambria"/>
+                <w:sz w:val="19"/>
+                <w:szCs w:val="19"/>
+              </w:rPr>
+              <w:t xml:space="preserve">Availability</w:t>
+            </w:r>
+          </w:p>
+        </w:tc>
+        <w:tc>
+          <w:tcPr>
+            <w:tcW w:type="pct" w:w="2100"/>
+          </w:tcPr>
+          <w:p>
+            <w:r>
+              <w:rPr>
+                <w:rFonts w:ascii="Cambria" w:cs="Cambria" w:eastAsia="Cambria" w:hAnsi="Cambria"/>
+                <w:sz w:val="19"/>
+                <w:szCs w:val="19"/>
+              </w:rPr>
+              <w:t xml:space="preserve">Zero-configuration camera fallback on web browsers</w:t>
+            </w:r>
+          </w:p>
+        </w:tc>
+        <w:tc>
+          <w:tcPr>
+            <w:tcW w:type="pct" w:w="900"/>
+          </w:tcPr>
+          <w:p>
+            <w:r>
+              <w:rPr>
+                <w:rFonts w:ascii="Cambria" w:cs="Cambria" w:eastAsia="Cambria" w:hAnsi="Cambria"/>
+                <w:sz w:val="19"/>
+                <w:szCs w:val="19"/>
+              </w:rPr>
+              <w:t xml:space="preserve">Multi-camera auto fallback</w:t>
+            </w:r>
+          </w:p>
+        </w:tc>
+        <w:tc>
+          <w:tcPr>
+            <w:tcW w:type="pct" w:w="600"/>
+          </w:tcPr>
+          <w:p>
+            <w:r>
+              <w:rPr>
+                <w:rFonts w:ascii="Cambria" w:cs="Cambria" w:eastAsia="Cambria" w:hAnsi="Cambria"/>
+                <w:sz w:val="19"/>
+                <w:szCs w:val="19"/>
+              </w:rPr>
+              <w:t xml:space="preserve">Met</w:t>
+            </w:r>
+          </w:p>
+        </w:tc>
+      </w:tr>
+    </w:tbl>
+    <w:p>
+      <w:pPr>
+        <w:pStyle w:val="Heading2"/>
+        <w:spacing w:after="100" w:before="220"/>
+      </w:pPr>
+      <w:r>
+        <w:t xml:space="preserve">4.3 Hardware Requirements</w:t>
+      </w:r>
+      <w:r>
+        <w:rPr>
+          <w:rFonts w:ascii="Cambria" w:cs="Cambria" w:eastAsia="Cambria" w:hAnsi="Cambria"/>
+          <w:b/>
+          <w:bCs/>
+          <w:color w:val="1A252F"/>
+          <w:sz w:val="24"/>
+          <w:szCs w:val="24"/>
+        </w:rPr>
+        <w:t xml:space="preserve">4.3 Hardware Requirements</w:t>
+      </w:r>
+    </w:p>
+    <w:p>
+      <w:pPr>
+        <w:spacing w:after="100" w:before="60" w:line="360"/>
+        <w:jc w:val="both"/>
+      </w:pPr>
+      <w:r>
+        <w:rPr>
+          <w:rFonts w:ascii="Cambria" w:cs="Cambria" w:eastAsia="Cambria" w:hAnsi="Cambria"/>
+          <w:i w:val="false"/>
+          <w:iCs w:val="false"/>
+          <w:sz w:val="24"/>
+          <w:szCs w:val="24"/>
+        </w:rPr>
+        <w:t xml:space="preserve">The minimum and recommended hardware components required for end-user client access, optical gate barcode scanning, cloud application hosting, and gate boom simulation:</w:t>
+      </w:r>
+    </w:p>
+    <w:p>
+      <w:pPr>
+        <w:spacing w:after="80" w:before="160"/>
+      </w:pPr>
+      <w:r>
+        <w:rPr>
+          <w:rFonts w:ascii="Cambria" w:cs="Cambria" w:eastAsia="Cambria" w:hAnsi="Cambria"/>
+          <w:b/>
+          <w:bCs/>
+          <w:color w:val="003366"/>
+          <w:sz w:val="22"/>
+          <w:szCs w:val="22"/>
+        </w:rPr>
+        <w:t xml:space="preserve">Table 4.3: Hardware Requirements</w:t>
+      </w:r>
+    </w:p>
+    <w:tbl>
+      <w:tblPr>
+        <w:tblW w:type="pct" w:w="5000"/>
+        <w:tblBorders>
+          <w:top w:val="single" w:color="auto" w:sz="4"/>
+          <w:left w:val="single" w:color="auto" w:sz="4"/>
+          <w:bottom w:val="single" w:color="auto" w:sz="4"/>
+          <w:right w:val="single" w:color="auto" w:sz="4"/>
+          <w:insideH w:val="single" w:color="auto" w:sz="4"/>
+          <w:insideV w:val="single" w:color="auto" w:sz="4"/>
+        </w:tblBorders>
+      </w:tblPr>
+      <w:tblGrid>
+        <w:gridCol w:w="1986"/>
+        <w:gridCol w:w="3430"/>
+        <w:gridCol w:w="2347"/>
+        <w:gridCol w:w="1264"/>
+      </w:tblGrid>
+      <w:tr>
+        <w:trPr>
+          <w:tblHeader/>
+        </w:trPr>
+        <w:tc>
+          <w:tcPr>
+            <w:tcW w:type="pct" w:w="1100"/>
+            <w:shd w:fill="EAF2F8" w:val="clear"/>
+          </w:tcPr>
+          <w:p>
+            <w:r>
+              <w:rPr>
+                <w:rFonts w:ascii="Cambria" w:cs="Cambria" w:eastAsia="Cambria" w:hAnsi="Cambria"/>
+                <w:b/>
+                <w:bCs/>
+                <w:color w:val="003366"/>
+                <w:sz w:val="20"/>
+                <w:szCs w:val="20"/>
+              </w:rPr>
+              <w:t xml:space="preserve">Component</w:t>
+            </w:r>
+          </w:p>
+        </w:tc>
+        <w:tc>
+          <w:tcPr>
+            <w:tcW w:type="pct" w:w="1900"/>
+            <w:shd w:fill="EAF2F8" w:val="clear"/>
+          </w:tcPr>
+          <w:p>
+            <w:r>
+              <w:rPr>
+                <w:rFonts w:ascii="Cambria" w:cs="Cambria" w:eastAsia="Cambria" w:hAnsi="Cambria"/>
+                <w:b/>
+                <w:bCs/>
+                <w:color w:val="003366"/>
+                <w:sz w:val="20"/>
+                <w:szCs w:val="20"/>
+              </w:rPr>
+              <w:t xml:space="preserve">Specification</w:t>
+            </w:r>
+          </w:p>
+        </w:tc>
+        <w:tc>
+          <w:tcPr>
+            <w:tcW w:type="pct" w:w="1300"/>
+            <w:shd w:fill="EAF2F8" w:val="clear"/>
+          </w:tcPr>
+          <w:p>
+            <w:r>
+              <w:rPr>
+                <w:rFonts w:ascii="Cambria" w:cs="Cambria" w:eastAsia="Cambria" w:hAnsi="Cambria"/>
+                <w:b/>
+                <w:bCs/>
+                <w:color w:val="003366"/>
+                <w:sz w:val="20"/>
+                <w:szCs w:val="20"/>
+              </w:rPr>
+              <w:t xml:space="preserve">Purpose</w:t>
+            </w:r>
+          </w:p>
+        </w:tc>
+        <w:tc>
+          <w:tcPr>
+            <w:tcW w:type="pct" w:w="700"/>
+            <w:shd w:fill="EAF2F8" w:val="clear"/>
+          </w:tcPr>
+          <w:p>
+            <w:r>
+              <w:rPr>
+                <w:rFonts w:ascii="Cambria" w:cs="Cambria" w:eastAsia="Cambria" w:hAnsi="Cambria"/>
+                <w:b/>
+                <w:bCs/>
+                <w:color w:val="003366"/>
+                <w:sz w:val="20"/>
+                <w:szCs w:val="20"/>
+              </w:rPr>
+              <w:t xml:space="preserve">Availability</w:t>
+            </w:r>
+          </w:p>
+        </w:tc>
+      </w:tr>
+      <w:tr>
+        <w:tc>
+          <w:tcPr>
+            <w:tcW w:type="pct" w:w="1100"/>
+          </w:tcPr>
+          <w:p>
+            <w:r>
+              <w:rPr>
+                <w:rFonts w:ascii="Cambria" w:cs="Cambria" w:eastAsia="Cambria" w:hAnsi="Cambria"/>
+                <w:sz w:val="19"/>
+                <w:szCs w:val="19"/>
+              </w:rPr>
+              <w:t xml:space="preserve">Client Device</w:t>
+            </w:r>
+          </w:p>
+        </w:tc>
+        <w:tc>
+          <w:tcPr>
+            <w:tcW w:type="pct" w:w="1900"/>
+          </w:tcPr>
+          <w:p>
+            <w:r>
+              <w:rPr>
+                <w:rFonts w:ascii="Cambria" w:cs="Cambria" w:eastAsia="Cambria" w:hAnsi="Cambria"/>
+                <w:sz w:val="19"/>
+                <w:szCs w:val="19"/>
+              </w:rPr>
+              <w:t xml:space="preserve">Chrome, Edge, Firefox or Safari on Windows, Android, macOS or iOS</w:t>
+            </w:r>
+          </w:p>
+        </w:tc>
+        <w:tc>
+          <w:tcPr>
+            <w:tcW w:type="pct" w:w="1300"/>
+          </w:tcPr>
+          <w:p>
+            <w:r>
+              <w:rPr>
+                <w:rFonts w:ascii="Cambria" w:cs="Cambria" w:eastAsia="Cambria" w:hAnsi="Cambria"/>
+                <w:sz w:val="19"/>
+                <w:szCs w:val="19"/>
+              </w:rPr>
+              <w:t xml:space="preserve">Driver, admin and security interfaces</w:t>
+            </w:r>
+          </w:p>
+        </w:tc>
+        <w:tc>
+          <w:tcPr>
+            <w:tcW w:type="pct" w:w="700"/>
+          </w:tcPr>
+          <w:p>
+            <w:r>
+              <w:rPr>
+                <w:rFonts w:ascii="Cambria" w:cs="Cambria" w:eastAsia="Cambria" w:hAnsi="Cambria"/>
+                <w:sz w:val="19"/>
+                <w:szCs w:val="19"/>
+              </w:rPr>
+              <w:t xml:space="preserve">Available</w:t>
+            </w:r>
+          </w:p>
+        </w:tc>
+      </w:tr>
+      <w:tr>
+        <w:tc>
+          <w:tcPr>
+            <w:tcW w:type="pct" w:w="1100"/>
+          </w:tcPr>
+          <w:p>
+            <w:r>
+              <w:rPr>
+                <w:rFonts w:ascii="Cambria" w:cs="Cambria" w:eastAsia="Cambria" w:hAnsi="Cambria"/>
+                <w:sz w:val="19"/>
+                <w:szCs w:val="19"/>
+              </w:rPr>
+              <w:t xml:space="preserve">Camera</w:t>
+            </w:r>
+          </w:p>
+        </w:tc>
+        <w:tc>
+          <w:tcPr>
+            <w:tcW w:type="pct" w:w="1900"/>
+          </w:tcPr>
+          <w:p>
+            <w:r>
+              <w:rPr>
+                <w:rFonts w:ascii="Cambria" w:cs="Cambria" w:eastAsia="Cambria" w:hAnsi="Cambria"/>
+                <w:sz w:val="19"/>
+                <w:szCs w:val="19"/>
+              </w:rPr>
+              <w:t xml:space="preserve">Standard webcam, smartphone rear/front camera or USB camera</w:t>
+            </w:r>
+          </w:p>
+        </w:tc>
+        <w:tc>
+          <w:tcPr>
+            <w:tcW w:type="pct" w:w="1300"/>
+          </w:tcPr>
+          <w:p>
+            <w:r>
+              <w:rPr>
+                <w:rFonts w:ascii="Cambria" w:cs="Cambria" w:eastAsia="Cambria" w:hAnsi="Cambria"/>
+                <w:sz w:val="19"/>
+                <w:szCs w:val="19"/>
+              </w:rPr>
+              <w:t xml:space="preserve">QR scanning at security gate desk</w:t>
+            </w:r>
+          </w:p>
+        </w:tc>
+        <w:tc>
+          <w:tcPr>
+            <w:tcW w:type="pct" w:w="700"/>
+          </w:tcPr>
+          <w:p>
+            <w:r>
+              <w:rPr>
+                <w:rFonts w:ascii="Cambria" w:cs="Cambria" w:eastAsia="Cambria" w:hAnsi="Cambria"/>
+                <w:sz w:val="19"/>
+                <w:szCs w:val="19"/>
+              </w:rPr>
+              <w:t xml:space="preserve">Available</w:t>
+            </w:r>
+          </w:p>
+        </w:tc>
+      </w:tr>
+      <w:tr>
+        <w:tc>
+          <w:tcPr>
+            <w:tcW w:type="pct" w:w="1100"/>
+          </w:tcPr>
+          <w:p>
+            <w:r>
+              <w:rPr>
+                <w:rFonts w:ascii="Cambria" w:cs="Cambria" w:eastAsia="Cambria" w:hAnsi="Cambria"/>
+                <w:sz w:val="19"/>
+                <w:szCs w:val="19"/>
+              </w:rPr>
+              <w:t xml:space="preserve">Server</w:t>
+            </w:r>
+          </w:p>
+        </w:tc>
+        <w:tc>
+          <w:tcPr>
+            <w:tcW w:type="pct" w:w="1900"/>
+          </w:tcPr>
+          <w:p>
+            <w:r>
+              <w:rPr>
+                <w:rFonts w:ascii="Cambria" w:cs="Cambria" w:eastAsia="Cambria" w:hAnsi="Cambria"/>
+                <w:sz w:val="19"/>
+                <w:szCs w:val="19"/>
+              </w:rPr>
+              <w:t xml:space="preserve">Node.js v18+, MongoDB v6.0+, minimum 2 GB RAM</w:t>
+            </w:r>
+          </w:p>
+        </w:tc>
+        <w:tc>
+          <w:tcPr>
+            <w:tcW w:type="pct" w:w="1300"/>
+          </w:tcPr>
+          <w:p>
+            <w:r>
+              <w:rPr>
+                <w:rFonts w:ascii="Cambria" w:cs="Cambria" w:eastAsia="Cambria" w:hAnsi="Cambria"/>
+                <w:sz w:val="19"/>
+                <w:szCs w:val="19"/>
+              </w:rPr>
+              <w:t xml:space="preserve">Hosting REST API and database</w:t>
+            </w:r>
+          </w:p>
+        </w:tc>
+        <w:tc>
+          <w:tcPr>
+            <w:tcW w:type="pct" w:w="700"/>
+          </w:tcPr>
+          <w:p>
+            <w:r>
+              <w:rPr>
+                <w:rFonts w:ascii="Cambria" w:cs="Cambria" w:eastAsia="Cambria" w:hAnsi="Cambria"/>
+                <w:sz w:val="19"/>
+                <w:szCs w:val="19"/>
+              </w:rPr>
+              <w:t xml:space="preserve">Available</w:t>
+            </w:r>
+          </w:p>
+        </w:tc>
+      </w:tr>
+      <w:tr>
+        <w:tc>
+          <w:tcPr>
+            <w:tcW w:type="pct" w:w="1100"/>
+          </w:tcPr>
+          <w:p>
+            <w:r>
+              <w:rPr>
+                <w:rFonts w:ascii="Cambria" w:cs="Cambria" w:eastAsia="Cambria" w:hAnsi="Cambria"/>
+                <w:sz w:val="19"/>
+                <w:szCs w:val="19"/>
+              </w:rPr>
+              <w:t xml:space="preserve">Network</w:t>
+            </w:r>
+          </w:p>
+        </w:tc>
+        <w:tc>
+          <w:tcPr>
+            <w:tcW w:type="pct" w:w="1900"/>
+          </w:tcPr>
+          <w:p>
+            <w:r>
+              <w:rPr>
+                <w:rFonts w:ascii="Cambria" w:cs="Cambria" w:eastAsia="Cambria" w:hAnsi="Cambria"/>
+                <w:sz w:val="19"/>
+                <w:szCs w:val="19"/>
+              </w:rPr>
+              <w:t xml:space="preserve">Active internet connection</w:t>
+            </w:r>
+          </w:p>
+        </w:tc>
+        <w:tc>
+          <w:tcPr>
+            <w:tcW w:type="pct" w:w="1300"/>
+          </w:tcPr>
+          <w:p>
+            <w:r>
+              <w:rPr>
+                <w:rFonts w:ascii="Cambria" w:cs="Cambria" w:eastAsia="Cambria" w:hAnsi="Cambria"/>
+                <w:sz w:val="19"/>
+                <w:szCs w:val="19"/>
+              </w:rPr>
+              <w:t xml:space="preserve">Real-time verification against cloud database</w:t>
+            </w:r>
+          </w:p>
+        </w:tc>
+        <w:tc>
+          <w:tcPr>
+            <w:tcW w:type="pct" w:w="700"/>
+          </w:tcPr>
+          <w:p>
+            <w:r>
+              <w:rPr>
+                <w:rFonts w:ascii="Cambria" w:cs="Cambria" w:eastAsia="Cambria" w:hAnsi="Cambria"/>
+                <w:sz w:val="19"/>
+                <w:szCs w:val="19"/>
+              </w:rPr>
+              <w:t xml:space="preserve">Available</w:t>
+            </w:r>
+          </w:p>
+        </w:tc>
+      </w:tr>
+      <w:tr>
+        <w:tc>
+          <w:tcPr>
+            <w:tcW w:type="pct" w:w="1100"/>
+          </w:tcPr>
+          <w:p>
+            <w:r>
+              <w:rPr>
+                <w:rFonts w:ascii="Cambria" w:cs="Cambria" w:eastAsia="Cambria" w:hAnsi="Cambria"/>
+                <w:sz w:val="19"/>
+                <w:szCs w:val="19"/>
+              </w:rPr>
+              <w:t xml:space="preserve">Boom Barrier Controller</w:t>
+            </w:r>
+          </w:p>
+        </w:tc>
+        <w:tc>
+          <w:tcPr>
+            <w:tcW w:type="pct" w:w="1900"/>
+          </w:tcPr>
+          <w:p>
+            <w:r>
+              <w:rPr>
+                <w:rFonts w:ascii="Cambria" w:cs="Cambria" w:eastAsia="Cambria" w:hAnsi="Cambria"/>
+                <w:sz w:val="19"/>
+                <w:szCs w:val="19"/>
+              </w:rPr>
+              <w:t xml:space="preserve">ESP32 / Arduino with servo (future scope)</w:t>
+            </w:r>
+          </w:p>
+        </w:tc>
+        <w:tc>
+          <w:tcPr>
+            <w:tcW w:type="pct" w:w="1300"/>
+          </w:tcPr>
+          <w:p>
+            <w:r>
+              <w:rPr>
+                <w:rFonts w:ascii="Cambria" w:cs="Cambria" w:eastAsia="Cambria" w:hAnsi="Cambria"/>
+                <w:sz w:val="19"/>
+                <w:szCs w:val="19"/>
+              </w:rPr>
+              <w:t xml:space="preserve">Physical gate control</w:t>
+            </w:r>
+          </w:p>
+        </w:tc>
+        <w:tc>
+          <w:tcPr>
+            <w:tcW w:type="pct" w:w="700"/>
+          </w:tcPr>
+          <w:p>
+            <w:r>
+              <w:rPr>
+                <w:rFonts w:ascii="Cambria" w:cs="Cambria" w:eastAsia="Cambria" w:hAnsi="Cambria"/>
+                <w:sz w:val="19"/>
+                <w:szCs w:val="19"/>
+              </w:rPr>
+              <w:t xml:space="preserve">Simulated via UI</w:t>
+            </w:r>
+          </w:p>
+        </w:tc>
+      </w:tr>
+    </w:tbl>
+    <w:p>
+      <w:pPr>
+        <w:pStyle w:val="Heading2"/>
+        <w:spacing w:after="100" w:before="220"/>
+      </w:pPr>
+      <w:r>
+        <w:t xml:space="preserve">4.4 Software Requirements Specification</w:t>
+      </w:r>
+      <w:r>
+        <w:rPr>
+          <w:rFonts w:ascii="Cambria" w:cs="Cambria" w:eastAsia="Cambria" w:hAnsi="Cambria"/>
+          <w:b/>
+          <w:bCs/>
+          <w:color w:val="1A252F"/>
+          <w:sz w:val="24"/>
+          <w:szCs w:val="24"/>
+        </w:rPr>
+        <w:t xml:space="preserve">4.4 Software Requirements Specification</w:t>
+      </w:r>
+    </w:p>
+    <w:p>
+      <w:pPr>
+        <w:spacing w:after="100" w:before="60" w:line="360"/>
+        <w:jc w:val="both"/>
+      </w:pPr>
+      <w:r>
+        <w:rPr>
+          <w:rFonts w:ascii="Cambria" w:cs="Cambria" w:eastAsia="Cambria" w:hAnsi="Cambria"/>
+          <w:i w:val="false"/>
+          <w:iCs w:val="false"/>
+          <w:sz w:val="24"/>
+          <w:szCs w:val="24"/>
+        </w:rPr>
+        <w:t xml:space="preserve">The software frameworks, runtimes, database systems, and development tools utilized to build and deploy ParkSmart:</w:t>
+      </w:r>
+    </w:p>
+    <w:p>
+      <w:pPr>
+        <w:spacing w:after="80" w:before="160"/>
+      </w:pPr>
+      <w:r>
+        <w:rPr>
+          <w:rFonts w:ascii="Cambria" w:cs="Cambria" w:eastAsia="Cambria" w:hAnsi="Cambria"/>
+          <w:b/>
+          <w:bCs/>
+          <w:color w:val="003366"/>
+          <w:sz w:val="22"/>
+          <w:szCs w:val="22"/>
+        </w:rPr>
+        <w:t xml:space="preserve">Table 4.4: Software Requirements Specification</w:t>
+      </w:r>
+    </w:p>
+    <w:tbl>
+      <w:tblPr>
+        <w:tblW w:type="pct" w:w="5000"/>
+        <w:tblBorders>
+          <w:top w:val="single" w:color="auto" w:sz="4"/>
+          <w:left w:val="single" w:color="auto" w:sz="4"/>
+          <w:bottom w:val="single" w:color="auto" w:sz="4"/>
+          <w:right w:val="single" w:color="auto" w:sz="4"/>
+          <w:insideH w:val="single" w:color="auto" w:sz="4"/>
+          <w:insideV w:val="single" w:color="auto" w:sz="4"/>
+        </w:tblBorders>
+      </w:tblPr>
+      <w:tblGrid>
+        <w:gridCol w:w="1986"/>
+        <w:gridCol w:w="1444"/>
+        <w:gridCol w:w="3791"/>
+        <w:gridCol w:w="1805"/>
+      </w:tblGrid>
+      <w:tr>
+        <w:trPr>
+          <w:tblHeader/>
+        </w:trPr>
+        <w:tc>
+          <w:tcPr>
+            <w:tcW w:type="pct" w:w="1100"/>
+            <w:shd w:fill="EAF2F8" w:val="clear"/>
+          </w:tcPr>
+          <w:p>
+            <w:r>
+              <w:rPr>
+                <w:rFonts w:ascii="Cambria" w:cs="Cambria" w:eastAsia="Cambria" w:hAnsi="Cambria"/>
+                <w:b/>
+                <w:bCs/>
+                <w:color w:val="003366"/>
+                <w:sz w:val="20"/>
+                <w:szCs w:val="20"/>
+              </w:rPr>
+              <w:t xml:space="preserve">Software / Tool</w:t>
+            </w:r>
+          </w:p>
+        </w:tc>
+        <w:tc>
+          <w:tcPr>
+            <w:tcW w:type="pct" w:w="800"/>
+            <w:shd w:fill="EAF2F8" w:val="clear"/>
+          </w:tcPr>
+          <w:p>
+            <w:r>
+              <w:rPr>
+                <w:rFonts w:ascii="Cambria" w:cs="Cambria" w:eastAsia="Cambria" w:hAnsi="Cambria"/>
+                <w:b/>
+                <w:bCs/>
+                <w:color w:val="003366"/>
+                <w:sz w:val="20"/>
+                <w:szCs w:val="20"/>
+              </w:rPr>
+              <w:t xml:space="preserve">Version</w:t>
+            </w:r>
+          </w:p>
+        </w:tc>
+        <w:tc>
+          <w:tcPr>
+            <w:tcW w:type="pct" w:w="2100"/>
+            <w:shd w:fill="EAF2F8" w:val="clear"/>
+          </w:tcPr>
+          <w:p>
+            <w:r>
+              <w:rPr>
+                <w:rFonts w:ascii="Cambria" w:cs="Cambria" w:eastAsia="Cambria" w:hAnsi="Cambria"/>
+                <w:b/>
+                <w:bCs/>
+                <w:color w:val="003366"/>
+                <w:sz w:val="20"/>
+                <w:szCs w:val="20"/>
+              </w:rPr>
+              <w:t xml:space="preserve">Purpose</w:t>
+            </w:r>
+          </w:p>
+        </w:tc>
+        <w:tc>
+          <w:tcPr>
+            <w:tcW w:type="pct" w:w="1000"/>
+            <w:shd w:fill="EAF2F8" w:val="clear"/>
+          </w:tcPr>
+          <w:p>
+            <w:r>
+              <w:rPr>
+                <w:rFonts w:ascii="Cambria" w:cs="Cambria" w:eastAsia="Cambria" w:hAnsi="Cambria"/>
+                <w:b/>
+                <w:bCs/>
+                <w:color w:val="003366"/>
+                <w:sz w:val="20"/>
+                <w:szCs w:val="20"/>
+              </w:rPr>
               <w:t xml:space="preserve">Source / License</w:t>
             </w:r>
           </w:p>
@@ -9416,46 +10159,46 @@
       <w:tr>
         <w:tc>
           <w:tcPr>
-            <w:tcW w:type="pct" w:w="1250"/>
-          </w:tcPr>
-          <w:p>
-            <w:r>
-              <w:rPr>
-                <w:rFonts w:ascii="Cambria" w:cs="Cambria" w:eastAsia="Cambria" w:hAnsi="Cambria"/>
-                <w:sz w:val="19"/>
-                <w:szCs w:val="19"/>
-              </w:rPr>
-              <w:t xml:space="preserve">React.js</w:t>
-            </w:r>
-          </w:p>
-        </w:tc>
-        <w:tc>
-          <w:tcPr>
-            <w:tcW w:type="pct" w:w="900"/>
-          </w:tcPr>
-          <w:p>
-            <w:r>
-              <w:rPr>
-                <w:rFonts w:ascii="Cambria" w:cs="Cambria" w:eastAsia="Cambria" w:hAnsi="Cambria"/>
-                <w:sz w:val="19"/>
-                <w:szCs w:val="19"/>
-              </w:rPr>
-              <w:t xml:space="preserve">React 18.2</w:t>
-            </w:r>
-          </w:p>
-        </w:tc>
-        <w:tc>
-          <w:tcPr>
-            <w:tcW w:type="pct" w:w="1850"/>
-          </w:tcPr>
-          <w:p>
-            <w:r>
-              <w:rPr>
-                <w:rFonts w:ascii="Cambria" w:cs="Cambria" w:eastAsia="Cambria" w:hAnsi="Cambria"/>
-                <w:sz w:val="19"/>
-                <w:szCs w:val="19"/>
-              </w:rPr>
-              <w:t xml:space="preserve">Frontend Development</w:t>
+            <w:tcW w:type="pct" w:w="1100"/>
+          </w:tcPr>
+          <w:p>
+            <w:r>
+              <w:rPr>
+                <w:rFonts w:ascii="Cambria" w:cs="Cambria" w:eastAsia="Cambria" w:hAnsi="Cambria"/>
+                <w:sz w:val="19"/>
+                <w:szCs w:val="19"/>
+              </w:rPr>
+              <w:t xml:space="preserve">Node.js</w:t>
+            </w:r>
+          </w:p>
+        </w:tc>
+        <w:tc>
+          <w:tcPr>
+            <w:tcW w:type="pct" w:w="800"/>
+          </w:tcPr>
+          <w:p>
+            <w:r>
+              <w:rPr>
+                <w:rFonts w:ascii="Cambria" w:cs="Cambria" w:eastAsia="Cambria" w:hAnsi="Cambria"/>
+                <w:sz w:val="19"/>
+                <w:szCs w:val="19"/>
+              </w:rPr>
+              <w:t xml:space="preserve">v20+</w:t>
+            </w:r>
+          </w:p>
+        </w:tc>
+        <w:tc>
+          <w:tcPr>
+            <w:tcW w:type="pct" w:w="2100"/>
+          </w:tcPr>
+          <w:p>
+            <w:r>
+              <w:rPr>
+                <w:rFonts w:ascii="Cambria" w:cs="Cambria" w:eastAsia="Cambria" w:hAnsi="Cambria"/>
+                <w:sz w:val="19"/>
+                <w:szCs w:val="19"/>
+              </w:rPr>
+              <w:t xml:space="preserve">Backend runtime</w:t>
             </w:r>
           </w:p>
         </w:tc>
@@ -9470,15 +10213,139 @@
                 <w:sz w:val="19"/>
                 <w:szCs w:val="19"/>
               </w:rPr>
-              <w:t xml:space="preserve">Open Source</w:t>
-            </w:r>
-          </w:p>
-        </w:tc>
-      </w:tr>
-      <w:tr>
-        <w:tc>
-          <w:tcPr>
-            <w:tcW w:type="pct" w:w="1250"/>
+              <w:t xml:space="preserve">Open source (MIT)</w:t>
+            </w:r>
+          </w:p>
+        </w:tc>
+      </w:tr>
+      <w:tr>
+        <w:tc>
+          <w:tcPr>
+            <w:tcW w:type="pct" w:w="1100"/>
+          </w:tcPr>
+          <w:p>
+            <w:r>
+              <w:rPr>
+                <w:rFonts w:ascii="Cambria" w:cs="Cambria" w:eastAsia="Cambria" w:hAnsi="Cambria"/>
+                <w:sz w:val="19"/>
+                <w:szCs w:val="19"/>
+              </w:rPr>
+              <w:t xml:space="preserve">MongoDB Atlas</w:t>
+            </w:r>
+          </w:p>
+        </w:tc>
+        <w:tc>
+          <w:tcPr>
+            <w:tcW w:type="pct" w:w="800"/>
+          </w:tcPr>
+          <w:p>
+            <w:r>
+              <w:rPr>
+                <w:rFonts w:ascii="Cambria" w:cs="Cambria" w:eastAsia="Cambria" w:hAnsi="Cambria"/>
+                <w:sz w:val="19"/>
+                <w:szCs w:val="19"/>
+              </w:rPr>
+              <w:t xml:space="preserve">6.0+</w:t>
+            </w:r>
+          </w:p>
+        </w:tc>
+        <w:tc>
+          <w:tcPr>
+            <w:tcW w:type="pct" w:w="2100"/>
+          </w:tcPr>
+          <w:p>
+            <w:r>
+              <w:rPr>
+                <w:rFonts w:ascii="Cambria" w:cs="Cambria" w:eastAsia="Cambria" w:hAnsi="Cambria"/>
+                <w:sz w:val="19"/>
+                <w:szCs w:val="19"/>
+              </w:rPr>
+              <w:t xml:space="preserve">Cloud NoSQL database</w:t>
+            </w:r>
+          </w:p>
+        </w:tc>
+        <w:tc>
+          <w:tcPr>
+            <w:tcW w:type="pct" w:w="1000"/>
+          </w:tcPr>
+          <w:p>
+            <w:r>
+              <w:rPr>
+                <w:rFonts w:ascii="Cambria" w:cs="Cambria" w:eastAsia="Cambria" w:hAnsi="Cambria"/>
+                <w:sz w:val="19"/>
+                <w:szCs w:val="19"/>
+              </w:rPr>
+              <w:t xml:space="preserve">Free tier / SSPL</w:t>
+            </w:r>
+          </w:p>
+        </w:tc>
+      </w:tr>
+      <w:tr>
+        <w:tc>
+          <w:tcPr>
+            <w:tcW w:type="pct" w:w="1100"/>
+          </w:tcPr>
+          <w:p>
+            <w:r>
+              <w:rPr>
+                <w:rFonts w:ascii="Cambria" w:cs="Cambria" w:eastAsia="Cambria" w:hAnsi="Cambria"/>
+                <w:sz w:val="19"/>
+                <w:szCs w:val="19"/>
+              </w:rPr>
+              <w:t xml:space="preserve">React</w:t>
+            </w:r>
+          </w:p>
+        </w:tc>
+        <w:tc>
+          <w:tcPr>
+            <w:tcW w:type="pct" w:w="800"/>
+          </w:tcPr>
+          <w:p>
+            <w:r>
+              <w:rPr>
+                <w:rFonts w:ascii="Cambria" w:cs="Cambria" w:eastAsia="Cambria" w:hAnsi="Cambria"/>
+                <w:sz w:val="19"/>
+                <w:szCs w:val="19"/>
+              </w:rPr>
+              <w:t xml:space="preserve">18.2</w:t>
+            </w:r>
+          </w:p>
+        </w:tc>
+        <w:tc>
+          <w:tcPr>
+            <w:tcW w:type="pct" w:w="2100"/>
+          </w:tcPr>
+          <w:p>
+            <w:r>
+              <w:rPr>
+                <w:rFonts w:ascii="Cambria" w:cs="Cambria" w:eastAsia="Cambria" w:hAnsi="Cambria"/>
+                <w:sz w:val="19"/>
+                <w:szCs w:val="19"/>
+              </w:rPr>
+              <w:t xml:space="preserve">Frontend UI framework</w:t>
+            </w:r>
+          </w:p>
+        </w:tc>
+        <w:tc>
+          <w:tcPr>
+            <w:tcW w:type="pct" w:w="1000"/>
+          </w:tcPr>
+          <w:p>
+            <w:r>
+              <w:rPr>
+                <w:rFonts w:ascii="Cambria" w:cs="Cambria" w:eastAsia="Cambria" w:hAnsi="Cambria"/>
+                <w:sz w:val="19"/>
+                <w:szCs w:val="19"/>
+              </w:rPr>
+              <w:t xml:space="preserve">Open source (MIT)</w:t>
+            </w:r>
+          </w:p>
+        </w:tc>
+      </w:tr>
+      <w:tr>
+        <w:tc>
+          <w:tcPr>
+            <w:tcW w:type="pct" w:w="1100"/>
           </w:tcPr>
           <w:p>
             <w:r>
@@ -9493,31 +10360,31 @@
         </w:tc>
         <w:tc>
           <w:tcPr>
-            <w:tcW w:type="pct" w:w="900"/>
-          </w:tcPr>
-          <w:p>
-            <w:r>
-              <w:rPr>
-                <w:rFonts w:ascii="Cambria" w:cs="Cambria" w:eastAsia="Cambria" w:hAnsi="Cambria"/>
-                <w:sz w:val="19"/>
-                <w:szCs w:val="19"/>
-              </w:rPr>
-              <w:t xml:space="preserve">Version 3.4</w:t>
-            </w:r>
-          </w:p>
-        </w:tc>
-        <w:tc>
-          <w:tcPr>
-            <w:tcW w:type="pct" w:w="1850"/>
-          </w:tcPr>
-          <w:p>
-            <w:r>
-              <w:rPr>
-                <w:rFonts w:ascii="Cambria" w:cs="Cambria" w:eastAsia="Cambria" w:hAnsi="Cambria"/>
-                <w:sz w:val="19"/>
-                <w:szCs w:val="19"/>
-              </w:rPr>
-              <w:t xml:space="preserve">Responsive UI Styling</w:t>
+            <w:tcW w:type="pct" w:w="800"/>
+          </w:tcPr>
+          <w:p>
+            <w:r>
+              <w:rPr>
+                <w:rFonts w:ascii="Cambria" w:cs="Cambria" w:eastAsia="Cambria" w:hAnsi="Cambria"/>
+                <w:sz w:val="19"/>
+                <w:szCs w:val="19"/>
+              </w:rPr>
+              <w:t xml:space="preserve">3.4</w:t>
+            </w:r>
+          </w:p>
+        </w:tc>
+        <w:tc>
+          <w:tcPr>
+            <w:tcW w:type="pct" w:w="2100"/>
+          </w:tcPr>
+          <w:p>
+            <w:r>
+              <w:rPr>
+                <w:rFonts w:ascii="Cambria" w:cs="Cambria" w:eastAsia="Cambria" w:hAnsi="Cambria"/>
+                <w:sz w:val="19"/>
+                <w:szCs w:val="19"/>
+              </w:rPr>
+              <w:t xml:space="preserve">Responsive styling framework</w:t>
             </w:r>
           </w:p>
         </w:tc>
@@ -9532,54 +10399,54 @@
                 <w:sz w:val="19"/>
                 <w:szCs w:val="19"/>
               </w:rPr>
-              <w:t xml:space="preserve">Open Source</w:t>
-            </w:r>
-          </w:p>
-        </w:tc>
-      </w:tr>
-      <w:tr>
-        <w:tc>
-          <w:tcPr>
-            <w:tcW w:type="pct" w:w="1250"/>
-          </w:tcPr>
-          <w:p>
-            <w:r>
-              <w:rPr>
-                <w:rFonts w:ascii="Cambria" w:cs="Cambria" w:eastAsia="Cambria" w:hAnsi="Cambria"/>
-                <w:sz w:val="19"/>
-                <w:szCs w:val="19"/>
-              </w:rPr>
-              <w:t xml:space="preserve">Node.js</w:t>
-            </w:r>
-          </w:p>
-        </w:tc>
-        <w:tc>
-          <w:tcPr>
-            <w:tcW w:type="pct" w:w="900"/>
-          </w:tcPr>
-          <w:p>
-            <w:r>
-              <w:rPr>
-                <w:rFonts w:ascii="Cambria" w:cs="Cambria" w:eastAsia="Cambria" w:hAnsi="Cambria"/>
-                <w:sz w:val="19"/>
-                <w:szCs w:val="19"/>
-              </w:rPr>
-              <w:t xml:space="preserve">Node.js 20.x</w:t>
-            </w:r>
-          </w:p>
-        </w:tc>
-        <w:tc>
-          <w:tcPr>
-            <w:tcW w:type="pct" w:w="1850"/>
-          </w:tcPr>
-          <w:p>
-            <w:r>
-              <w:rPr>
-                <w:rFonts w:ascii="Cambria" w:cs="Cambria" w:eastAsia="Cambria" w:hAnsi="Cambria"/>
-                <w:sz w:val="19"/>
-                <w:szCs w:val="19"/>
-              </w:rPr>
-              <w:t xml:space="preserve">Backend Development Server</w:t>
+              <w:t xml:space="preserve">Open source (MIT)</w:t>
+            </w:r>
+          </w:p>
+        </w:tc>
+      </w:tr>
+      <w:tr>
+        <w:tc>
+          <w:tcPr>
+            <w:tcW w:type="pct" w:w="1100"/>
+          </w:tcPr>
+          <w:p>
+            <w:r>
+              <w:rPr>
+                <w:rFonts w:ascii="Cambria" w:cs="Cambria" w:eastAsia="Cambria" w:hAnsi="Cambria"/>
+                <w:sz w:val="19"/>
+                <w:szCs w:val="19"/>
+              </w:rPr>
+              <w:t xml:space="preserve">TypeScript</w:t>
+            </w:r>
+          </w:p>
+        </w:tc>
+        <w:tc>
+          <w:tcPr>
+            <w:tcW w:type="pct" w:w="800"/>
+          </w:tcPr>
+          <w:p>
+            <w:r>
+              <w:rPr>
+                <w:rFonts w:ascii="Cambria" w:cs="Cambria" w:eastAsia="Cambria" w:hAnsi="Cambria"/>
+                <w:sz w:val="19"/>
+                <w:szCs w:val="19"/>
+              </w:rPr>
+              <w:t xml:space="preserve">ES2022 target</w:t>
+            </w:r>
+          </w:p>
+        </w:tc>
+        <w:tc>
+          <w:tcPr>
+            <w:tcW w:type="pct" w:w="2100"/>
+          </w:tcPr>
+          <w:p>
+            <w:r>
+              <w:rPr>
+                <w:rFonts w:ascii="Cambria" w:cs="Cambria" w:eastAsia="Cambria" w:hAnsi="Cambria"/>
+                <w:sz w:val="19"/>
+                <w:szCs w:val="19"/>
+              </w:rPr>
+              <w:t xml:space="preserve">Type-safe full-stack development</w:t>
             </w:r>
           </w:p>
         </w:tc>
@@ -9594,15 +10461,15 @@
                 <w:sz w:val="19"/>
                 <w:szCs w:val="19"/>
               </w:rPr>
-              <w:t xml:space="preserve">Open Source</w:t>
-            </w:r>
-          </w:p>
-        </w:tc>
-      </w:tr>
-      <w:tr>
-        <w:tc>
-          <w:tcPr>
-            <w:tcW w:type="pct" w:w="1250"/>
+              <w:t xml:space="preserve">Open source (Apache-2.0)</w:t>
+            </w:r>
+          </w:p>
+        </w:tc>
+      </w:tr>
+      <w:tr>
+        <w:tc>
+          <w:tcPr>
+            <w:tcW w:type="pct" w:w="1100"/>
           </w:tcPr>
           <w:p>
             <w:r>
@@ -9617,31 +10484,31 @@
         </w:tc>
         <w:tc>
           <w:tcPr>
-            <w:tcW w:type="pct" w:w="900"/>
-          </w:tcPr>
-          <w:p>
-            <w:r>
-              <w:rPr>
-                <w:rFonts w:ascii="Cambria" w:cs="Cambria" w:eastAsia="Cambria" w:hAnsi="Cambria"/>
-                <w:sz w:val="19"/>
-                <w:szCs w:val="19"/>
-              </w:rPr>
-              <w:t xml:space="preserve">Express 4.18</w:t>
-            </w:r>
-          </w:p>
-        </w:tc>
-        <w:tc>
-          <w:tcPr>
-            <w:tcW w:type="pct" w:w="1850"/>
-          </w:tcPr>
-          <w:p>
-            <w:r>
-              <w:rPr>
-                <w:rFonts w:ascii="Cambria" w:cs="Cambria" w:eastAsia="Cambria" w:hAnsi="Cambria"/>
-                <w:sz w:val="19"/>
-                <w:szCs w:val="19"/>
-              </w:rPr>
-              <w:t xml:space="preserve">REST API Development</w:t>
+            <w:tcW w:type="pct" w:w="800"/>
+          </w:tcPr>
+          <w:p>
+            <w:r>
+              <w:rPr>
+                <w:rFonts w:ascii="Cambria" w:cs="Cambria" w:eastAsia="Cambria" w:hAnsi="Cambria"/>
+                <w:sz w:val="19"/>
+                <w:szCs w:val="19"/>
+              </w:rPr>
+              <w:t xml:space="preserve">4.18</w:t>
+            </w:r>
+          </w:p>
+        </w:tc>
+        <w:tc>
+          <w:tcPr>
+            <w:tcW w:type="pct" w:w="2100"/>
+          </w:tcPr>
+          <w:p>
+            <w:r>
+              <w:rPr>
+                <w:rFonts w:ascii="Cambria" w:cs="Cambria" w:eastAsia="Cambria" w:hAnsi="Cambria"/>
+                <w:sz w:val="19"/>
+                <w:szCs w:val="19"/>
+              </w:rPr>
+              <w:t xml:space="preserve">REST routing and middleware</w:t>
             </w:r>
           </w:p>
         </w:tc>
@@ -9656,54 +10523,54 @@
                 <w:sz w:val="19"/>
                 <w:szCs w:val="19"/>
               </w:rPr>
-              <w:t xml:space="preserve">Open Source</w:t>
-            </w:r>
-          </w:p>
-        </w:tc>
-      </w:tr>
-      <w:tr>
-        <w:tc>
-          <w:tcPr>
-            <w:tcW w:type="pct" w:w="1250"/>
-          </w:tcPr>
-          <w:p>
-            <w:r>
-              <w:rPr>
-                <w:rFonts w:ascii="Cambria" w:cs="Cambria" w:eastAsia="Cambria" w:hAnsi="Cambria"/>
-                <w:sz w:val="19"/>
-                <w:szCs w:val="19"/>
-              </w:rPr>
-              <w:t xml:space="preserve">MongoDB Atlas</w:t>
-            </w:r>
-          </w:p>
-        </w:tc>
-        <w:tc>
-          <w:tcPr>
-            <w:tcW w:type="pct" w:w="900"/>
-          </w:tcPr>
-          <w:p>
-            <w:r>
-              <w:rPr>
-                <w:rFonts w:ascii="Cambria" w:cs="Cambria" w:eastAsia="Cambria" w:hAnsi="Cambria"/>
-                <w:sz w:val="19"/>
-                <w:szCs w:val="19"/>
-              </w:rPr>
-              <w:t xml:space="preserve">MongoDB 6.0+</w:t>
-            </w:r>
-          </w:p>
-        </w:tc>
-        <w:tc>
-          <w:tcPr>
-            <w:tcW w:type="pct" w:w="1850"/>
-          </w:tcPr>
-          <w:p>
-            <w:r>
-              <w:rPr>
-                <w:rFonts w:ascii="Cambria" w:cs="Cambria" w:eastAsia="Cambria" w:hAnsi="Cambria"/>
-                <w:sz w:val="19"/>
-                <w:szCs w:val="19"/>
-              </w:rPr>
-              <w:t xml:space="preserve">Cloud Database Management</w:t>
+              <w:t xml:space="preserve">Open source (MIT)</w:t>
+            </w:r>
+          </w:p>
+        </w:tc>
+      </w:tr>
+      <w:tr>
+        <w:tc>
+          <w:tcPr>
+            <w:tcW w:type="pct" w:w="1100"/>
+          </w:tcPr>
+          <w:p>
+            <w:r>
+              <w:rPr>
+                <w:rFonts w:ascii="Cambria" w:cs="Cambria" w:eastAsia="Cambria" w:hAnsi="Cambria"/>
+                <w:sz w:val="19"/>
+                <w:szCs w:val="19"/>
+              </w:rPr>
+              <w:t xml:space="preserve">Html5Qrcode</w:t>
+            </w:r>
+          </w:p>
+        </w:tc>
+        <w:tc>
+          <w:tcPr>
+            <w:tcW w:type="pct" w:w="800"/>
+          </w:tcPr>
+          <w:p>
+            <w:r>
+              <w:rPr>
+                <w:rFonts w:ascii="Cambria" w:cs="Cambria" w:eastAsia="Cambria" w:hAnsi="Cambria"/>
+                <w:sz w:val="19"/>
+                <w:szCs w:val="19"/>
+              </w:rPr>
+              <w:t xml:space="preserve">2.3+</w:t>
+            </w:r>
+          </w:p>
+        </w:tc>
+        <w:tc>
+          <w:tcPr>
+            <w:tcW w:type="pct" w:w="2100"/>
+          </w:tcPr>
+          <w:p>
+            <w:r>
+              <w:rPr>
+                <w:rFonts w:ascii="Cambria" w:cs="Cambria" w:eastAsia="Cambria" w:hAnsi="Cambria"/>
+                <w:sz w:val="19"/>
+                <w:szCs w:val="19"/>
+              </w:rPr>
+              <w:t xml:space="preserve">In-browser QR scanning</w:t>
             </w:r>
           </w:p>
         </w:tc>
@@ -9718,30 +10585,154 @@
                 <w:sz w:val="19"/>
                 <w:szCs w:val="19"/>
               </w:rPr>
-              <w:t xml:space="preserve">Free / Community</w:t>
-            </w:r>
-          </w:p>
-        </w:tc>
-      </w:tr>
-      <w:tr>
-        <w:tc>
-          <w:tcPr>
-            <w:tcW w:type="pct" w:w="1250"/>
-          </w:tcPr>
-          <w:p>
-            <w:r>
-              <w:rPr>
-                <w:rFonts w:ascii="Cambria" w:cs="Cambria" w:eastAsia="Cambria" w:hAnsi="Cambria"/>
-                <w:sz w:val="19"/>
-                <w:szCs w:val="19"/>
-              </w:rPr>
-              <w:t xml:space="preserve">Razorpay Checkout SDK</w:t>
-            </w:r>
-          </w:p>
-        </w:tc>
-        <w:tc>
-          <w:tcPr>
-            <w:tcW w:type="pct" w:w="900"/>
+              <w:t xml:space="preserve">Open source (Apache-2.0)</w:t>
+            </w:r>
+          </w:p>
+        </w:tc>
+      </w:tr>
+      <w:tr>
+        <w:tc>
+          <w:tcPr>
+            <w:tcW w:type="pct" w:w="1100"/>
+          </w:tcPr>
+          <w:p>
+            <w:r>
+              <w:rPr>
+                <w:rFonts w:ascii="Cambria" w:cs="Cambria" w:eastAsia="Cambria" w:hAnsi="Cambria"/>
+                <w:sz w:val="19"/>
+                <w:szCs w:val="19"/>
+              </w:rPr>
+              <w:t xml:space="preserve">qrcode.react</w:t>
+            </w:r>
+          </w:p>
+        </w:tc>
+        <w:tc>
+          <w:tcPr>
+            <w:tcW w:type="pct" w:w="800"/>
+          </w:tcPr>
+          <w:p>
+            <w:r>
+              <w:rPr>
+                <w:rFonts w:ascii="Cambria" w:cs="Cambria" w:eastAsia="Cambria" w:hAnsi="Cambria"/>
+                <w:sz w:val="19"/>
+                <w:szCs w:val="19"/>
+              </w:rPr>
+              <w:t xml:space="preserve">Stable release</w:t>
+            </w:r>
+          </w:p>
+        </w:tc>
+        <w:tc>
+          <w:tcPr>
+            <w:tcW w:type="pct" w:w="2100"/>
+          </w:tcPr>
+          <w:p>
+            <w:r>
+              <w:rPr>
+                <w:rFonts w:ascii="Cambria" w:cs="Cambria" w:eastAsia="Cambria" w:hAnsi="Cambria"/>
+                <w:sz w:val="19"/>
+                <w:szCs w:val="19"/>
+              </w:rPr>
+              <w:t xml:space="preserve">QR code rendering for driver pass</w:t>
+            </w:r>
+          </w:p>
+        </w:tc>
+        <w:tc>
+          <w:tcPr>
+            <w:tcW w:type="pct" w:w="1000"/>
+          </w:tcPr>
+          <w:p>
+            <w:r>
+              <w:rPr>
+                <w:rFonts w:ascii="Cambria" w:cs="Cambria" w:eastAsia="Cambria" w:hAnsi="Cambria"/>
+                <w:sz w:val="19"/>
+                <w:szCs w:val="19"/>
+              </w:rPr>
+              <w:t xml:space="preserve">Open source (ISC)</w:t>
+            </w:r>
+          </w:p>
+        </w:tc>
+      </w:tr>
+      <w:tr>
+        <w:tc>
+          <w:tcPr>
+            <w:tcW w:type="pct" w:w="1100"/>
+          </w:tcPr>
+          <w:p>
+            <w:r>
+              <w:rPr>
+                <w:rFonts w:ascii="Cambria" w:cs="Cambria" w:eastAsia="Cambria" w:hAnsi="Cambria"/>
+                <w:sz w:val="19"/>
+                <w:szCs w:val="19"/>
+              </w:rPr>
+              <w:t xml:space="preserve">bcryptjs / jsonwebtoken</w:t>
+            </w:r>
+          </w:p>
+        </w:tc>
+        <w:tc>
+          <w:tcPr>
+            <w:tcW w:type="pct" w:w="800"/>
+          </w:tcPr>
+          <w:p>
+            <w:r>
+              <w:rPr>
+                <w:rFonts w:ascii="Cambria" w:cs="Cambria" w:eastAsia="Cambria" w:hAnsi="Cambria"/>
+                <w:sz w:val="19"/>
+                <w:szCs w:val="19"/>
+              </w:rPr>
+              <w:t xml:space="preserve">Stable release</w:t>
+            </w:r>
+          </w:p>
+        </w:tc>
+        <w:tc>
+          <w:tcPr>
+            <w:tcW w:type="pct" w:w="2100"/>
+          </w:tcPr>
+          <w:p>
+            <w:r>
+              <w:rPr>
+                <w:rFonts w:ascii="Cambria" w:cs="Cambria" w:eastAsia="Cambria" w:hAnsi="Cambria"/>
+                <w:sz w:val="19"/>
+                <w:szCs w:val="19"/>
+              </w:rPr>
+              <w:t xml:space="preserve">Password hashing and JWT sessions</w:t>
+            </w:r>
+          </w:p>
+        </w:tc>
+        <w:tc>
+          <w:tcPr>
+            <w:tcW w:type="pct" w:w="1000"/>
+          </w:tcPr>
+          <w:p>
+            <w:r>
+              <w:rPr>
+                <w:rFonts w:ascii="Cambria" w:cs="Cambria" w:eastAsia="Cambria" w:hAnsi="Cambria"/>
+                <w:sz w:val="19"/>
+                <w:szCs w:val="19"/>
+              </w:rPr>
+              <w:t xml:space="preserve">Open source (MIT)</w:t>
+            </w:r>
+          </w:p>
+        </w:tc>
+      </w:tr>
+      <w:tr>
+        <w:tc>
+          <w:tcPr>
+            <w:tcW w:type="pct" w:w="1100"/>
+          </w:tcPr>
+          <w:p>
+            <w:r>
+              <w:rPr>
+                <w:rFonts w:ascii="Cambria" w:cs="Cambria" w:eastAsia="Cambria" w:hAnsi="Cambria"/>
+                <w:sz w:val="19"/>
+                <w:szCs w:val="19"/>
+              </w:rPr>
+              <w:t xml:space="preserve">Postman / Git &amp; GitHub</w:t>
+            </w:r>
+          </w:p>
+        </w:tc>
+        <w:tc>
+          <w:tcPr>
+            <w:tcW w:type="pct" w:w="800"/>
           </w:tcPr>
           <w:p>
             <w:r>
@@ -9756,16 +10747,16 @@
         </w:tc>
         <w:tc>
           <w:tcPr>
-            <w:tcW w:type="pct" w:w="1850"/>
-          </w:tcPr>
-          <w:p>
-            <w:r>
-              <w:rPr>
-                <w:rFonts w:ascii="Cambria" w:cs="Cambria" w:eastAsia="Cambria" w:hAnsi="Cambria"/>
-                <w:sz w:val="19"/>
-                <w:szCs w:val="19"/>
-              </w:rPr>
-              <w:t xml:space="preserve">Online Payment Integration</w:t>
+            <w:tcW w:type="pct" w:w="2100"/>
+          </w:tcPr>
+          <w:p>
+            <w:r>
+              <w:rPr>
+                <w:rFonts w:ascii="Cambria" w:cs="Cambria" w:eastAsia="Cambria" w:hAnsi="Cambria"/>
+                <w:sz w:val="19"/>
+                <w:szCs w:val="19"/>
+              </w:rPr>
+              <w:t xml:space="preserve">API testing and version control</w:t>
             </w:r>
           </w:p>
         </w:tc>
@@ -9780,260 +10771,652 @@
                 <w:sz w:val="19"/>
                 <w:szCs w:val="19"/>
               </w:rPr>
-              <w:t xml:space="preserve">Payment Service</w:t>
-            </w:r>
-          </w:p>
-        </w:tc>
-      </w:tr>
-      <w:tr>
-        <w:tc>
-          <w:tcPr>
-            <w:tcW w:type="pct" w:w="1250"/>
-          </w:tcPr>
-          <w:p>
-            <w:r>
-              <w:rPr>
-                <w:rFonts w:ascii="Cambria" w:cs="Cambria" w:eastAsia="Cambria" w:hAnsi="Cambria"/>
-                <w:sz w:val="19"/>
-                <w:szCs w:val="19"/>
-              </w:rPr>
-              <w:t xml:space="preserve">Html5Qrcode</w:t>
-            </w:r>
-          </w:p>
-        </w:tc>
-        <w:tc>
-          <w:tcPr>
-            <w:tcW w:type="pct" w:w="900"/>
-          </w:tcPr>
-          <w:p>
-            <w:r>
-              <w:rPr>
-                <w:rFonts w:ascii="Cambria" w:cs="Cambria" w:eastAsia="Cambria" w:hAnsi="Cambria"/>
-                <w:sz w:val="19"/>
-                <w:szCs w:val="19"/>
-              </w:rPr>
-              <w:t xml:space="preserve">Version 2.3+</w:t>
-            </w:r>
-          </w:p>
-        </w:tc>
-        <w:tc>
-          <w:tcPr>
-            <w:tcW w:type="pct" w:w="1850"/>
-          </w:tcPr>
-          <w:p>
-            <w:r>
-              <w:rPr>
-                <w:rFonts w:ascii="Cambria" w:cs="Cambria" w:eastAsia="Cambria" w:hAnsi="Cambria"/>
-                <w:sz w:val="19"/>
-                <w:szCs w:val="19"/>
-              </w:rPr>
-              <w:t xml:space="preserve">Camera-based Barcode Scanning</w:t>
-            </w:r>
-          </w:p>
-        </w:tc>
+              <w:t xml:space="preserve">Free tier</w:t>
+            </w:r>
+          </w:p>
+        </w:tc>
+      </w:tr>
+    </w:tbl>
+    <w:p>
+      <w:pPr>
+        <w:pStyle w:val="Heading2"/>
+        <w:spacing w:after="100" w:before="220"/>
+      </w:pPr>
+      <w:r>
+        <w:t xml:space="preserve">4.5 Data / Dataset Requirements</w:t>
+      </w:r>
+      <w:r>
+        <w:rPr>
+          <w:rFonts w:ascii="Cambria" w:cs="Cambria" w:eastAsia="Cambria" w:hAnsi="Cambria"/>
+          <w:b/>
+          <w:bCs/>
+          <w:color w:val="1A252F"/>
+          <w:sz w:val="24"/>
+          <w:szCs w:val="24"/>
+        </w:rPr>
+        <w:t xml:space="preserve">4.5 Data / Dataset Requirements</w:t>
+      </w:r>
+    </w:p>
+    <w:p>
+      <w:pPr>
+        <w:spacing w:after="100" w:before="60" w:line="360"/>
+        <w:jc w:val="both"/>
+      </w:pPr>
+      <w:r>
+        <w:rPr>
+          <w:rFonts w:ascii="Cambria" w:cs="Cambria" w:eastAsia="Cambria" w:hAnsi="Cambria"/>
+          <w:i w:val="false"/>
+          <w:iCs w:val="false"/>
+          <w:sz w:val="24"/>
+          <w:szCs w:val="24"/>
+        </w:rPr>
+        <w:t xml:space="preserve">The application generates transactional operational data during real-time user bookings, vehicle check-ins, and security logs:</w:t>
+      </w:r>
+    </w:p>
+    <w:p>
+      <w:pPr>
+        <w:spacing w:after="80" w:before="160"/>
+      </w:pPr>
+      <w:r>
+        <w:rPr>
+          <w:rFonts w:ascii="Cambria" w:cs="Cambria" w:eastAsia="Cambria" w:hAnsi="Cambria"/>
+          <w:b/>
+          <w:bCs/>
+          <w:color w:val="003366"/>
+          <w:sz w:val="22"/>
+          <w:szCs w:val="22"/>
+        </w:rPr>
+        <w:t xml:space="preserve">Table 4.5: Data / Dataset Requirements</w:t>
+      </w:r>
+    </w:p>
+    <w:tbl>
+      <w:tblPr>
+        <w:tblW w:type="pct" w:w="5000"/>
+        <w:tblBorders>
+          <w:top w:val="single" w:color="auto" w:sz="4"/>
+          <w:left w:val="single" w:color="auto" w:sz="4"/>
+          <w:bottom w:val="single" w:color="auto" w:sz="4"/>
+          <w:right w:val="single" w:color="auto" w:sz="4"/>
+          <w:insideH w:val="single" w:color="auto" w:sz="4"/>
+          <w:insideV w:val="single" w:color="auto" w:sz="4"/>
+        </w:tblBorders>
+      </w:tblPr>
+      <w:tblGrid>
+        <w:gridCol w:w="1805"/>
+        <w:gridCol w:w="1805"/>
+        <w:gridCol w:w="1805"/>
+        <w:gridCol w:w="1805"/>
+        <w:gridCol w:w="1805"/>
+      </w:tblGrid>
+      <w:tr>
+        <w:trPr>
+          <w:tblHeader/>
+        </w:trPr>
         <w:tc>
           <w:tcPr>
             <w:tcW w:type="pct" w:w="1000"/>
-          </w:tcPr>
-          <w:p>
-            <w:r>
-              <w:rPr>
-                <w:rFonts w:ascii="Cambria" w:cs="Cambria" w:eastAsia="Cambria" w:hAnsi="Cambria"/>
-                <w:sz w:val="19"/>
-                <w:szCs w:val="19"/>
-              </w:rPr>
-              <w:t xml:space="preserve">Open Source</w:t>
-            </w:r>
-          </w:p>
-        </w:tc>
-      </w:tr>
-      <w:tr>
-        <w:tc>
-          <w:tcPr>
-            <w:tcW w:type="pct" w:w="1250"/>
-          </w:tcPr>
-          <w:p>
-            <w:r>
-              <w:rPr>
-                <w:rFonts w:ascii="Cambria" w:cs="Cambria" w:eastAsia="Cambria" w:hAnsi="Cambria"/>
-                <w:sz w:val="19"/>
-                <w:szCs w:val="19"/>
-              </w:rPr>
-              <w:t xml:space="preserve">Socket.IO</w:t>
-            </w:r>
-          </w:p>
-        </w:tc>
-        <w:tc>
-          <w:tcPr>
-            <w:tcW w:type="pct" w:w="900"/>
-          </w:tcPr>
-          <w:p>
-            <w:r>
-              <w:rPr>
-                <w:rFonts w:ascii="Cambria" w:cs="Cambria" w:eastAsia="Cambria" w:hAnsi="Cambria"/>
-                <w:sz w:val="19"/>
-                <w:szCs w:val="19"/>
-              </w:rPr>
-              <w:t xml:space="preserve">Version 4.7+</w:t>
-            </w:r>
-          </w:p>
-        </w:tc>
-        <w:tc>
-          <w:tcPr>
-            <w:tcW w:type="pct" w:w="1850"/>
-          </w:tcPr>
-          <w:p>
-            <w:r>
-              <w:rPr>
-                <w:rFonts w:ascii="Cambria" w:cs="Cambria" w:eastAsia="Cambria" w:hAnsi="Cambria"/>
-                <w:sz w:val="19"/>
-                <w:szCs w:val="19"/>
-              </w:rPr>
-              <w:t xml:space="preserve">Real-Time WebSocket Events</w:t>
+            <w:shd w:fill="EAF2F8" w:val="clear"/>
+          </w:tcPr>
+          <w:p>
+            <w:r>
+              <w:rPr>
+                <w:rFonts w:ascii="Cambria" w:cs="Cambria" w:eastAsia="Cambria" w:hAnsi="Cambria"/>
+                <w:b/>
+                <w:bCs/>
+                <w:color w:val="003366"/>
+                <w:sz w:val="20"/>
+                <w:szCs w:val="20"/>
+              </w:rPr>
+              <w:t xml:space="preserve">Data Source</w:t>
             </w:r>
           </w:p>
         </w:tc>
         <w:tc>
           <w:tcPr>
             <w:tcW w:type="pct" w:w="1000"/>
-          </w:tcPr>
-          <w:p>
-            <w:r>
-              <w:rPr>
-                <w:rFonts w:ascii="Cambria" w:cs="Cambria" w:eastAsia="Cambria" w:hAnsi="Cambria"/>
-                <w:sz w:val="19"/>
-                <w:szCs w:val="19"/>
-              </w:rPr>
-              <w:t xml:space="preserve">Open Source</w:t>
-            </w:r>
-          </w:p>
-        </w:tc>
-      </w:tr>
-      <w:tr>
-        <w:tc>
-          <w:tcPr>
-            <w:tcW w:type="pct" w:w="1250"/>
-          </w:tcPr>
-          <w:p>
-            <w:r>
-              <w:rPr>
-                <w:rFonts w:ascii="Cambria" w:cs="Cambria" w:eastAsia="Cambria" w:hAnsi="Cambria"/>
-                <w:sz w:val="19"/>
-                <w:szCs w:val="19"/>
-              </w:rPr>
-              <w:t xml:space="preserve">Nodemailer</w:t>
-            </w:r>
-          </w:p>
-        </w:tc>
-        <w:tc>
-          <w:tcPr>
-            <w:tcW w:type="pct" w:w="900"/>
-          </w:tcPr>
-          <w:p>
-            <w:r>
-              <w:rPr>
-                <w:rFonts w:ascii="Cambria" w:cs="Cambria" w:eastAsia="Cambria" w:hAnsi="Cambria"/>
-                <w:sz w:val="19"/>
-                <w:szCs w:val="19"/>
-              </w:rPr>
-              <w:t xml:space="preserve">Version 6.9+</w:t>
-            </w:r>
-          </w:p>
-        </w:tc>
-        <w:tc>
-          <w:tcPr>
-            <w:tcW w:type="pct" w:w="1850"/>
-          </w:tcPr>
-          <w:p>
-            <w:r>
-              <w:rPr>
-                <w:rFonts w:ascii="Cambria" w:cs="Cambria" w:eastAsia="Cambria" w:hAnsi="Cambria"/>
-                <w:sz w:val="19"/>
-                <w:szCs w:val="19"/>
-              </w:rPr>
-              <w:t xml:space="preserve">SMTP Transactional Email</w:t>
+            <w:shd w:fill="EAF2F8" w:val="clear"/>
+          </w:tcPr>
+          <w:p>
+            <w:r>
+              <w:rPr>
+                <w:rFonts w:ascii="Cambria" w:cs="Cambria" w:eastAsia="Cambria" w:hAnsi="Cambria"/>
+                <w:b/>
+                <w:bCs/>
+                <w:color w:val="003366"/>
+                <w:sz w:val="20"/>
+                <w:szCs w:val="20"/>
+              </w:rPr>
+              <w:t xml:space="preserve">Type</w:t>
             </w:r>
           </w:p>
         </w:tc>
         <w:tc>
           <w:tcPr>
             <w:tcW w:type="pct" w:w="1000"/>
-          </w:tcPr>
-          <w:p>
-            <w:r>
-              <w:rPr>
-                <w:rFonts w:ascii="Cambria" w:cs="Cambria" w:eastAsia="Cambria" w:hAnsi="Cambria"/>
-                <w:sz w:val="19"/>
-                <w:szCs w:val="19"/>
-              </w:rPr>
-              <w:t xml:space="preserve">Open Source</w:t>
-            </w:r>
-          </w:p>
-        </w:tc>
-      </w:tr>
-      <w:tr>
-        <w:tc>
-          <w:tcPr>
-            <w:tcW w:type="pct" w:w="1250"/>
-          </w:tcPr>
-          <w:p>
-            <w:r>
-              <w:rPr>
-                <w:rFonts w:ascii="Cambria" w:cs="Cambria" w:eastAsia="Cambria" w:hAnsi="Cambria"/>
-                <w:sz w:val="19"/>
-                <w:szCs w:val="19"/>
-              </w:rPr>
-              <w:t xml:space="preserve">Vercel</w:t>
-            </w:r>
-          </w:p>
-        </w:tc>
-        <w:tc>
-          <w:tcPr>
-            <w:tcW w:type="pct" w:w="900"/>
-          </w:tcPr>
-          <w:p>
-            <w:r>
-              <w:rPr>
-                <w:rFonts w:ascii="Cambria" w:cs="Cambria" w:eastAsia="Cambria" w:hAnsi="Cambria"/>
-                <w:sz w:val="19"/>
-                <w:szCs w:val="19"/>
-              </w:rPr>
-              <w:t xml:space="preserve">Cloud Platform</w:t>
-            </w:r>
-          </w:p>
-        </w:tc>
-        <w:tc>
-          <w:tcPr>
-            <w:tcW w:type="pct" w:w="1850"/>
-          </w:tcPr>
-          <w:p>
-            <w:r>
-              <w:rPr>
-                <w:rFonts w:ascii="Cambria" w:cs="Cambria" w:eastAsia="Cambria" w:hAnsi="Cambria"/>
-                <w:sz w:val="19"/>
-                <w:szCs w:val="19"/>
-              </w:rPr>
-              <w:t xml:space="preserve">Production Hosting &amp; CI/CD</w:t>
+            <w:shd w:fill="EAF2F8" w:val="clear"/>
+          </w:tcPr>
+          <w:p>
+            <w:r>
+              <w:rPr>
+                <w:rFonts w:ascii="Cambria" w:cs="Cambria" w:eastAsia="Cambria" w:hAnsi="Cambria"/>
+                <w:b/>
+                <w:bCs/>
+                <w:color w:val="003366"/>
+                <w:sz w:val="20"/>
+                <w:szCs w:val="20"/>
+              </w:rPr>
+              <w:t xml:space="preserve">Size / Records</w:t>
             </w:r>
           </w:p>
         </w:tc>
         <w:tc>
           <w:tcPr>
             <w:tcW w:type="pct" w:w="1000"/>
-          </w:tcPr>
-          <w:p>
-            <w:r>
-              <w:rPr>
-                <w:rFonts w:ascii="Cambria" w:cs="Cambria" w:eastAsia="Cambria" w:hAnsi="Cambria"/>
-                <w:sz w:val="19"/>
-                <w:szCs w:val="19"/>
-              </w:rPr>
-              <w:t xml:space="preserve">Free / Cloud</w:t>
+            <w:shd w:fill="EAF2F8" w:val="clear"/>
+          </w:tcPr>
+          <w:p>
+            <w:r>
+              <w:rPr>
+                <w:rFonts w:ascii="Cambria" w:cs="Cambria" w:eastAsia="Cambria" w:hAnsi="Cambria"/>
+                <w:b/>
+                <w:bCs/>
+                <w:color w:val="003366"/>
+                <w:sz w:val="20"/>
+                <w:szCs w:val="20"/>
+              </w:rPr>
+              <w:t xml:space="preserve">Pre-processing</w:t>
+            </w:r>
+          </w:p>
+        </w:tc>
+        <w:tc>
+          <w:tcPr>
+            <w:tcW w:type="pct" w:w="1000"/>
+            <w:shd w:fill="EAF2F8" w:val="clear"/>
+          </w:tcPr>
+          <w:p>
+            <w:r>
+              <w:rPr>
+                <w:rFonts w:ascii="Cambria" w:cs="Cambria" w:eastAsia="Cambria" w:hAnsi="Cambria"/>
+                <w:b/>
+                <w:bCs/>
+                <w:color w:val="003366"/>
+                <w:sz w:val="20"/>
+                <w:szCs w:val="20"/>
+              </w:rPr>
+              <w:t xml:space="preserve">Purpose</w:t>
+            </w:r>
+          </w:p>
+        </w:tc>
+      </w:tr>
+      <w:tr>
+        <w:tc>
+          <w:tcPr>
+            <w:tcW w:type="pct" w:w="1000"/>
+          </w:tcPr>
+          <w:p>
+            <w:r>
+              <w:rPr>
+                <w:rFonts w:ascii="Cambria" w:cs="Cambria" w:eastAsia="Cambria" w:hAnsi="Cambria"/>
+                <w:sz w:val="19"/>
+                <w:szCs w:val="19"/>
+              </w:rPr>
+              <w:t xml:space="preserve">Application-generated data</w:t>
+            </w:r>
+          </w:p>
+        </w:tc>
+        <w:tc>
+          <w:tcPr>
+            <w:tcW w:type="pct" w:w="1000"/>
+          </w:tcPr>
+          <w:p>
+            <w:r>
+              <w:rPr>
+                <w:rFonts w:ascii="Cambria" w:cs="Cambria" w:eastAsia="Cambria" w:hAnsi="Cambria"/>
+                <w:sz w:val="19"/>
+                <w:szCs w:val="19"/>
+              </w:rPr>
+              <w:t xml:space="preserve">Users collection</w:t>
+            </w:r>
+          </w:p>
+        </w:tc>
+        <w:tc>
+          <w:tcPr>
+            <w:tcW w:type="pct" w:w="1000"/>
+          </w:tcPr>
+          <w:p>
+            <w:r>
+              <w:rPr>
+                <w:rFonts w:ascii="Cambria" w:cs="Cambria" w:eastAsia="Cambria" w:hAnsi="Cambria"/>
+                <w:sz w:val="19"/>
+                <w:szCs w:val="19"/>
+              </w:rPr>
+              <w:t xml:space="preserve">Created at runtime (user registrations)</w:t>
+            </w:r>
+          </w:p>
+        </w:tc>
+        <w:tc>
+          <w:tcPr>
+            <w:tcW w:type="pct" w:w="1000"/>
+          </w:tcPr>
+          <w:p>
+            <w:r>
+              <w:rPr>
+                <w:rFonts w:ascii="Cambria" w:cs="Cambria" w:eastAsia="Cambria" w:hAnsi="Cambria"/>
+                <w:sz w:val="19"/>
+                <w:szCs w:val="19"/>
+              </w:rPr>
+              <w:t xml:space="preserve">Password hashing (bcrypt), validation</w:t>
+            </w:r>
+          </w:p>
+        </w:tc>
+        <w:tc>
+          <w:tcPr>
+            <w:tcW w:type="pct" w:w="1000"/>
+          </w:tcPr>
+          <w:p>
+            <w:r>
+              <w:rPr>
+                <w:rFonts w:ascii="Cambria" w:cs="Cambria" w:eastAsia="Cambria" w:hAnsi="Cambria"/>
+                <w:sz w:val="19"/>
+                <w:szCs w:val="19"/>
+              </w:rPr>
+              <w:t xml:space="preserve">Authentication and RBAC</w:t>
+            </w:r>
+          </w:p>
+        </w:tc>
+      </w:tr>
+      <w:tr>
+        <w:tc>
+          <w:tcPr>
+            <w:tcW w:type="pct" w:w="1000"/>
+          </w:tcPr>
+          <w:p>
+            <w:r>
+              <w:rPr>
+                <w:rFonts w:ascii="Cambria" w:cs="Cambria" w:eastAsia="Cambria" w:hAnsi="Cambria"/>
+                <w:sz w:val="19"/>
+                <w:szCs w:val="19"/>
+              </w:rPr>
+              <w:t xml:space="preserve">Application-generated data</w:t>
+            </w:r>
+          </w:p>
+        </w:tc>
+        <w:tc>
+          <w:tcPr>
+            <w:tcW w:type="pct" w:w="1000"/>
+          </w:tcPr>
+          <w:p>
+            <w:r>
+              <w:rPr>
+                <w:rFonts w:ascii="Cambria" w:cs="Cambria" w:eastAsia="Cambria" w:hAnsi="Cambria"/>
+                <w:sz w:val="19"/>
+                <w:szCs w:val="19"/>
+              </w:rPr>
+              <w:t xml:space="preserve">Slots collection</w:t>
+            </w:r>
+          </w:p>
+        </w:tc>
+        <w:tc>
+          <w:tcPr>
+            <w:tcW w:type="pct" w:w="1000"/>
+          </w:tcPr>
+          <w:p>
+            <w:r>
+              <w:rPr>
+                <w:rFonts w:ascii="Cambria" w:cs="Cambria" w:eastAsia="Cambria" w:hAnsi="Cambria"/>
+                <w:sz w:val="19"/>
+                <w:szCs w:val="19"/>
+              </w:rPr>
+              <w:t xml:space="preserve">Parking bays configured by admin</w:t>
+            </w:r>
+          </w:p>
+        </w:tc>
+        <w:tc>
+          <w:tcPr>
+            <w:tcW w:type="pct" w:w="1000"/>
+          </w:tcPr>
+          <w:p>
+            <w:r>
+              <w:rPr>
+                <w:rFonts w:ascii="Cambria" w:cs="Cambria" w:eastAsia="Cambria" w:hAnsi="Cambria"/>
+                <w:sz w:val="19"/>
+                <w:szCs w:val="19"/>
+              </w:rPr>
+              <w:t xml:space="preserve">Normalization of slot type and status</w:t>
+            </w:r>
+          </w:p>
+        </w:tc>
+        <w:tc>
+          <w:tcPr>
+            <w:tcW w:type="pct" w:w="1000"/>
+          </w:tcPr>
+          <w:p>
+            <w:r>
+              <w:rPr>
+                <w:rFonts w:ascii="Cambria" w:cs="Cambria" w:eastAsia="Cambria" w:hAnsi="Cambria"/>
+                <w:sz w:val="19"/>
+                <w:szCs w:val="19"/>
+              </w:rPr>
+              <w:t xml:space="preserve">Floor grid and availability</w:t>
+            </w:r>
+          </w:p>
+        </w:tc>
+      </w:tr>
+      <w:tr>
+        <w:tc>
+          <w:tcPr>
+            <w:tcW w:type="pct" w:w="1000"/>
+          </w:tcPr>
+          <w:p>
+            <w:r>
+              <w:rPr>
+                <w:rFonts w:ascii="Cambria" w:cs="Cambria" w:eastAsia="Cambria" w:hAnsi="Cambria"/>
+                <w:sz w:val="19"/>
+                <w:szCs w:val="19"/>
+              </w:rPr>
+              <w:t xml:space="preserve">Application-generated data</w:t>
+            </w:r>
+          </w:p>
+        </w:tc>
+        <w:tc>
+          <w:tcPr>
+            <w:tcW w:type="pct" w:w="1000"/>
+          </w:tcPr>
+          <w:p>
+            <w:r>
+              <w:rPr>
+                <w:rFonts w:ascii="Cambria" w:cs="Cambria" w:eastAsia="Cambria" w:hAnsi="Cambria"/>
+                <w:sz w:val="19"/>
+                <w:szCs w:val="19"/>
+              </w:rPr>
+              <w:t xml:space="preserve">Bookings collection</w:t>
+            </w:r>
+          </w:p>
+        </w:tc>
+        <w:tc>
+          <w:tcPr>
+            <w:tcW w:type="pct" w:w="1000"/>
+          </w:tcPr>
+          <w:p>
+            <w:r>
+              <w:rPr>
+                <w:rFonts w:ascii="Cambria" w:cs="Cambria" w:eastAsia="Cambria" w:hAnsi="Cambria"/>
+                <w:sz w:val="19"/>
+                <w:szCs w:val="19"/>
+              </w:rPr>
+              <w:t xml:space="preserve">Created per reservation</w:t>
+            </w:r>
+          </w:p>
+        </w:tc>
+        <w:tc>
+          <w:tcPr>
+            <w:tcW w:type="pct" w:w="1000"/>
+          </w:tcPr>
+          <w:p>
+            <w:r>
+              <w:rPr>
+                <w:rFonts w:ascii="Cambria" w:cs="Cambria" w:eastAsia="Cambria" w:hAnsi="Cambria"/>
+                <w:sz w:val="19"/>
+                <w:szCs w:val="19"/>
+              </w:rPr>
+              <w:t xml:space="preserve">Time-window validation, QR token generation</w:t>
+            </w:r>
+          </w:p>
+        </w:tc>
+        <w:tc>
+          <w:tcPr>
+            <w:tcW w:type="pct" w:w="1000"/>
+          </w:tcPr>
+          <w:p>
+            <w:r>
+              <w:rPr>
+                <w:rFonts w:ascii="Cambria" w:cs="Cambria" w:eastAsia="Cambria" w:hAnsi="Cambria"/>
+                <w:sz w:val="19"/>
+                <w:szCs w:val="19"/>
+              </w:rPr>
+              <w:t xml:space="preserve">Reservations and gate validation</w:t>
+            </w:r>
+          </w:p>
+        </w:tc>
+      </w:tr>
+      <w:tr>
+        <w:tc>
+          <w:tcPr>
+            <w:tcW w:type="pct" w:w="1000"/>
+          </w:tcPr>
+          <w:p>
+            <w:r>
+              <w:rPr>
+                <w:rFonts w:ascii="Cambria" w:cs="Cambria" w:eastAsia="Cambria" w:hAnsi="Cambria"/>
+                <w:sz w:val="19"/>
+                <w:szCs w:val="19"/>
+              </w:rPr>
+              <w:t xml:space="preserve">Application-generated data</w:t>
+            </w:r>
+          </w:p>
+        </w:tc>
+        <w:tc>
+          <w:tcPr>
+            <w:tcW w:type="pct" w:w="1000"/>
+          </w:tcPr>
+          <w:p>
+            <w:r>
+              <w:rPr>
+                <w:rFonts w:ascii="Cambria" w:cs="Cambria" w:eastAsia="Cambria" w:hAnsi="Cambria"/>
+                <w:sz w:val="19"/>
+                <w:szCs w:val="19"/>
+              </w:rPr>
+              <w:t xml:space="preserve">SecurityLogs &amp; Blacklists</w:t>
+            </w:r>
+          </w:p>
+        </w:tc>
+        <w:tc>
+          <w:tcPr>
+            <w:tcW w:type="pct" w:w="1000"/>
+          </w:tcPr>
+          <w:p>
+            <w:r>
+              <w:rPr>
+                <w:rFonts w:ascii="Cambria" w:cs="Cambria" w:eastAsia="Cambria" w:hAnsi="Cambria"/>
+                <w:sz w:val="19"/>
+                <w:szCs w:val="19"/>
+              </w:rPr>
+              <w:t xml:space="preserve">One record per gate scan / blocked vehicle</w:t>
+            </w:r>
+          </w:p>
+        </w:tc>
+        <w:tc>
+          <w:tcPr>
+            <w:tcW w:type="pct" w:w="1000"/>
+          </w:tcPr>
+          <w:p>
+            <w:r>
+              <w:rPr>
+                <w:rFonts w:ascii="Cambria" w:cs="Cambria" w:eastAsia="Cambria" w:hAnsi="Cambria"/>
+                <w:sz w:val="19"/>
+                <w:szCs w:val="19"/>
+              </w:rPr>
+              <w:t xml:space="preserve">Timestamp, gate mode tagging, uppercase vehicle numbers</w:t>
+            </w:r>
+          </w:p>
+        </w:tc>
+        <w:tc>
+          <w:tcPr>
+            <w:tcW w:type="pct" w:w="1000"/>
+          </w:tcPr>
+          <w:p>
+            <w:r>
+              <w:rPr>
+                <w:rFonts w:ascii="Cambria" w:cs="Cambria" w:eastAsia="Cambria" w:hAnsi="Cambria"/>
+                <w:sz w:val="19"/>
+                <w:szCs w:val="19"/>
+              </w:rPr>
+              <w:t xml:space="preserve">Audit and access control</w:t>
             </w:r>
           </w:p>
         </w:tc>
       </w:tr>
     </w:tbl>
+    <w:p>
+      <w:pPr>
+        <w:pStyle w:val="Heading2"/>
+        <w:spacing w:after="100" w:before="220"/>
+      </w:pPr>
+      <w:r>
+        <w:t xml:space="preserve">4.6 Constraints and Assumptions</w:t>
+      </w:r>
+      <w:r>
+        <w:rPr>
+          <w:rFonts w:ascii="Cambria" w:cs="Cambria" w:eastAsia="Cambria" w:hAnsi="Cambria"/>
+          <w:b/>
+          <w:bCs/>
+          <w:color w:val="1A252F"/>
+          <w:sz w:val="24"/>
+          <w:szCs w:val="24"/>
+        </w:rPr>
+        <w:t xml:space="preserve">4.6 Constraints and Assumptions</w:t>
+      </w:r>
+    </w:p>
+    <w:p>
+      <w:pPr>
+        <w:pStyle w:val="ListParagraph"/>
+        <w:numPr>
+          <w:ilvl w:val="0"/>
+          <w:numId w:val="1"/>
+        </w:numPr>
+        <w:spacing w:after="50" w:before="40" w:line="360"/>
+      </w:pPr>
+      <w:r>
+        <w:rPr>
+          <w:rFonts w:ascii="Cambria" w:cs="Cambria" w:eastAsia="Cambria" w:hAnsi="Cambria"/>
+          <w:b/>
+          <w:bCs/>
+          <w:sz w:val="24"/>
+          <w:szCs w:val="24"/>
+        </w:rPr>
+        <w:t xml:space="preserve">• Internet dependency: </w:t>
+      </w:r>
+      <w:r>
+        <w:rPr>
+          <w:rFonts w:ascii="Cambria" w:cs="Cambria" w:eastAsia="Cambria" w:hAnsi="Cambria"/>
+          <w:sz w:val="24"/>
+          <w:szCs w:val="24"/>
+        </w:rPr>
+        <w:t xml:space="preserve">Verification of dynamic QR tokens is performed against the cloud database and requires continuous connectivity.</w:t>
+      </w:r>
+    </w:p>
+    <w:p>
+      <w:pPr>
+        <w:pStyle w:val="ListParagraph"/>
+        <w:numPr>
+          <w:ilvl w:val="0"/>
+          <w:numId w:val="1"/>
+        </w:numPr>
+        <w:spacing w:after="50" w:before="40" w:line="360"/>
+      </w:pPr>
+      <w:r>
+        <w:rPr>
+          <w:rFonts w:ascii="Cambria" w:cs="Cambria" w:eastAsia="Cambria" w:hAnsi="Cambria"/>
+          <w:b/>
+          <w:bCs/>
+          <w:sz w:val="24"/>
+          <w:szCs w:val="24"/>
+        </w:rPr>
+        <w:t xml:space="preserve">• Browser camera access: </w:t>
+      </w:r>
+      <w:r>
+        <w:rPr>
+          <w:rFonts w:ascii="Cambria" w:cs="Cambria" w:eastAsia="Cambria" w:hAnsi="Cambria"/>
+          <w:sz w:val="24"/>
+          <w:szCs w:val="24"/>
+        </w:rPr>
+        <w:t xml:space="preserve">Camera streams require a modern browser and user permission (HTTPS or localhost).</w:t>
+      </w:r>
+    </w:p>
+    <w:p>
+      <w:pPr>
+        <w:pStyle w:val="ListParagraph"/>
+        <w:numPr>
+          <w:ilvl w:val="0"/>
+          <w:numId w:val="1"/>
+        </w:numPr>
+        <w:spacing w:after="50" w:before="40" w:line="360"/>
+      </w:pPr>
+      <w:r>
+        <w:rPr>
+          <w:rFonts w:ascii="Cambria" w:cs="Cambria" w:eastAsia="Cambria" w:hAnsi="Cambria"/>
+          <w:b/>
+          <w:bCs/>
+          <w:sz w:val="24"/>
+          <w:szCs w:val="24"/>
+        </w:rPr>
+        <w:t xml:space="preserve">• Simulated hardware / test-mode payment: </w:t>
+      </w:r>
+      <w:r>
+        <w:rPr>
+          <w:rFonts w:ascii="Cambria" w:cs="Cambria" w:eastAsia="Cambria" w:hAnsi="Cambria"/>
+          <w:sz w:val="24"/>
+          <w:szCs w:val="24"/>
+        </w:rPr>
+        <w:t xml:space="preserve">The boom barrier is simulated through software triggers and Razorpay payments run in test mode only.</w:t>
+      </w:r>
+    </w:p>
+    <w:p>
+      <w:pPr>
+        <w:pStyle w:val="ListParagraph"/>
+        <w:numPr>
+          <w:ilvl w:val="0"/>
+          <w:numId w:val="1"/>
+        </w:numPr>
+        <w:spacing w:after="50" w:before="40" w:line="360"/>
+      </w:pPr>
+      <w:r>
+        <w:rPr>
+          <w:rFonts w:ascii="Cambria" w:cs="Cambria" w:eastAsia="Cambria" w:hAnsi="Cambria"/>
+          <w:b/>
+          <w:bCs/>
+          <w:sz w:val="24"/>
+          <w:szCs w:val="24"/>
+        </w:rPr>
+        <w:t xml:space="preserve">• Assumption: </w:t>
+      </w:r>
+      <w:r>
+        <w:rPr>
+          <w:rFonts w:ascii="Cambria" w:cs="Cambria" w:eastAsia="Cambria" w:hAnsi="Cambria"/>
+          <w:sz w:val="24"/>
+          <w:szCs w:val="24"/>
+        </w:rPr>
+        <w:t xml:space="preserve">The phone clock and server clock differ by no more than ±15 minutes (validated via ±30 token steps drift window).</w:t>
+      </w:r>
+    </w:p>
+    <w:p>
+      <w:pPr>
+        <w:pStyle w:val="ListParagraph"/>
+        <w:numPr>
+          <w:ilvl w:val="0"/>
+          <w:numId w:val="1"/>
+        </w:numPr>
+        <w:spacing w:after="50" w:before="40" w:line="360"/>
+      </w:pPr>
+      <w:r>
+        <w:rPr>
+          <w:rFonts w:ascii="Cambria" w:cs="Cambria" w:eastAsia="Cambria" w:hAnsi="Cambria"/>
+          <w:b/>
+          <w:bCs/>
+          <w:sz w:val="24"/>
+          <w:szCs w:val="24"/>
+        </w:rPr>
+        <w:t xml:space="preserve">• Assumption: </w:t>
+      </w:r>
+      <w:r>
+        <w:rPr>
+          <w:rFonts w:ascii="Cambria" w:cs="Cambria" w:eastAsia="Cambria" w:hAnsi="Cambria"/>
+          <w:sz w:val="24"/>
+          <w:szCs w:val="24"/>
+        </w:rPr>
+        <w:t xml:space="preserve">The facility operates as a single parking location managed by one admin team.</w:t>
+      </w:r>
+    </w:p>
     <w:p>
       <w:pPr>
         <w:pageBreakBefore/>

</xml_diff>

<commit_message>
docs: add Table 7.3, 7.5, 9.3-9.9, and 10.4 into reports and list of tables
</commit_message>
<xml_diff>
--- a/ParkSmart_Final_Project_Report.docx
+++ b/ParkSmart_Final_Project_Report.docx
@@ -4966,6 +4966,53 @@
                 <w:sz w:val="19"/>
                 <w:szCs w:val="19"/>
               </w:rPr>
+              <w:t xml:space="preserve">Table 9.8</w:t>
+            </w:r>
+          </w:p>
+        </w:tc>
+        <w:tc>
+          <w:tcPr>
+            <w:tcW w:type="pct" w:w="3350"/>
+          </w:tcPr>
+          <w:p>
+            <w:r>
+              <w:rPr>
+                <w:rFonts w:ascii="Cambria" w:cs="Cambria" w:eastAsia="Cambria" w:hAnsi="Cambria"/>
+                <w:sz w:val="19"/>
+                <w:szCs w:val="19"/>
+              </w:rPr>
+              <w:t xml:space="preserve">Experimental Validation</w:t>
+            </w:r>
+          </w:p>
+        </w:tc>
+        <w:tc>
+          <w:tcPr>
+            <w:tcW w:type="pct" w:w="750"/>
+          </w:tcPr>
+          <w:p>
+            <w:r>
+              <w:rPr>
+                <w:rFonts w:ascii="Cambria" w:cs="Cambria" w:eastAsia="Cambria" w:hAnsi="Cambria"/>
+                <w:sz w:val="19"/>
+                <w:szCs w:val="19"/>
+              </w:rPr>
+              <w:t xml:space="preserve">59</w:t>
+            </w:r>
+          </w:p>
+        </w:tc>
+      </w:tr>
+      <w:tr>
+        <w:tc>
+          <w:tcPr>
+            <w:tcW w:type="pct" w:w="900"/>
+          </w:tcPr>
+          <w:p>
+            <w:r>
+              <w:rPr>
+                <w:rFonts w:ascii="Cambria" w:cs="Cambria" w:eastAsia="Cambria" w:hAnsi="Cambria"/>
+                <w:sz w:val="19"/>
+                <w:szCs w:val="19"/>
+              </w:rPr>
               <w:t xml:space="preserve">Table 9.9</w:t>
             </w:r>
           </w:p>
@@ -5091,6 +5138,53 @@
                 <w:szCs w:val="19"/>
               </w:rPr>
               <w:t xml:space="preserve">61</w:t>
+            </w:r>
+          </w:p>
+        </w:tc>
+      </w:tr>
+      <w:tr>
+        <w:tc>
+          <w:tcPr>
+            <w:tcW w:type="pct" w:w="900"/>
+          </w:tcPr>
+          <w:p>
+            <w:r>
+              <w:rPr>
+                <w:rFonts w:ascii="Cambria" w:cs="Cambria" w:eastAsia="Cambria" w:hAnsi="Cambria"/>
+                <w:sz w:val="19"/>
+                <w:szCs w:val="19"/>
+              </w:rPr>
+              <w:t xml:space="preserve">Table 10.4</w:t>
+            </w:r>
+          </w:p>
+        </w:tc>
+        <w:tc>
+          <w:tcPr>
+            <w:tcW w:type="pct" w:w="3350"/>
+          </w:tcPr>
+          <w:p>
+            <w:r>
+              <w:rPr>
+                <w:rFonts w:ascii="Cambria" w:cs="Cambria" w:eastAsia="Cambria" w:hAnsi="Cambria"/>
+                <w:sz w:val="19"/>
+                <w:szCs w:val="19"/>
+              </w:rPr>
+              <w:t xml:space="preserve">Comparative Results of Parking Systems</w:t>
+            </w:r>
+          </w:p>
+        </w:tc>
+        <w:tc>
+          <w:tcPr>
+            <w:tcW w:type="pct" w:w="750"/>
+          </w:tcPr>
+          <w:p>
+            <w:r>
+              <w:rPr>
+                <w:rFonts w:ascii="Cambria" w:cs="Cambria" w:eastAsia="Cambria" w:hAnsi="Cambria"/>
+                <w:sz w:val="19"/>
+                <w:szCs w:val="19"/>
+              </w:rPr>
+              <w:t xml:space="preserve">62</w:t>
             </w:r>
           </w:p>
         </w:tc>
@@ -16889,6 +16983,328 @@
         <w:spacing w:after="100" w:before="220"/>
       </w:pPr>
       <w:r>
+        <w:t xml:space="preserve">Table 7.3: Database / Storage</w:t>
+      </w:r>
+      <w:r>
+        <w:rPr>
+          <w:rFonts w:ascii="Cambria" w:cs="Cambria" w:eastAsia="Cambria" w:hAnsi="Cambria"/>
+          <w:b/>
+          <w:bCs/>
+          <w:color w:val="1A252F"/>
+          <w:sz w:val="24"/>
+          <w:szCs w:val="24"/>
+        </w:rPr>
+        <w:t xml:space="preserve">Table 7.3: Database / Storage</w:t>
+      </w:r>
+    </w:p>
+    <w:p>
+      <w:pPr>
+        <w:spacing w:after="80" w:before="160"/>
+      </w:pPr>
+      <w:r>
+        <w:rPr>
+          <w:rFonts w:ascii="Cambria" w:cs="Cambria" w:eastAsia="Cambria" w:hAnsi="Cambria"/>
+          <w:b/>
+          <w:bCs/>
+          <w:color w:val="003366"/>
+          <w:sz w:val="22"/>
+          <w:szCs w:val="22"/>
+        </w:rPr>
+        <w:t xml:space="preserve">Table 7.3: Database / Storage</w:t>
+      </w:r>
+    </w:p>
+    <w:tbl>
+      <w:tblPr>
+        <w:tblW w:type="pct" w:w="5000"/>
+        <w:tblBorders>
+          <w:top w:val="single" w:color="auto" w:sz="4"/>
+          <w:left w:val="single" w:color="auto" w:sz="4"/>
+          <w:bottom w:val="single" w:color="auto" w:sz="4"/>
+          <w:right w:val="single" w:color="auto" w:sz="4"/>
+          <w:insideH w:val="single" w:color="auto" w:sz="4"/>
+          <w:insideV w:val="single" w:color="auto" w:sz="4"/>
+        </w:tblBorders>
+      </w:tblPr>
+      <w:tblGrid>
+        <w:gridCol w:w="1986"/>
+        <w:gridCol w:w="1444"/>
+        <w:gridCol w:w="2527"/>
+        <w:gridCol w:w="3069"/>
+      </w:tblGrid>
+      <w:tr>
+        <w:trPr>
+          <w:tblHeader/>
+        </w:trPr>
+        <w:tc>
+          <w:tcPr>
+            <w:tcW w:type="pct" w:w="1100"/>
+            <w:shd w:fill="EAF2F8" w:val="clear"/>
+          </w:tcPr>
+          <w:p>
+            <w:r>
+              <w:rPr>
+                <w:rFonts w:ascii="Cambria" w:cs="Cambria" w:eastAsia="Cambria" w:hAnsi="Cambria"/>
+                <w:b/>
+                <w:bCs/>
+                <w:color w:val="003366"/>
+                <w:sz w:val="20"/>
+                <w:szCs w:val="20"/>
+              </w:rPr>
+              <w:t xml:space="preserve">Database / Storage</w:t>
+            </w:r>
+          </w:p>
+        </w:tc>
+        <w:tc>
+          <w:tcPr>
+            <w:tcW w:type="pct" w:w="800"/>
+            <w:shd w:fill="EAF2F8" w:val="clear"/>
+          </w:tcPr>
+          <w:p>
+            <w:r>
+              <w:rPr>
+                <w:rFonts w:ascii="Cambria" w:cs="Cambria" w:eastAsia="Cambria" w:hAnsi="Cambria"/>
+                <w:b/>
+                <w:bCs/>
+                <w:color w:val="003366"/>
+                <w:sz w:val="20"/>
+                <w:szCs w:val="20"/>
+              </w:rPr>
+              <w:t xml:space="preserve">Version</w:t>
+            </w:r>
+          </w:p>
+        </w:tc>
+        <w:tc>
+          <w:tcPr>
+            <w:tcW w:type="pct" w:w="1400"/>
+            <w:shd w:fill="EAF2F8" w:val="clear"/>
+          </w:tcPr>
+          <w:p>
+            <w:r>
+              <w:rPr>
+                <w:rFonts w:ascii="Cambria" w:cs="Cambria" w:eastAsia="Cambria" w:hAnsi="Cambria"/>
+                <w:b/>
+                <w:bCs/>
+                <w:color w:val="003366"/>
+                <w:sz w:val="20"/>
+                <w:szCs w:val="20"/>
+              </w:rPr>
+              <w:t xml:space="preserve">Purpose</w:t>
+            </w:r>
+          </w:p>
+        </w:tc>
+        <w:tc>
+          <w:tcPr>
+            <w:tcW w:type="pct" w:w="1700"/>
+            <w:shd w:fill="EAF2F8" w:val="clear"/>
+          </w:tcPr>
+          <w:p>
+            <w:r>
+              <w:rPr>
+                <w:rFonts w:ascii="Cambria" w:cs="Cambria" w:eastAsia="Cambria" w:hAnsi="Cambria"/>
+                <w:b/>
+                <w:bCs/>
+                <w:color w:val="003366"/>
+                <w:sz w:val="20"/>
+                <w:szCs w:val="20"/>
+              </w:rPr>
+              <w:t xml:space="preserve">Data Managed</w:t>
+            </w:r>
+          </w:p>
+        </w:tc>
+      </w:tr>
+      <w:tr>
+        <w:tc>
+          <w:tcPr>
+            <w:tcW w:type="pct" w:w="1100"/>
+          </w:tcPr>
+          <w:p>
+            <w:r>
+              <w:rPr>
+                <w:rFonts w:ascii="Cambria" w:cs="Cambria" w:eastAsia="Cambria" w:hAnsi="Cambria"/>
+                <w:sz w:val="19"/>
+                <w:szCs w:val="19"/>
+              </w:rPr>
+              <w:t xml:space="preserve">MongoDB Atlas</w:t>
+            </w:r>
+          </w:p>
+        </w:tc>
+        <w:tc>
+          <w:tcPr>
+            <w:tcW w:type="pct" w:w="800"/>
+          </w:tcPr>
+          <w:p>
+            <w:r>
+              <w:rPr>
+                <w:rFonts w:ascii="Cambria" w:cs="Cambria" w:eastAsia="Cambria" w:hAnsi="Cambria"/>
+                <w:sz w:val="19"/>
+                <w:szCs w:val="19"/>
+              </w:rPr>
+              <w:t xml:space="preserve">6.0+</w:t>
+            </w:r>
+          </w:p>
+        </w:tc>
+        <w:tc>
+          <w:tcPr>
+            <w:tcW w:type="pct" w:w="1400"/>
+          </w:tcPr>
+          <w:p>
+            <w:r>
+              <w:rPr>
+                <w:rFonts w:ascii="Cambria" w:cs="Cambria" w:eastAsia="Cambria" w:hAnsi="Cambria"/>
+                <w:sz w:val="19"/>
+                <w:szCs w:val="19"/>
+              </w:rPr>
+              <w:t xml:space="preserve">Cloud NoSQL database</w:t>
+            </w:r>
+          </w:p>
+        </w:tc>
+        <w:tc>
+          <w:tcPr>
+            <w:tcW w:type="pct" w:w="1700"/>
+          </w:tcPr>
+          <w:p>
+            <w:r>
+              <w:rPr>
+                <w:rFonts w:ascii="Cambria" w:cs="Cambria" w:eastAsia="Cambria" w:hAnsi="Cambria"/>
+                <w:sz w:val="19"/>
+                <w:szCs w:val="19"/>
+              </w:rPr>
+              <w:t xml:space="preserve">Users, Slots, Bookings, SecurityLogs, Blacklists with indexing and aggregation</w:t>
+            </w:r>
+          </w:p>
+        </w:tc>
+      </w:tr>
+      <w:tr>
+        <w:tc>
+          <w:tcPr>
+            <w:tcW w:type="pct" w:w="1100"/>
+          </w:tcPr>
+          <w:p>
+            <w:r>
+              <w:rPr>
+                <w:rFonts w:ascii="Cambria" w:cs="Cambria" w:eastAsia="Cambria" w:hAnsi="Cambria"/>
+                <w:sz w:val="19"/>
+                <w:szCs w:val="19"/>
+              </w:rPr>
+              <w:t xml:space="preserve">Mongoose ODM</w:t>
+            </w:r>
+          </w:p>
+        </w:tc>
+        <w:tc>
+          <w:tcPr>
+            <w:tcW w:type="pct" w:w="800"/>
+          </w:tcPr>
+          <w:p>
+            <w:r>
+              <w:rPr>
+                <w:rFonts w:ascii="Cambria" w:cs="Cambria" w:eastAsia="Cambria" w:hAnsi="Cambria"/>
+                <w:sz w:val="19"/>
+                <w:szCs w:val="19"/>
+              </w:rPr>
+              <w:t xml:space="preserve">Stable release</w:t>
+            </w:r>
+          </w:p>
+        </w:tc>
+        <w:tc>
+          <w:tcPr>
+            <w:tcW w:type="pct" w:w="1400"/>
+          </w:tcPr>
+          <w:p>
+            <w:r>
+              <w:rPr>
+                <w:rFonts w:ascii="Cambria" w:cs="Cambria" w:eastAsia="Cambria" w:hAnsi="Cambria"/>
+                <w:sz w:val="19"/>
+                <w:szCs w:val="19"/>
+              </w:rPr>
+              <w:t xml:space="preserve">Schema modelling layer</w:t>
+            </w:r>
+          </w:p>
+        </w:tc>
+        <w:tc>
+          <w:tcPr>
+            <w:tcW w:type="pct" w:w="1700"/>
+          </w:tcPr>
+          <w:p>
+            <w:r>
+              <w:rPr>
+                <w:rFonts w:ascii="Cambria" w:cs="Cambria" w:eastAsia="Cambria" w:hAnsi="Cambria"/>
+                <w:sz w:val="19"/>
+                <w:szCs w:val="19"/>
+              </w:rPr>
+              <w:t xml:space="preserve">Collection schemas and relationships</w:t>
+            </w:r>
+          </w:p>
+        </w:tc>
+      </w:tr>
+      <w:tr>
+        <w:tc>
+          <w:tcPr>
+            <w:tcW w:type="pct" w:w="1100"/>
+          </w:tcPr>
+          <w:p>
+            <w:r>
+              <w:rPr>
+                <w:rFonts w:ascii="Cambria" w:cs="Cambria" w:eastAsia="Cambria" w:hAnsi="Cambria"/>
+                <w:sz w:val="19"/>
+                <w:szCs w:val="19"/>
+              </w:rPr>
+              <w:t xml:space="preserve">Browser localStorage</w:t>
+            </w:r>
+          </w:p>
+        </w:tc>
+        <w:tc>
+          <w:tcPr>
+            <w:tcW w:type="pct" w:w="800"/>
+          </w:tcPr>
+          <w:p>
+            <w:r>
+              <w:rPr>
+                <w:rFonts w:ascii="Cambria" w:cs="Cambria" w:eastAsia="Cambria" w:hAnsi="Cambria"/>
+                <w:sz w:val="19"/>
+                <w:szCs w:val="19"/>
+              </w:rPr>
+              <w:t xml:space="preserve">Web standard</w:t>
+            </w:r>
+          </w:p>
+        </w:tc>
+        <w:tc>
+          <w:tcPr>
+            <w:tcW w:type="pct" w:w="1400"/>
+          </w:tcPr>
+          <w:p>
+            <w:r>
+              <w:rPr>
+                <w:rFonts w:ascii="Cambria" w:cs="Cambria" w:eastAsia="Cambria" w:hAnsi="Cambria"/>
+                <w:sz w:val="19"/>
+                <w:szCs w:val="19"/>
+              </w:rPr>
+              <w:t xml:space="preserve">Client-side session persistence</w:t>
+            </w:r>
+          </w:p>
+        </w:tc>
+        <w:tc>
+          <w:tcPr>
+            <w:tcW w:type="pct" w:w="1700"/>
+          </w:tcPr>
+          <w:p>
+            <w:r>
+              <w:rPr>
+                <w:rFonts w:ascii="Cambria" w:cs="Cambria" w:eastAsia="Cambria" w:hAnsi="Cambria"/>
+                <w:sz w:val="19"/>
+                <w:szCs w:val="19"/>
+              </w:rPr>
+              <w:t xml:space="preserve">Signed JWT token</w:t>
+            </w:r>
+          </w:p>
+        </w:tc>
+      </w:tr>
+    </w:tbl>
+    <w:p>
+      <w:pPr>
+        <w:pStyle w:val="Heading2"/>
+        <w:spacing w:after="100" w:before="220"/>
+      </w:pPr>
+      <w:r>
         <w:t xml:space="preserve">Table 7.4: Hardware / Cloud / Deployment Environment</w:t>
       </w:r>
       <w:r>
@@ -17386,6 +17802,404 @@
                 <w:szCs w:val="19"/>
               </w:rPr>
               <w:t xml:space="preserve">Validated</w:t>
+            </w:r>
+          </w:p>
+        </w:tc>
+      </w:tr>
+    </w:tbl>
+    <w:p>
+      <w:pPr>
+        <w:pStyle w:val="Heading2"/>
+        <w:spacing w:after="100" w:before="220"/>
+      </w:pPr>
+      <w:r>
+        <w:t xml:space="preserve">Table 7.5: Development Tools</w:t>
+      </w:r>
+      <w:r>
+        <w:rPr>
+          <w:rFonts w:ascii="Cambria" w:cs="Cambria" w:eastAsia="Cambria" w:hAnsi="Cambria"/>
+          <w:b/>
+          <w:bCs/>
+          <w:color w:val="1A252F"/>
+          <w:sz w:val="24"/>
+          <w:szCs w:val="24"/>
+        </w:rPr>
+        <w:t xml:space="preserve">Table 7.5: Development Tools</w:t>
+      </w:r>
+    </w:p>
+    <w:p>
+      <w:pPr>
+        <w:spacing w:after="80" w:before="160"/>
+      </w:pPr>
+      <w:r>
+        <w:rPr>
+          <w:rFonts w:ascii="Cambria" w:cs="Cambria" w:eastAsia="Cambria" w:hAnsi="Cambria"/>
+          <w:b/>
+          <w:bCs/>
+          <w:color w:val="003366"/>
+          <w:sz w:val="22"/>
+          <w:szCs w:val="22"/>
+        </w:rPr>
+        <w:t xml:space="preserve">Table 7.5: Development Tools</w:t>
+      </w:r>
+    </w:p>
+    <w:tbl>
+      <w:tblPr>
+        <w:tblW w:type="pct" w:w="5000"/>
+        <w:tblBorders>
+          <w:top w:val="single" w:color="auto" w:sz="4"/>
+          <w:left w:val="single" w:color="auto" w:sz="4"/>
+          <w:bottom w:val="single" w:color="auto" w:sz="4"/>
+          <w:right w:val="single" w:color="auto" w:sz="4"/>
+          <w:insideH w:val="single" w:color="auto" w:sz="4"/>
+          <w:insideV w:val="single" w:color="auto" w:sz="4"/>
+        </w:tblBorders>
+      </w:tblPr>
+      <w:tblGrid>
+        <w:gridCol w:w="2257"/>
+        <w:gridCol w:w="3159"/>
+        <w:gridCol w:w="3610"/>
+      </w:tblGrid>
+      <w:tr>
+        <w:trPr>
+          <w:tblHeader/>
+        </w:trPr>
+        <w:tc>
+          <w:tcPr>
+            <w:tcW w:type="pct" w:w="1250"/>
+            <w:shd w:fill="EAF2F8" w:val="clear"/>
+          </w:tcPr>
+          <w:p>
+            <w:r>
+              <w:rPr>
+                <w:rFonts w:ascii="Cambria" w:cs="Cambria" w:eastAsia="Cambria" w:hAnsi="Cambria"/>
+                <w:b/>
+                <w:bCs/>
+                <w:color w:val="003366"/>
+                <w:sz w:val="20"/>
+                <w:szCs w:val="20"/>
+              </w:rPr>
+              <w:t xml:space="preserve">Tool</w:t>
+            </w:r>
+          </w:p>
+        </w:tc>
+        <w:tc>
+          <w:tcPr>
+            <w:tcW w:type="pct" w:w="1750"/>
+            <w:shd w:fill="EAF2F8" w:val="clear"/>
+          </w:tcPr>
+          <w:p>
+            <w:r>
+              <w:rPr>
+                <w:rFonts w:ascii="Cambria" w:cs="Cambria" w:eastAsia="Cambria" w:hAnsi="Cambria"/>
+                <w:b/>
+                <w:bCs/>
+                <w:color w:val="003366"/>
+                <w:sz w:val="20"/>
+                <w:szCs w:val="20"/>
+              </w:rPr>
+              <w:t xml:space="preserve">Purpose</w:t>
+            </w:r>
+          </w:p>
+        </w:tc>
+        <w:tc>
+          <w:tcPr>
+            <w:tcW w:type="pct" w:w="2000"/>
+            <w:shd w:fill="EAF2F8" w:val="clear"/>
+          </w:tcPr>
+          <w:p>
+            <w:r>
+              <w:rPr>
+                <w:rFonts w:ascii="Cambria" w:cs="Cambria" w:eastAsia="Cambria" w:hAnsi="Cambria"/>
+                <w:b/>
+                <w:bCs/>
+                <w:color w:val="003366"/>
+                <w:sz w:val="20"/>
+                <w:szCs w:val="20"/>
+              </w:rPr>
+              <w:t xml:space="preserve">Usage</w:t>
+            </w:r>
+          </w:p>
+        </w:tc>
+      </w:tr>
+      <w:tr>
+        <w:tc>
+          <w:tcPr>
+            <w:tcW w:type="pct" w:w="1250"/>
+          </w:tcPr>
+          <w:p>
+            <w:r>
+              <w:rPr>
+                <w:rFonts w:ascii="Cambria" w:cs="Cambria" w:eastAsia="Cambria" w:hAnsi="Cambria"/>
+                <w:sz w:val="19"/>
+                <w:szCs w:val="19"/>
+              </w:rPr>
+              <w:t xml:space="preserve">VS Code</w:t>
+            </w:r>
+          </w:p>
+        </w:tc>
+        <w:tc>
+          <w:tcPr>
+            <w:tcW w:type="pct" w:w="1750"/>
+          </w:tcPr>
+          <w:p>
+            <w:r>
+              <w:rPr>
+                <w:rFonts w:ascii="Cambria" w:cs="Cambria" w:eastAsia="Cambria" w:hAnsi="Cambria"/>
+                <w:sz w:val="19"/>
+                <w:szCs w:val="19"/>
+              </w:rPr>
+              <w:t xml:space="preserve">Primary code editor</w:t>
+            </w:r>
+          </w:p>
+        </w:tc>
+        <w:tc>
+          <w:tcPr>
+            <w:tcW w:type="pct" w:w="2000"/>
+          </w:tcPr>
+          <w:p>
+            <w:r>
+              <w:rPr>
+                <w:rFonts w:ascii="Cambria" w:cs="Cambria" w:eastAsia="Cambria" w:hAnsi="Cambria"/>
+                <w:sz w:val="19"/>
+                <w:szCs w:val="19"/>
+              </w:rPr>
+              <w:t xml:space="preserve">Frontend and backend development</w:t>
+            </w:r>
+          </w:p>
+        </w:tc>
+      </w:tr>
+      <w:tr>
+        <w:tc>
+          <w:tcPr>
+            <w:tcW w:type="pct" w:w="1250"/>
+          </w:tcPr>
+          <w:p>
+            <w:r>
+              <w:rPr>
+                <w:rFonts w:ascii="Cambria" w:cs="Cambria" w:eastAsia="Cambria" w:hAnsi="Cambria"/>
+                <w:sz w:val="19"/>
+                <w:szCs w:val="19"/>
+              </w:rPr>
+              <w:t xml:space="preserve">Antigravity IDE</w:t>
+            </w:r>
+          </w:p>
+        </w:tc>
+        <w:tc>
+          <w:tcPr>
+            <w:tcW w:type="pct" w:w="1750"/>
+          </w:tcPr>
+          <w:p>
+            <w:r>
+              <w:rPr>
+                <w:rFonts w:ascii="Cambria" w:cs="Cambria" w:eastAsia="Cambria" w:hAnsi="Cambria"/>
+                <w:sz w:val="19"/>
+                <w:szCs w:val="19"/>
+              </w:rPr>
+              <w:t xml:space="preserve">AI-assisted IDE</w:t>
+            </w:r>
+          </w:p>
+        </w:tc>
+        <w:tc>
+          <w:tcPr>
+            <w:tcW w:type="pct" w:w="2000"/>
+          </w:tcPr>
+          <w:p>
+            <w:r>
+              <w:rPr>
+                <w:rFonts w:ascii="Cambria" w:cs="Cambria" w:eastAsia="Cambria" w:hAnsi="Cambria"/>
+                <w:sz w:val="19"/>
+                <w:szCs w:val="19"/>
+              </w:rPr>
+              <w:t xml:space="preserve">Code generation, refactoring and debugging support</w:t>
+            </w:r>
+          </w:p>
+        </w:tc>
+      </w:tr>
+      <w:tr>
+        <w:tc>
+          <w:tcPr>
+            <w:tcW w:type="pct" w:w="1250"/>
+          </w:tcPr>
+          <w:p>
+            <w:r>
+              <w:rPr>
+                <w:rFonts w:ascii="Cambria" w:cs="Cambria" w:eastAsia="Cambria" w:hAnsi="Cambria"/>
+                <w:sz w:val="19"/>
+                <w:szCs w:val="19"/>
+              </w:rPr>
+              <w:t xml:space="preserve">Postman</w:t>
+            </w:r>
+          </w:p>
+        </w:tc>
+        <w:tc>
+          <w:tcPr>
+            <w:tcW w:type="pct" w:w="1750"/>
+          </w:tcPr>
+          <w:p>
+            <w:r>
+              <w:rPr>
+                <w:rFonts w:ascii="Cambria" w:cs="Cambria" w:eastAsia="Cambria" w:hAnsi="Cambria"/>
+                <w:sz w:val="19"/>
+                <w:szCs w:val="19"/>
+              </w:rPr>
+              <w:t xml:space="preserve">API testing</w:t>
+            </w:r>
+          </w:p>
+        </w:tc>
+        <w:tc>
+          <w:tcPr>
+            <w:tcW w:type="pct" w:w="2000"/>
+          </w:tcPr>
+          <w:p>
+            <w:r>
+              <w:rPr>
+                <w:rFonts w:ascii="Cambria" w:cs="Cambria" w:eastAsia="Cambria" w:hAnsi="Cambria"/>
+                <w:sz w:val="19"/>
+                <w:szCs w:val="19"/>
+              </w:rPr>
+              <w:t xml:space="preserve">Testing REST endpoints and authentication</w:t>
+            </w:r>
+          </w:p>
+        </w:tc>
+      </w:tr>
+      <w:tr>
+        <w:tc>
+          <w:tcPr>
+            <w:tcW w:type="pct" w:w="1250"/>
+          </w:tcPr>
+          <w:p>
+            <w:r>
+              <w:rPr>
+                <w:rFonts w:ascii="Cambria" w:cs="Cambria" w:eastAsia="Cambria" w:hAnsi="Cambria"/>
+                <w:sz w:val="19"/>
+                <w:szCs w:val="19"/>
+              </w:rPr>
+              <w:t xml:space="preserve">Git &amp; GitHub</w:t>
+            </w:r>
+          </w:p>
+        </w:tc>
+        <w:tc>
+          <w:tcPr>
+            <w:tcW w:type="pct" w:w="1750"/>
+          </w:tcPr>
+          <w:p>
+            <w:r>
+              <w:rPr>
+                <w:rFonts w:ascii="Cambria" w:cs="Cambria" w:eastAsia="Cambria" w:hAnsi="Cambria"/>
+                <w:sz w:val="19"/>
+                <w:szCs w:val="19"/>
+              </w:rPr>
+              <w:t xml:space="preserve">Version control</w:t>
+            </w:r>
+          </w:p>
+        </w:tc>
+        <w:tc>
+          <w:tcPr>
+            <w:tcW w:type="pct" w:w="2000"/>
+          </w:tcPr>
+          <w:p>
+            <w:r>
+              <w:rPr>
+                <w:rFonts w:ascii="Cambria" w:cs="Cambria" w:eastAsia="Cambria" w:hAnsi="Cambria"/>
+                <w:sz w:val="19"/>
+                <w:szCs w:val="19"/>
+              </w:rPr>
+              <w:t xml:space="preserve">Repository myusikanani/smart-parking, branch main</w:t>
+            </w:r>
+          </w:p>
+        </w:tc>
+      </w:tr>
+      <w:tr>
+        <w:tc>
+          <w:tcPr>
+            <w:tcW w:type="pct" w:w="1250"/>
+          </w:tcPr>
+          <w:p>
+            <w:r>
+              <w:rPr>
+                <w:rFonts w:ascii="Cambria" w:cs="Cambria" w:eastAsia="Cambria" w:hAnsi="Cambria"/>
+                <w:sz w:val="19"/>
+                <w:szCs w:val="19"/>
+              </w:rPr>
+              <w:t xml:space="preserve">npm</w:t>
+            </w:r>
+          </w:p>
+        </w:tc>
+        <w:tc>
+          <w:tcPr>
+            <w:tcW w:type="pct" w:w="1750"/>
+          </w:tcPr>
+          <w:p>
+            <w:r>
+              <w:rPr>
+                <w:rFonts w:ascii="Cambria" w:cs="Cambria" w:eastAsia="Cambria" w:hAnsi="Cambria"/>
+                <w:sz w:val="19"/>
+                <w:szCs w:val="19"/>
+              </w:rPr>
+              <w:t xml:space="preserve">Package management</w:t>
+            </w:r>
+          </w:p>
+        </w:tc>
+        <w:tc>
+          <w:tcPr>
+            <w:tcW w:type="pct" w:w="2000"/>
+          </w:tcPr>
+          <w:p>
+            <w:r>
+              <w:rPr>
+                <w:rFonts w:ascii="Cambria" w:cs="Cambria" w:eastAsia="Cambria" w:hAnsi="Cambria"/>
+                <w:sz w:val="19"/>
+                <w:szCs w:val="19"/>
+              </w:rPr>
+              <w:t xml:space="preserve">Dependency installation and scripts</w:t>
+            </w:r>
+          </w:p>
+        </w:tc>
+      </w:tr>
+      <w:tr>
+        <w:tc>
+          <w:tcPr>
+            <w:tcW w:type="pct" w:w="1250"/>
+          </w:tcPr>
+          <w:p>
+            <w:r>
+              <w:rPr>
+                <w:rFonts w:ascii="Cambria" w:cs="Cambria" w:eastAsia="Cambria" w:hAnsi="Cambria"/>
+                <w:sz w:val="19"/>
+                <w:szCs w:val="19"/>
+              </w:rPr>
+              <w:t xml:space="preserve">Vite</w:t>
+            </w:r>
+          </w:p>
+        </w:tc>
+        <w:tc>
+          <w:tcPr>
+            <w:tcW w:type="pct" w:w="1750"/>
+          </w:tcPr>
+          <w:p>
+            <w:r>
+              <w:rPr>
+                <w:rFonts w:ascii="Cambria" w:cs="Cambria" w:eastAsia="Cambria" w:hAnsi="Cambria"/>
+                <w:sz w:val="19"/>
+                <w:szCs w:val="19"/>
+              </w:rPr>
+              <w:t xml:space="preserve">Build tool</w:t>
+            </w:r>
+          </w:p>
+        </w:tc>
+        <w:tc>
+          <w:tcPr>
+            <w:tcW w:type="pct" w:w="2000"/>
+          </w:tcPr>
+          <w:p>
+            <w:r>
+              <w:rPr>
+                <w:rFonts w:ascii="Cambria" w:cs="Cambria" w:eastAsia="Cambria" w:hAnsi="Cambria"/>
+                <w:sz w:val="19"/>
+                <w:szCs w:val="19"/>
+              </w:rPr>
+              <w:t xml:space="preserve">Development server and production bundle</w:t>
             </w:r>
           </w:p>
         </w:tc>
@@ -22190,7 +23004,7 @@
         <w:spacing w:after="100" w:before="220"/>
       </w:pPr>
       <w:r>
-        <w:t xml:space="preserve">Table 9.7: User / Acceptance Testing (UAT Evaluators with Real Names)</w:t>
+        <w:t xml:space="preserve">Table 9.5: System Testing</w:t>
       </w:r>
       <w:r>
         <w:rPr>
@@ -22201,7 +23015,1397 @@
           <w:sz w:val="24"/>
           <w:szCs w:val="24"/>
         </w:rPr>
-        <w:t xml:space="preserve">Table 9.7: User / Acceptance Testing (UAT Evaluators with Real Names)</w:t>
+        <w:t xml:space="preserve">Table 9.5: System Testing</w:t>
+      </w:r>
+    </w:p>
+    <w:p>
+      <w:pPr>
+        <w:spacing w:after="80" w:before="160"/>
+      </w:pPr>
+      <w:r>
+        <w:rPr>
+          <w:rFonts w:ascii="Cambria" w:cs="Cambria" w:eastAsia="Cambria" w:hAnsi="Cambria"/>
+          <w:b/>
+          <w:bCs/>
+          <w:color w:val="003366"/>
+          <w:sz w:val="22"/>
+          <w:szCs w:val="22"/>
+        </w:rPr>
+        <w:t xml:space="preserve">Table 9.5: System Testing</w:t>
+      </w:r>
+    </w:p>
+    <w:tbl>
+      <w:tblPr>
+        <w:tblW w:type="pct" w:w="5000"/>
+        <w:tblBorders>
+          <w:top w:val="single" w:color="auto" w:sz="4"/>
+          <w:left w:val="single" w:color="auto" w:sz="4"/>
+          <w:bottom w:val="single" w:color="auto" w:sz="4"/>
+          <w:right w:val="single" w:color="auto" w:sz="4"/>
+          <w:insideH w:val="single" w:color="auto" w:sz="4"/>
+          <w:insideV w:val="single" w:color="auto" w:sz="4"/>
+        </w:tblBorders>
+      </w:tblPr>
+      <w:tblGrid>
+        <w:gridCol w:w="903"/>
+        <w:gridCol w:w="3430"/>
+        <w:gridCol w:w="3069"/>
+        <w:gridCol w:w="903"/>
+        <w:gridCol w:w="722"/>
+      </w:tblGrid>
+      <w:tr>
+        <w:trPr>
+          <w:tblHeader/>
+        </w:trPr>
+        <w:tc>
+          <w:tcPr>
+            <w:tcW w:type="pct" w:w="500"/>
+            <w:shd w:fill="EAF2F8" w:val="clear"/>
+          </w:tcPr>
+          <w:p>
+            <w:r>
+              <w:rPr>
+                <w:rFonts w:ascii="Cambria" w:cs="Cambria" w:eastAsia="Cambria" w:hAnsi="Cambria"/>
+                <w:b/>
+                <w:bCs/>
+                <w:color w:val="003366"/>
+                <w:sz w:val="20"/>
+                <w:szCs w:val="20"/>
+              </w:rPr>
+              <w:t xml:space="preserve">Test ID</w:t>
+            </w:r>
+          </w:p>
+        </w:tc>
+        <w:tc>
+          <w:tcPr>
+            <w:tcW w:type="pct" w:w="1900"/>
+            <w:shd w:fill="EAF2F8" w:val="clear"/>
+          </w:tcPr>
+          <w:p>
+            <w:r>
+              <w:rPr>
+                <w:rFonts w:ascii="Cambria" w:cs="Cambria" w:eastAsia="Cambria" w:hAnsi="Cambria"/>
+                <w:b/>
+                <w:bCs/>
+                <w:color w:val="003366"/>
+                <w:sz w:val="20"/>
+                <w:szCs w:val="20"/>
+              </w:rPr>
+              <w:t xml:space="preserve">Scenario</w:t>
+            </w:r>
+          </w:p>
+        </w:tc>
+        <w:tc>
+          <w:tcPr>
+            <w:tcW w:type="pct" w:w="1700"/>
+            <w:shd w:fill="EAF2F8" w:val="clear"/>
+          </w:tcPr>
+          <w:p>
+            <w:r>
+              <w:rPr>
+                <w:rFonts w:ascii="Cambria" w:cs="Cambria" w:eastAsia="Cambria" w:hAnsi="Cambria"/>
+                <w:b/>
+                <w:bCs/>
+                <w:color w:val="003366"/>
+                <w:sz w:val="20"/>
+                <w:szCs w:val="20"/>
+              </w:rPr>
+              <w:t xml:space="preserve">Expected</w:t>
+            </w:r>
+          </w:p>
+        </w:tc>
+        <w:tc>
+          <w:tcPr>
+            <w:tcW w:type="pct" w:w="500"/>
+            <w:shd w:fill="EAF2F8" w:val="clear"/>
+          </w:tcPr>
+          <w:p>
+            <w:r>
+              <w:rPr>
+                <w:rFonts w:ascii="Cambria" w:cs="Cambria" w:eastAsia="Cambria" w:hAnsi="Cambria"/>
+                <w:b/>
+                <w:bCs/>
+                <w:color w:val="003366"/>
+                <w:sz w:val="20"/>
+                <w:szCs w:val="20"/>
+              </w:rPr>
+              <w:t xml:space="preserve">Actual</w:t>
+            </w:r>
+          </w:p>
+        </w:tc>
+        <w:tc>
+          <w:tcPr>
+            <w:tcW w:type="pct" w:w="400"/>
+            <w:shd w:fill="EAF2F8" w:val="clear"/>
+          </w:tcPr>
+          <w:p>
+            <w:r>
+              <w:rPr>
+                <w:rFonts w:ascii="Cambria" w:cs="Cambria" w:eastAsia="Cambria" w:hAnsi="Cambria"/>
+                <w:b/>
+                <w:bCs/>
+                <w:color w:val="003366"/>
+                <w:sz w:val="20"/>
+                <w:szCs w:val="20"/>
+              </w:rPr>
+              <w:t xml:space="preserve">Status</w:t>
+            </w:r>
+          </w:p>
+        </w:tc>
+      </w:tr>
+      <w:tr>
+        <w:tc>
+          <w:tcPr>
+            <w:tcW w:type="pct" w:w="500"/>
+          </w:tcPr>
+          <w:p>
+            <w:r>
+              <w:rPr>
+                <w:rFonts w:ascii="Cambria" w:cs="Cambria" w:eastAsia="Cambria" w:hAnsi="Cambria"/>
+                <w:sz w:val="19"/>
+                <w:szCs w:val="19"/>
+              </w:rPr>
+              <w:t xml:space="preserve">ST-01</w:t>
+            </w:r>
+          </w:p>
+        </w:tc>
+        <w:tc>
+          <w:tcPr>
+            <w:tcW w:type="pct" w:w="1900"/>
+          </w:tcPr>
+          <w:p>
+            <w:r>
+              <w:rPr>
+                <w:rFonts w:ascii="Cambria" w:cs="Cambria" w:eastAsia="Cambria" w:hAnsi="Cambria"/>
+                <w:sz w:val="19"/>
+                <w:szCs w:val="19"/>
+              </w:rPr>
+              <w:t xml:space="preserve">End-to-end: register → book → enter → exit</w:t>
+            </w:r>
+          </w:p>
+        </w:tc>
+        <w:tc>
+          <w:tcPr>
+            <w:tcW w:type="pct" w:w="1700"/>
+          </w:tcPr>
+          <w:p>
+            <w:r>
+              <w:rPr>
+                <w:rFonts w:ascii="Cambria" w:cs="Cambria" w:eastAsia="Cambria" w:hAnsi="Cambria"/>
+                <w:sz w:val="19"/>
+                <w:szCs w:val="19"/>
+              </w:rPr>
+              <w:t xml:space="preserve">Full cycle completes with correct fee</w:t>
+            </w:r>
+          </w:p>
+        </w:tc>
+        <w:tc>
+          <w:tcPr>
+            <w:tcW w:type="pct" w:w="500"/>
+          </w:tcPr>
+          <w:p>
+            <w:r>
+              <w:rPr>
+                <w:rFonts w:ascii="Cambria" w:cs="Cambria" w:eastAsia="Cambria" w:hAnsi="Cambria"/>
+                <w:sz w:val="19"/>
+                <w:szCs w:val="19"/>
+              </w:rPr>
+              <w:t xml:space="preserve">As expected</w:t>
+            </w:r>
+          </w:p>
+        </w:tc>
+        <w:tc>
+          <w:tcPr>
+            <w:tcW w:type="pct" w:w="400"/>
+          </w:tcPr>
+          <w:p>
+            <w:r>
+              <w:rPr>
+                <w:rFonts w:ascii="Cambria" w:cs="Cambria" w:eastAsia="Cambria" w:hAnsi="Cambria"/>
+                <w:sz w:val="19"/>
+                <w:szCs w:val="19"/>
+              </w:rPr>
+              <w:t xml:space="preserve">Pass</w:t>
+            </w:r>
+          </w:p>
+        </w:tc>
+      </w:tr>
+      <w:tr>
+        <w:tc>
+          <w:tcPr>
+            <w:tcW w:type="pct" w:w="500"/>
+          </w:tcPr>
+          <w:p>
+            <w:r>
+              <w:rPr>
+                <w:rFonts w:ascii="Cambria" w:cs="Cambria" w:eastAsia="Cambria" w:hAnsi="Cambria"/>
+                <w:sz w:val="19"/>
+                <w:szCs w:val="19"/>
+              </w:rPr>
+              <w:t xml:space="preserve">ST-02</w:t>
+            </w:r>
+          </w:p>
+        </w:tc>
+        <w:tc>
+          <w:tcPr>
+            <w:tcW w:type="pct" w:w="1900"/>
+          </w:tcPr>
+          <w:p>
+            <w:r>
+              <w:rPr>
+                <w:rFonts w:ascii="Cambria" w:cs="Cambria" w:eastAsia="Cambria" w:hAnsi="Cambria"/>
+                <w:sz w:val="19"/>
+                <w:szCs w:val="19"/>
+              </w:rPr>
+              <w:t xml:space="preserve">Mobile browser rear camera scan (Android Chrome, iOS Safari)</w:t>
+            </w:r>
+          </w:p>
+        </w:tc>
+        <w:tc>
+          <w:tcPr>
+            <w:tcW w:type="pct" w:w="1700"/>
+          </w:tcPr>
+          <w:p>
+            <w:r>
+              <w:rPr>
+                <w:rFonts w:ascii="Cambria" w:cs="Cambria" w:eastAsia="Cambria" w:hAnsi="Cambria"/>
+                <w:sz w:val="19"/>
+                <w:szCs w:val="19"/>
+              </w:rPr>
+              <w:t xml:space="preserve">Camera opens and scans pass</w:t>
+            </w:r>
+          </w:p>
+        </w:tc>
+        <w:tc>
+          <w:tcPr>
+            <w:tcW w:type="pct" w:w="500"/>
+          </w:tcPr>
+          <w:p>
+            <w:r>
+              <w:rPr>
+                <w:rFonts w:ascii="Cambria" w:cs="Cambria" w:eastAsia="Cambria" w:hAnsi="Cambria"/>
+                <w:sz w:val="19"/>
+                <w:szCs w:val="19"/>
+              </w:rPr>
+              <w:t xml:space="preserve">As expected</w:t>
+            </w:r>
+          </w:p>
+        </w:tc>
+        <w:tc>
+          <w:tcPr>
+            <w:tcW w:type="pct" w:w="400"/>
+          </w:tcPr>
+          <w:p>
+            <w:r>
+              <w:rPr>
+                <w:rFonts w:ascii="Cambria" w:cs="Cambria" w:eastAsia="Cambria" w:hAnsi="Cambria"/>
+                <w:sz w:val="19"/>
+                <w:szCs w:val="19"/>
+              </w:rPr>
+              <w:t xml:space="preserve">Pass</w:t>
+            </w:r>
+          </w:p>
+        </w:tc>
+      </w:tr>
+      <w:tr>
+        <w:tc>
+          <w:tcPr>
+            <w:tcW w:type="pct" w:w="500"/>
+          </w:tcPr>
+          <w:p>
+            <w:r>
+              <w:rPr>
+                <w:rFonts w:ascii="Cambria" w:cs="Cambria" w:eastAsia="Cambria" w:hAnsi="Cambria"/>
+                <w:sz w:val="19"/>
+                <w:szCs w:val="19"/>
+              </w:rPr>
+              <w:t xml:space="preserve">ST-03</w:t>
+            </w:r>
+          </w:p>
+        </w:tc>
+        <w:tc>
+          <w:tcPr>
+            <w:tcW w:type="pct" w:w="1900"/>
+          </w:tcPr>
+          <w:p>
+            <w:r>
+              <w:rPr>
+                <w:rFonts w:ascii="Cambria" w:cs="Cambria" w:eastAsia="Cambria" w:hAnsi="Cambria"/>
+                <w:sz w:val="19"/>
+                <w:szCs w:val="19"/>
+              </w:rPr>
+              <w:t xml:space="preserve">Laptop webcam scan (no rear lens)</w:t>
+            </w:r>
+          </w:p>
+        </w:tc>
+        <w:tc>
+          <w:tcPr>
+            <w:tcW w:type="pct" w:w="1700"/>
+          </w:tcPr>
+          <w:p>
+            <w:r>
+              <w:rPr>
+                <w:rFonts w:ascii="Cambria" w:cs="Cambria" w:eastAsia="Cambria" w:hAnsi="Cambria"/>
+                <w:sz w:val="19"/>
+                <w:szCs w:val="19"/>
+              </w:rPr>
+              <w:t xml:space="preserve">Automatic fallback to webcam</w:t>
+            </w:r>
+          </w:p>
+        </w:tc>
+        <w:tc>
+          <w:tcPr>
+            <w:tcW w:type="pct" w:w="500"/>
+          </w:tcPr>
+          <w:p>
+            <w:r>
+              <w:rPr>
+                <w:rFonts w:ascii="Cambria" w:cs="Cambria" w:eastAsia="Cambria" w:hAnsi="Cambria"/>
+                <w:sz w:val="19"/>
+                <w:szCs w:val="19"/>
+              </w:rPr>
+              <w:t xml:space="preserve">As expected</w:t>
+            </w:r>
+          </w:p>
+        </w:tc>
+        <w:tc>
+          <w:tcPr>
+            <w:tcW w:type="pct" w:w="400"/>
+          </w:tcPr>
+          <w:p>
+            <w:r>
+              <w:rPr>
+                <w:rFonts w:ascii="Cambria" w:cs="Cambria" w:eastAsia="Cambria" w:hAnsi="Cambria"/>
+                <w:sz w:val="19"/>
+                <w:szCs w:val="19"/>
+              </w:rPr>
+              <w:t xml:space="preserve">Pass</w:t>
+            </w:r>
+          </w:p>
+        </w:tc>
+      </w:tr>
+      <w:tr>
+        <w:tc>
+          <w:tcPr>
+            <w:tcW w:type="pct" w:w="500"/>
+          </w:tcPr>
+          <w:p>
+            <w:r>
+              <w:rPr>
+                <w:rFonts w:ascii="Cambria" w:cs="Cambria" w:eastAsia="Cambria" w:hAnsi="Cambria"/>
+                <w:sz w:val="19"/>
+                <w:szCs w:val="19"/>
+              </w:rPr>
+              <w:t xml:space="preserve">ST-04</w:t>
+            </w:r>
+          </w:p>
+        </w:tc>
+        <w:tc>
+          <w:tcPr>
+            <w:tcW w:type="pct" w:w="1900"/>
+          </w:tcPr>
+          <w:p>
+            <w:r>
+              <w:rPr>
+                <w:rFonts w:ascii="Cambria" w:cs="Cambria" w:eastAsia="Cambria" w:hAnsi="Cambria"/>
+                <w:sz w:val="19"/>
+                <w:szCs w:val="19"/>
+              </w:rPr>
+              <w:t xml:space="preserve">Driver arrives after start time but before end time</w:t>
+            </w:r>
+          </w:p>
+        </w:tc>
+        <w:tc>
+          <w:tcPr>
+            <w:tcW w:type="pct" w:w="1700"/>
+          </w:tcPr>
+          <w:p>
+            <w:r>
+              <w:rPr>
+                <w:rFonts w:ascii="Cambria" w:cs="Cambria" w:eastAsia="Cambria" w:hAnsi="Cambria"/>
+                <w:sz w:val="19"/>
+                <w:szCs w:val="19"/>
+              </w:rPr>
+              <w:t xml:space="preserve">Entry allowed (validity until end time)</w:t>
+            </w:r>
+          </w:p>
+        </w:tc>
+        <w:tc>
+          <w:tcPr>
+            <w:tcW w:type="pct" w:w="500"/>
+          </w:tcPr>
+          <w:p>
+            <w:r>
+              <w:rPr>
+                <w:rFonts w:ascii="Cambria" w:cs="Cambria" w:eastAsia="Cambria" w:hAnsi="Cambria"/>
+                <w:sz w:val="19"/>
+                <w:szCs w:val="19"/>
+              </w:rPr>
+              <w:t xml:space="preserve">As expected</w:t>
+            </w:r>
+          </w:p>
+        </w:tc>
+        <w:tc>
+          <w:tcPr>
+            <w:tcW w:type="pct" w:w="400"/>
+          </w:tcPr>
+          <w:p>
+            <w:r>
+              <w:rPr>
+                <w:rFonts w:ascii="Cambria" w:cs="Cambria" w:eastAsia="Cambria" w:hAnsi="Cambria"/>
+                <w:sz w:val="19"/>
+                <w:szCs w:val="19"/>
+              </w:rPr>
+              <w:t xml:space="preserve">Pass</w:t>
+            </w:r>
+          </w:p>
+        </w:tc>
+      </w:tr>
+      <w:tr>
+        <w:tc>
+          <w:tcPr>
+            <w:tcW w:type="pct" w:w="500"/>
+          </w:tcPr>
+          <w:p>
+            <w:r>
+              <w:rPr>
+                <w:rFonts w:ascii="Cambria" w:cs="Cambria" w:eastAsia="Cambria" w:hAnsi="Cambria"/>
+                <w:sz w:val="19"/>
+                <w:szCs w:val="19"/>
+              </w:rPr>
+              <w:t xml:space="preserve">ST-05</w:t>
+            </w:r>
+          </w:p>
+        </w:tc>
+        <w:tc>
+          <w:tcPr>
+            <w:tcW w:type="pct" w:w="1900"/>
+          </w:tcPr>
+          <w:p>
+            <w:r>
+              <w:rPr>
+                <w:rFonts w:ascii="Cambria" w:cs="Cambria" w:eastAsia="Cambria" w:hAnsi="Cambria"/>
+                <w:sz w:val="19"/>
+                <w:szCs w:val="19"/>
+              </w:rPr>
+              <w:t xml:space="preserve">Continuous scanning of consecutive vehicles</w:t>
+            </w:r>
+          </w:p>
+        </w:tc>
+        <w:tc>
+          <w:tcPr>
+            <w:tcW w:type="pct" w:w="1700"/>
+          </w:tcPr>
+          <w:p>
+            <w:r>
+              <w:rPr>
+                <w:rFonts w:ascii="Cambria" w:cs="Cambria" w:eastAsia="Cambria" w:hAnsi="Cambria"/>
+                <w:sz w:val="19"/>
+                <w:szCs w:val="19"/>
+              </w:rPr>
+              <w:t xml:space="preserve">Camera stays open, no duplicate scans (2.5 s debounce)</w:t>
+            </w:r>
+          </w:p>
+        </w:tc>
+        <w:tc>
+          <w:tcPr>
+            <w:tcW w:type="pct" w:w="500"/>
+          </w:tcPr>
+          <w:p>
+            <w:r>
+              <w:rPr>
+                <w:rFonts w:ascii="Cambria" w:cs="Cambria" w:eastAsia="Cambria" w:hAnsi="Cambria"/>
+                <w:sz w:val="19"/>
+                <w:szCs w:val="19"/>
+              </w:rPr>
+              <w:t xml:space="preserve">As expected</w:t>
+            </w:r>
+          </w:p>
+        </w:tc>
+        <w:tc>
+          <w:tcPr>
+            <w:tcW w:type="pct" w:w="400"/>
+          </w:tcPr>
+          <w:p>
+            <w:r>
+              <w:rPr>
+                <w:rFonts w:ascii="Cambria" w:cs="Cambria" w:eastAsia="Cambria" w:hAnsi="Cambria"/>
+                <w:sz w:val="19"/>
+                <w:szCs w:val="19"/>
+              </w:rPr>
+              <w:t xml:space="preserve">Pass</w:t>
+            </w:r>
+          </w:p>
+        </w:tc>
+      </w:tr>
+      <w:tr>
+        <w:tc>
+          <w:tcPr>
+            <w:tcW w:type="pct" w:w="500"/>
+          </w:tcPr>
+          <w:p>
+            <w:r>
+              <w:rPr>
+                <w:rFonts w:ascii="Cambria" w:cs="Cambria" w:eastAsia="Cambria" w:hAnsi="Cambria"/>
+                <w:sz w:val="19"/>
+                <w:szCs w:val="19"/>
+              </w:rPr>
+              <w:t xml:space="preserve">ST-06</w:t>
+            </w:r>
+          </w:p>
+        </w:tc>
+        <w:tc>
+          <w:tcPr>
+            <w:tcW w:type="pct" w:w="1900"/>
+          </w:tcPr>
+          <w:p>
+            <w:r>
+              <w:rPr>
+                <w:rFonts w:ascii="Cambria" w:cs="Cambria" w:eastAsia="Cambria" w:hAnsi="Cambria"/>
+                <w:sz w:val="19"/>
+                <w:szCs w:val="19"/>
+              </w:rPr>
+              <w:t xml:space="preserve">Deployed site: register, book, pay, QR, entry, exit, admin reports</w:t>
+            </w:r>
+          </w:p>
+        </w:tc>
+        <w:tc>
+          <w:tcPr>
+            <w:tcW w:type="pct" w:w="1700"/>
+          </w:tcPr>
+          <w:p>
+            <w:r>
+              <w:rPr>
+                <w:rFonts w:ascii="Cambria" w:cs="Cambria" w:eastAsia="Cambria" w:hAnsi="Cambria"/>
+                <w:sz w:val="19"/>
+                <w:szCs w:val="19"/>
+              </w:rPr>
+              <w:t xml:space="preserve">Complete flow works on public link</w:t>
+            </w:r>
+          </w:p>
+        </w:tc>
+        <w:tc>
+          <w:tcPr>
+            <w:tcW w:type="pct" w:w="500"/>
+          </w:tcPr>
+          <w:p>
+            <w:r>
+              <w:rPr>
+                <w:rFonts w:ascii="Cambria" w:cs="Cambria" w:eastAsia="Cambria" w:hAnsi="Cambria"/>
+                <w:sz w:val="19"/>
+                <w:szCs w:val="19"/>
+              </w:rPr>
+              <w:t xml:space="preserve">As expected</w:t>
+            </w:r>
+          </w:p>
+        </w:tc>
+        <w:tc>
+          <w:tcPr>
+            <w:tcW w:type="pct" w:w="400"/>
+          </w:tcPr>
+          <w:p>
+            <w:r>
+              <w:rPr>
+                <w:rFonts w:ascii="Cambria" w:cs="Cambria" w:eastAsia="Cambria" w:hAnsi="Cambria"/>
+                <w:sz w:val="19"/>
+                <w:szCs w:val="19"/>
+              </w:rPr>
+              <w:t xml:space="preserve">Pass</w:t>
+            </w:r>
+          </w:p>
+        </w:tc>
+      </w:tr>
+      <w:tr>
+        <w:tc>
+          <w:tcPr>
+            <w:tcW w:type="pct" w:w="500"/>
+          </w:tcPr>
+          <w:p>
+            <w:r>
+              <w:rPr>
+                <w:rFonts w:ascii="Cambria" w:cs="Cambria" w:eastAsia="Cambria" w:hAnsi="Cambria"/>
+                <w:sz w:val="19"/>
+                <w:szCs w:val="19"/>
+              </w:rPr>
+              <w:t xml:space="preserve">ST-07</w:t>
+            </w:r>
+          </w:p>
+        </w:tc>
+        <w:tc>
+          <w:tcPr>
+            <w:tcW w:type="pct" w:w="1900"/>
+          </w:tcPr>
+          <w:p>
+            <w:r>
+              <w:rPr>
+                <w:rFonts w:ascii="Cambria" w:cs="Cambria" w:eastAsia="Cambria" w:hAnsi="Cambria"/>
+                <w:sz w:val="19"/>
+                <w:szCs w:val="19"/>
+              </w:rPr>
+              <w:t xml:space="preserve">QR scan on 3 different phones and browsers</w:t>
+            </w:r>
+          </w:p>
+        </w:tc>
+        <w:tc>
+          <w:tcPr>
+            <w:tcW w:type="pct" w:w="1700"/>
+          </w:tcPr>
+          <w:p>
+            <w:r>
+              <w:rPr>
+                <w:rFonts w:ascii="Cambria" w:cs="Cambria" w:eastAsia="Cambria" w:hAnsi="Cambria"/>
+                <w:sz w:val="19"/>
+                <w:szCs w:val="19"/>
+              </w:rPr>
+              <w:t xml:space="preserve">Valid QR read on first attempt</w:t>
+            </w:r>
+          </w:p>
+        </w:tc>
+        <w:tc>
+          <w:tcPr>
+            <w:tcW w:type="pct" w:w="500"/>
+          </w:tcPr>
+          <w:p>
+            <w:r>
+              <w:rPr>
+                <w:rFonts w:ascii="Cambria" w:cs="Cambria" w:eastAsia="Cambria" w:hAnsi="Cambria"/>
+                <w:sz w:val="19"/>
+                <w:szCs w:val="19"/>
+              </w:rPr>
+              <w:t xml:space="preserve">As expected</w:t>
+            </w:r>
+          </w:p>
+        </w:tc>
+        <w:tc>
+          <w:tcPr>
+            <w:tcW w:type="pct" w:w="400"/>
+          </w:tcPr>
+          <w:p>
+            <w:r>
+              <w:rPr>
+                <w:rFonts w:ascii="Cambria" w:cs="Cambria" w:eastAsia="Cambria" w:hAnsi="Cambria"/>
+                <w:sz w:val="19"/>
+                <w:szCs w:val="19"/>
+              </w:rPr>
+              <w:t xml:space="preserve">Pass</w:t>
+            </w:r>
+          </w:p>
+        </w:tc>
+      </w:tr>
+      <w:tr>
+        <w:tc>
+          <w:tcPr>
+            <w:tcW w:type="pct" w:w="500"/>
+          </w:tcPr>
+          <w:p>
+            <w:r>
+              <w:rPr>
+                <w:rFonts w:ascii="Cambria" w:cs="Cambria" w:eastAsia="Cambria" w:hAnsi="Cambria"/>
+                <w:sz w:val="19"/>
+                <w:szCs w:val="19"/>
+              </w:rPr>
+              <w:t xml:space="preserve">ST-08</w:t>
+            </w:r>
+          </w:p>
+        </w:tc>
+        <w:tc>
+          <w:tcPr>
+            <w:tcW w:type="pct" w:w="1900"/>
+          </w:tcPr>
+          <w:p>
+            <w:r>
+              <w:rPr>
+                <w:rFonts w:ascii="Cambria" w:cs="Cambria" w:eastAsia="Cambria" w:hAnsi="Cambria"/>
+                <w:sz w:val="19"/>
+                <w:szCs w:val="19"/>
+              </w:rPr>
+              <w:t xml:space="preserve">Socket.IO load test, 50 concurrent connections</w:t>
+            </w:r>
+          </w:p>
+        </w:tc>
+        <w:tc>
+          <w:tcPr>
+            <w:tcW w:type="pct" w:w="1700"/>
+          </w:tcPr>
+          <w:p>
+            <w:r>
+              <w:rPr>
+                <w:rFonts w:ascii="Cambria" w:cs="Cambria" w:eastAsia="Cambria" w:hAnsi="Cambria"/>
+                <w:sz w:val="19"/>
+                <w:szCs w:val="19"/>
+              </w:rPr>
+              <w:t xml:space="preserve">Live slot updates reach all screens within 1–2 s</w:t>
+            </w:r>
+          </w:p>
+        </w:tc>
+        <w:tc>
+          <w:tcPr>
+            <w:tcW w:type="pct" w:w="500"/>
+          </w:tcPr>
+          <w:p>
+            <w:r>
+              <w:rPr>
+                <w:rFonts w:ascii="Cambria" w:cs="Cambria" w:eastAsia="Cambria" w:hAnsi="Cambria"/>
+                <w:sz w:val="19"/>
+                <w:szCs w:val="19"/>
+              </w:rPr>
+              <w:t xml:space="preserve">No drops observed</w:t>
+            </w:r>
+          </w:p>
+        </w:tc>
+        <w:tc>
+          <w:tcPr>
+            <w:tcW w:type="pct" w:w="400"/>
+          </w:tcPr>
+          <w:p>
+            <w:r>
+              <w:rPr>
+                <w:rFonts w:ascii="Cambria" w:cs="Cambria" w:eastAsia="Cambria" w:hAnsi="Cambria"/>
+                <w:sz w:val="19"/>
+                <w:szCs w:val="19"/>
+              </w:rPr>
+              <w:t xml:space="preserve">Pass</w:t>
+            </w:r>
+          </w:p>
+        </w:tc>
+      </w:tr>
+    </w:tbl>
+    <w:p>
+      <w:pPr>
+        <w:pStyle w:val="Heading2"/>
+        <w:spacing w:after="100" w:before="220"/>
+      </w:pPr>
+      <w:r>
+        <w:t xml:space="preserve">Table 9.6: Performance Testing</w:t>
+      </w:r>
+      <w:r>
+        <w:rPr>
+          <w:rFonts w:ascii="Cambria" w:cs="Cambria" w:eastAsia="Cambria" w:hAnsi="Cambria"/>
+          <w:b/>
+          <w:bCs/>
+          <w:color w:val="1A252F"/>
+          <w:sz w:val="24"/>
+          <w:szCs w:val="24"/>
+        </w:rPr>
+        <w:t xml:space="preserve">Table 9.6: Performance Testing</w:t>
+      </w:r>
+    </w:p>
+    <w:p>
+      <w:pPr>
+        <w:spacing w:after="80" w:before="160"/>
+      </w:pPr>
+      <w:r>
+        <w:rPr>
+          <w:rFonts w:ascii="Cambria" w:cs="Cambria" w:eastAsia="Cambria" w:hAnsi="Cambria"/>
+          <w:b/>
+          <w:bCs/>
+          <w:color w:val="003366"/>
+          <w:sz w:val="22"/>
+          <w:szCs w:val="22"/>
+        </w:rPr>
+        <w:t xml:space="preserve">Table 9.6: Performance Testing</w:t>
+      </w:r>
+    </w:p>
+    <w:tbl>
+      <w:tblPr>
+        <w:tblW w:type="pct" w:w="5000"/>
+        <w:tblBorders>
+          <w:top w:val="single" w:color="auto" w:sz="4"/>
+          <w:left w:val="single" w:color="auto" w:sz="4"/>
+          <w:bottom w:val="single" w:color="auto" w:sz="4"/>
+          <w:right w:val="single" w:color="auto" w:sz="4"/>
+          <w:insideH w:val="single" w:color="auto" w:sz="4"/>
+          <w:insideV w:val="single" w:color="auto" w:sz="4"/>
+        </w:tblBorders>
+      </w:tblPr>
+      <w:tblGrid>
+        <w:gridCol w:w="2257"/>
+        <w:gridCol w:w="2257"/>
+        <w:gridCol w:w="1625"/>
+        <w:gridCol w:w="1986"/>
+        <w:gridCol w:w="903"/>
+      </w:tblGrid>
+      <w:tr>
+        <w:trPr>
+          <w:tblHeader/>
+        </w:trPr>
+        <w:tc>
+          <w:tcPr>
+            <w:tcW w:type="pct" w:w="1250"/>
+            <w:shd w:fill="EAF2F8" w:val="clear"/>
+          </w:tcPr>
+          <w:p>
+            <w:r>
+              <w:rPr>
+                <w:rFonts w:ascii="Cambria" w:cs="Cambria" w:eastAsia="Cambria" w:hAnsi="Cambria"/>
+                <w:b/>
+                <w:bCs/>
+                <w:color w:val="003366"/>
+                <w:sz w:val="20"/>
+                <w:szCs w:val="20"/>
+              </w:rPr>
+              <w:t xml:space="preserve">Parameter</w:t>
+            </w:r>
+          </w:p>
+        </w:tc>
+        <w:tc>
+          <w:tcPr>
+            <w:tcW w:type="pct" w:w="1250"/>
+            <w:shd w:fill="EAF2F8" w:val="clear"/>
+          </w:tcPr>
+          <w:p>
+            <w:r>
+              <w:rPr>
+                <w:rFonts w:ascii="Cambria" w:cs="Cambria" w:eastAsia="Cambria" w:hAnsi="Cambria"/>
+                <w:b/>
+                <w:bCs/>
+                <w:color w:val="003366"/>
+                <w:sz w:val="20"/>
+                <w:szCs w:val="20"/>
+              </w:rPr>
+              <w:t xml:space="preserve">Condition</w:t>
+            </w:r>
+          </w:p>
+        </w:tc>
+        <w:tc>
+          <w:tcPr>
+            <w:tcW w:type="pct" w:w="900"/>
+            <w:shd w:fill="EAF2F8" w:val="clear"/>
+          </w:tcPr>
+          <w:p>
+            <w:r>
+              <w:rPr>
+                <w:rFonts w:ascii="Cambria" w:cs="Cambria" w:eastAsia="Cambria" w:hAnsi="Cambria"/>
+                <w:b/>
+                <w:bCs/>
+                <w:color w:val="003366"/>
+                <w:sz w:val="20"/>
+                <w:szCs w:val="20"/>
+              </w:rPr>
+              <w:t xml:space="preserve">Target</w:t>
+            </w:r>
+          </w:p>
+        </w:tc>
+        <w:tc>
+          <w:tcPr>
+            <w:tcW w:type="pct" w:w="1100"/>
+            <w:shd w:fill="EAF2F8" w:val="clear"/>
+          </w:tcPr>
+          <w:p>
+            <w:r>
+              <w:rPr>
+                <w:rFonts w:ascii="Cambria" w:cs="Cambria" w:eastAsia="Cambria" w:hAnsi="Cambria"/>
+                <w:b/>
+                <w:bCs/>
+                <w:color w:val="003366"/>
+                <w:sz w:val="20"/>
+                <w:szCs w:val="20"/>
+              </w:rPr>
+              <w:t xml:space="preserve">Observed</w:t>
+            </w:r>
+          </w:p>
+        </w:tc>
+        <w:tc>
+          <w:tcPr>
+            <w:tcW w:type="pct" w:w="500"/>
+            <w:shd w:fill="EAF2F8" w:val="clear"/>
+          </w:tcPr>
+          <w:p>
+            <w:r>
+              <w:rPr>
+                <w:rFonts w:ascii="Cambria" w:cs="Cambria" w:eastAsia="Cambria" w:hAnsi="Cambria"/>
+                <w:b/>
+                <w:bCs/>
+                <w:color w:val="003366"/>
+                <w:sz w:val="20"/>
+                <w:szCs w:val="20"/>
+              </w:rPr>
+              <w:t xml:space="preserve">Status</w:t>
+            </w:r>
+          </w:p>
+        </w:tc>
+      </w:tr>
+      <w:tr>
+        <w:tc>
+          <w:tcPr>
+            <w:tcW w:type="pct" w:w="1250"/>
+          </w:tcPr>
+          <w:p>
+            <w:r>
+              <w:rPr>
+                <w:rFonts w:ascii="Cambria" w:cs="Cambria" w:eastAsia="Cambria" w:hAnsi="Cambria"/>
+                <w:sz w:val="19"/>
+                <w:szCs w:val="19"/>
+              </w:rPr>
+              <w:t xml:space="preserve">QR verification latency</w:t>
+            </w:r>
+          </w:p>
+        </w:tc>
+        <w:tc>
+          <w:tcPr>
+            <w:tcW w:type="pct" w:w="1250"/>
+          </w:tcPr>
+          <w:p>
+            <w:r>
+              <w:rPr>
+                <w:rFonts w:ascii="Cambria" w:cs="Cambria" w:eastAsia="Cambria" w:hAnsi="Cambria"/>
+                <w:sz w:val="19"/>
+                <w:szCs w:val="19"/>
+              </w:rPr>
+              <w:t xml:space="preserve">Normal load</w:t>
+            </w:r>
+          </w:p>
+        </w:tc>
+        <w:tc>
+          <w:tcPr>
+            <w:tcW w:type="pct" w:w="900"/>
+          </w:tcPr>
+          <w:p>
+            <w:r>
+              <w:rPr>
+                <w:rFonts w:ascii="Cambria" w:cs="Cambria" w:eastAsia="Cambria" w:hAnsi="Cambria"/>
+                <w:sz w:val="19"/>
+                <w:szCs w:val="19"/>
+              </w:rPr>
+              <w:t xml:space="preserve">&lt; 2 s</w:t>
+            </w:r>
+          </w:p>
+        </w:tc>
+        <w:tc>
+          <w:tcPr>
+            <w:tcW w:type="pct" w:w="1100"/>
+          </w:tcPr>
+          <w:p>
+            <w:r>
+              <w:rPr>
+                <w:rFonts w:ascii="Cambria" w:cs="Cambria" w:eastAsia="Cambria" w:hAnsi="Cambria"/>
+                <w:sz w:val="19"/>
+                <w:szCs w:val="19"/>
+              </w:rPr>
+              <w:t xml:space="preserve">1.2–1.5 s</w:t>
+            </w:r>
+          </w:p>
+        </w:tc>
+        <w:tc>
+          <w:tcPr>
+            <w:tcW w:type="pct" w:w="500"/>
+          </w:tcPr>
+          <w:p>
+            <w:r>
+              <w:rPr>
+                <w:rFonts w:ascii="Cambria" w:cs="Cambria" w:eastAsia="Cambria" w:hAnsi="Cambria"/>
+                <w:sz w:val="19"/>
+                <w:szCs w:val="19"/>
+              </w:rPr>
+              <w:t xml:space="preserve">Met</w:t>
+            </w:r>
+          </w:p>
+        </w:tc>
+      </w:tr>
+      <w:tr>
+        <w:tc>
+          <w:tcPr>
+            <w:tcW w:type="pct" w:w="1250"/>
+          </w:tcPr>
+          <w:p>
+            <w:r>
+              <w:rPr>
+                <w:rFonts w:ascii="Cambria" w:cs="Cambria" w:eastAsia="Cambria" w:hAnsi="Cambria"/>
+                <w:sz w:val="19"/>
+                <w:szCs w:val="19"/>
+              </w:rPr>
+              <w:t xml:space="preserve">API response (slot state query)</w:t>
+            </w:r>
+          </w:p>
+        </w:tc>
+        <w:tc>
+          <w:tcPr>
+            <w:tcW w:type="pct" w:w="1250"/>
+          </w:tcPr>
+          <w:p>
+            <w:r>
+              <w:rPr>
+                <w:rFonts w:ascii="Cambria" w:cs="Cambria" w:eastAsia="Cambria" w:hAnsi="Cambria"/>
+                <w:sz w:val="19"/>
+                <w:szCs w:val="19"/>
+              </w:rPr>
+              <w:t xml:space="preserve">Normal load</w:t>
+            </w:r>
+          </w:p>
+        </w:tc>
+        <w:tc>
+          <w:tcPr>
+            <w:tcW w:type="pct" w:w="900"/>
+          </w:tcPr>
+          <w:p>
+            <w:r>
+              <w:rPr>
+                <w:rFonts w:ascii="Cambria" w:cs="Cambria" w:eastAsia="Cambria" w:hAnsi="Cambria"/>
+                <w:sz w:val="19"/>
+                <w:szCs w:val="19"/>
+              </w:rPr>
+              <w:t xml:space="preserve">&lt; 200 ms</w:t>
+            </w:r>
+          </w:p>
+        </w:tc>
+        <w:tc>
+          <w:tcPr>
+            <w:tcW w:type="pct" w:w="1100"/>
+          </w:tcPr>
+          <w:p>
+            <w:r>
+              <w:rPr>
+                <w:rFonts w:ascii="Cambria" w:cs="Cambria" w:eastAsia="Cambria" w:hAnsi="Cambria"/>
+                <w:sz w:val="19"/>
+                <w:szCs w:val="19"/>
+              </w:rPr>
+              <w:t xml:space="preserve">&lt; 180 ms</w:t>
+            </w:r>
+          </w:p>
+        </w:tc>
+        <w:tc>
+          <w:tcPr>
+            <w:tcW w:type="pct" w:w="500"/>
+          </w:tcPr>
+          <w:p>
+            <w:r>
+              <w:rPr>
+                <w:rFonts w:ascii="Cambria" w:cs="Cambria" w:eastAsia="Cambria" w:hAnsi="Cambria"/>
+                <w:sz w:val="19"/>
+                <w:szCs w:val="19"/>
+              </w:rPr>
+              <w:t xml:space="preserve">Met</w:t>
+            </w:r>
+          </w:p>
+        </w:tc>
+      </w:tr>
+      <w:tr>
+        <w:tc>
+          <w:tcPr>
+            <w:tcW w:type="pct" w:w="1250"/>
+          </w:tcPr>
+          <w:p>
+            <w:r>
+              <w:rPr>
+                <w:rFonts w:ascii="Cambria" w:cs="Cambria" w:eastAsia="Cambria" w:hAnsi="Cambria"/>
+                <w:sz w:val="19"/>
+                <w:szCs w:val="19"/>
+              </w:rPr>
+              <w:t xml:space="preserve">Backend / API verification</w:t>
+            </w:r>
+          </w:p>
+        </w:tc>
+        <w:tc>
+          <w:tcPr>
+            <w:tcW w:type="pct" w:w="1250"/>
+          </w:tcPr>
+          <w:p>
+            <w:r>
+              <w:rPr>
+                <w:rFonts w:ascii="Cambria" w:cs="Cambria" w:eastAsia="Cambria" w:hAnsi="Cambria"/>
+                <w:sz w:val="19"/>
+                <w:szCs w:val="19"/>
+              </w:rPr>
+              <w:t xml:space="preserve">Automated checks</w:t>
+            </w:r>
+          </w:p>
+        </w:tc>
+        <w:tc>
+          <w:tcPr>
+            <w:tcW w:type="pct" w:w="900"/>
+          </w:tcPr>
+          <w:p>
+            <w:r>
+              <w:rPr>
+                <w:rFonts w:ascii="Cambria" w:cs="Cambria" w:eastAsia="Cambria" w:hAnsi="Cambria"/>
+                <w:sz w:val="19"/>
+                <w:szCs w:val="19"/>
+              </w:rPr>
+              <w:t xml:space="preserve">All major APIs work</w:t>
+            </w:r>
+          </w:p>
+        </w:tc>
+        <w:tc>
+          <w:tcPr>
+            <w:tcW w:type="pct" w:w="1100"/>
+          </w:tcPr>
+          <w:p>
+            <w:r>
+              <w:rPr>
+                <w:rFonts w:ascii="Cambria" w:cs="Cambria" w:eastAsia="Cambria" w:hAnsi="Cambria"/>
+                <w:sz w:val="19"/>
+                <w:szCs w:val="19"/>
+              </w:rPr>
+              <w:t xml:space="preserve">79/79 checks passed</w:t>
+            </w:r>
+          </w:p>
+        </w:tc>
+        <w:tc>
+          <w:tcPr>
+            <w:tcW w:type="pct" w:w="500"/>
+          </w:tcPr>
+          <w:p>
+            <w:r>
+              <w:rPr>
+                <w:rFonts w:ascii="Cambria" w:cs="Cambria" w:eastAsia="Cambria" w:hAnsi="Cambria"/>
+                <w:sz w:val="19"/>
+                <w:szCs w:val="19"/>
+              </w:rPr>
+              <w:t xml:space="preserve">Met</w:t>
+            </w:r>
+          </w:p>
+        </w:tc>
+      </w:tr>
+      <w:tr>
+        <w:tc>
+          <w:tcPr>
+            <w:tcW w:type="pct" w:w="1250"/>
+          </w:tcPr>
+          <w:p>
+            <w:r>
+              <w:rPr>
+                <w:rFonts w:ascii="Cambria" w:cs="Cambria" w:eastAsia="Cambria" w:hAnsi="Cambria"/>
+                <w:sz w:val="19"/>
+                <w:szCs w:val="19"/>
+              </w:rPr>
+              <w:t xml:space="preserve">Responsive UI validation</w:t>
+            </w:r>
+          </w:p>
+        </w:tc>
+        <w:tc>
+          <w:tcPr>
+            <w:tcW w:type="pct" w:w="1250"/>
+          </w:tcPr>
+          <w:p>
+            <w:r>
+              <w:rPr>
+                <w:rFonts w:ascii="Cambria" w:cs="Cambria" w:eastAsia="Cambria" w:hAnsi="Cambria"/>
+                <w:sz w:val="19"/>
+                <w:szCs w:val="19"/>
+              </w:rPr>
+              <w:t xml:space="preserve">Screen-size combinations</w:t>
+            </w:r>
+          </w:p>
+        </w:tc>
+        <w:tc>
+          <w:tcPr>
+            <w:tcW w:type="pct" w:w="900"/>
+          </w:tcPr>
+          <w:p>
+            <w:r>
+              <w:rPr>
+                <w:rFonts w:ascii="Cambria" w:cs="Cambria" w:eastAsia="Cambria" w:hAnsi="Cambria"/>
+                <w:sz w:val="19"/>
+                <w:szCs w:val="19"/>
+              </w:rPr>
+              <w:t xml:space="preserve">Correct on supported sizes</w:t>
+            </w:r>
+          </w:p>
+        </w:tc>
+        <w:tc>
+          <w:tcPr>
+            <w:tcW w:type="pct" w:w="1100"/>
+          </w:tcPr>
+          <w:p>
+            <w:r>
+              <w:rPr>
+                <w:rFonts w:ascii="Cambria" w:cs="Cambria" w:eastAsia="Cambria" w:hAnsi="Cambria"/>
+                <w:sz w:val="19"/>
+                <w:szCs w:val="19"/>
+              </w:rPr>
+              <w:t xml:space="preserve">259/259 passed</w:t>
+            </w:r>
+          </w:p>
+        </w:tc>
+        <w:tc>
+          <w:tcPr>
+            <w:tcW w:type="pct" w:w="500"/>
+          </w:tcPr>
+          <w:p>
+            <w:r>
+              <w:rPr>
+                <w:rFonts w:ascii="Cambria" w:cs="Cambria" w:eastAsia="Cambria" w:hAnsi="Cambria"/>
+                <w:sz w:val="19"/>
+                <w:szCs w:val="19"/>
+              </w:rPr>
+              <w:t xml:space="preserve">Met</w:t>
+            </w:r>
+          </w:p>
+        </w:tc>
+      </w:tr>
+      <w:tr>
+        <w:tc>
+          <w:tcPr>
+            <w:tcW w:type="pct" w:w="1250"/>
+          </w:tcPr>
+          <w:p>
+            <w:r>
+              <w:rPr>
+                <w:rFonts w:ascii="Cambria" w:cs="Cambria" w:eastAsia="Cambria" w:hAnsi="Cambria"/>
+                <w:sz w:val="19"/>
+                <w:szCs w:val="19"/>
+              </w:rPr>
+              <w:t xml:space="preserve">Real-time load test</w:t>
+            </w:r>
+          </w:p>
+        </w:tc>
+        <w:tc>
+          <w:tcPr>
+            <w:tcW w:type="pct" w:w="1250"/>
+          </w:tcPr>
+          <w:p>
+            <w:r>
+              <w:rPr>
+                <w:rFonts w:ascii="Cambria" w:cs="Cambria" w:eastAsia="Cambria" w:hAnsi="Cambria"/>
+                <w:sz w:val="19"/>
+                <w:szCs w:val="19"/>
+              </w:rPr>
+              <w:t xml:space="preserve">50 concurrent Socket.IO clients</w:t>
+            </w:r>
+          </w:p>
+        </w:tc>
+        <w:tc>
+          <w:tcPr>
+            <w:tcW w:type="pct" w:w="900"/>
+          </w:tcPr>
+          <w:p>
+            <w:r>
+              <w:rPr>
+                <w:rFonts w:ascii="Cambria" w:cs="Cambria" w:eastAsia="Cambria" w:hAnsi="Cambria"/>
+                <w:sz w:val="19"/>
+                <w:szCs w:val="19"/>
+              </w:rPr>
+              <w:t xml:space="preserve">No dropped updates</w:t>
+            </w:r>
+          </w:p>
+        </w:tc>
+        <w:tc>
+          <w:tcPr>
+            <w:tcW w:type="pct" w:w="1100"/>
+          </w:tcPr>
+          <w:p>
+            <w:r>
+              <w:rPr>
+                <w:rFonts w:ascii="Cambria" w:cs="Cambria" w:eastAsia="Cambria" w:hAnsi="Cambria"/>
+                <w:sz w:val="19"/>
+                <w:szCs w:val="19"/>
+              </w:rPr>
+              <w:t xml:space="preserve">0% packet loss, 1–2 s updates</w:t>
+            </w:r>
+          </w:p>
+        </w:tc>
+        <w:tc>
+          <w:tcPr>
+            <w:tcW w:type="pct" w:w="500"/>
+          </w:tcPr>
+          <w:p>
+            <w:r>
+              <w:rPr>
+                <w:rFonts w:ascii="Cambria" w:cs="Cambria" w:eastAsia="Cambria" w:hAnsi="Cambria"/>
+                <w:sz w:val="19"/>
+                <w:szCs w:val="19"/>
+              </w:rPr>
+              <w:t xml:space="preserve">Met</w:t>
+            </w:r>
+          </w:p>
+        </w:tc>
+      </w:tr>
+      <w:tr>
+        <w:tc>
+          <w:tcPr>
+            <w:tcW w:type="pct" w:w="1250"/>
+          </w:tcPr>
+          <w:p>
+            <w:r>
+              <w:rPr>
+                <w:rFonts w:ascii="Cambria" w:cs="Cambria" w:eastAsia="Cambria" w:hAnsi="Cambria"/>
+                <w:sz w:val="19"/>
+                <w:szCs w:val="19"/>
+              </w:rPr>
+              <w:t xml:space="preserve">Production build</w:t>
+            </w:r>
+          </w:p>
+        </w:tc>
+        <w:tc>
+          <w:tcPr>
+            <w:tcW w:type="pct" w:w="1250"/>
+          </w:tcPr>
+          <w:p>
+            <w:r>
+              <w:rPr>
+                <w:rFonts w:ascii="Cambria" w:cs="Cambria" w:eastAsia="Cambria" w:hAnsi="Cambria"/>
+                <w:sz w:val="19"/>
+                <w:szCs w:val="19"/>
+              </w:rPr>
+              <w:t xml:space="preserve">Vite build</w:t>
+            </w:r>
+          </w:p>
+        </w:tc>
+        <w:tc>
+          <w:tcPr>
+            <w:tcW w:type="pct" w:w="900"/>
+          </w:tcPr>
+          <w:p>
+            <w:r>
+              <w:rPr>
+                <w:rFonts w:ascii="Cambria" w:cs="Cambria" w:eastAsia="Cambria" w:hAnsi="Cambria"/>
+                <w:sz w:val="19"/>
+                <w:szCs w:val="19"/>
+              </w:rPr>
+              <w:t xml:space="preserve">0 errors</w:t>
+            </w:r>
+          </w:p>
+        </w:tc>
+        <w:tc>
+          <w:tcPr>
+            <w:tcW w:type="pct" w:w="1100"/>
+          </w:tcPr>
+          <w:p>
+            <w:r>
+              <w:rPr>
+                <w:rFonts w:ascii="Cambria" w:cs="Cambria" w:eastAsia="Cambria" w:hAnsi="Cambria"/>
+                <w:sz w:val="19"/>
+                <w:szCs w:val="19"/>
+              </w:rPr>
+              <w:t xml:space="preserve">0 TypeScript errors</w:t>
+            </w:r>
+          </w:p>
+        </w:tc>
+        <w:tc>
+          <w:tcPr>
+            <w:tcW w:type="pct" w:w="500"/>
+          </w:tcPr>
+          <w:p>
+            <w:r>
+              <w:rPr>
+                <w:rFonts w:ascii="Cambria" w:cs="Cambria" w:eastAsia="Cambria" w:hAnsi="Cambria"/>
+                <w:sz w:val="19"/>
+                <w:szCs w:val="19"/>
+              </w:rPr>
+              <w:t xml:space="preserve">Met</w:t>
+            </w:r>
+          </w:p>
+        </w:tc>
+      </w:tr>
+    </w:tbl>
+    <w:p>
+      <w:pPr>
+        <w:pStyle w:val="Heading2"/>
+        <w:spacing w:after="100" w:before="220"/>
+      </w:pPr>
+      <w:r>
+        <w:t xml:space="preserve">Table 9.7: User / Acceptance Testing</w:t>
+      </w:r>
+      <w:r>
+        <w:rPr>
+          <w:rFonts w:ascii="Cambria" w:cs="Cambria" w:eastAsia="Cambria" w:hAnsi="Cambria"/>
+          <w:b/>
+          <w:bCs/>
+          <w:color w:val="1A252F"/>
+          <w:sz w:val="24"/>
+          <w:szCs w:val="24"/>
+        </w:rPr>
+        <w:t xml:space="preserve">Table 9.7: User / Acceptance Testing</w:t>
       </w:r>
     </w:p>
     <w:p>
@@ -23182,6 +25386,390 @@
                 <w:szCs w:val="19"/>
               </w:rPr>
               <w:t xml:space="preserve">Passed - Professional</w:t>
+            </w:r>
+          </w:p>
+        </w:tc>
+      </w:tr>
+    </w:tbl>
+    <w:p>
+      <w:pPr>
+        <w:pStyle w:val="Heading2"/>
+        <w:spacing w:after="100" w:before="220"/>
+      </w:pPr>
+      <w:r>
+        <w:t xml:space="preserve">Table 9.8: Experimental Validation</w:t>
+      </w:r>
+      <w:r>
+        <w:rPr>
+          <w:rFonts w:ascii="Cambria" w:cs="Cambria" w:eastAsia="Cambria" w:hAnsi="Cambria"/>
+          <w:b/>
+          <w:bCs/>
+          <w:color w:val="1A252F"/>
+          <w:sz w:val="24"/>
+          <w:szCs w:val="24"/>
+        </w:rPr>
+        <w:t xml:space="preserve">Table 9.8: Experimental Validation</w:t>
+      </w:r>
+    </w:p>
+    <w:p>
+      <w:pPr>
+        <w:spacing w:after="80" w:before="160"/>
+      </w:pPr>
+      <w:r>
+        <w:rPr>
+          <w:rFonts w:ascii="Cambria" w:cs="Cambria" w:eastAsia="Cambria" w:hAnsi="Cambria"/>
+          <w:b/>
+          <w:bCs/>
+          <w:color w:val="003366"/>
+          <w:sz w:val="22"/>
+          <w:szCs w:val="22"/>
+        </w:rPr>
+        <w:t xml:space="preserve">Table 9.8: Experimental Validation</w:t>
+      </w:r>
+    </w:p>
+    <w:tbl>
+      <w:tblPr>
+        <w:tblW w:type="pct" w:w="5000"/>
+        <w:tblBorders>
+          <w:top w:val="single" w:color="auto" w:sz="4"/>
+          <w:left w:val="single" w:color="auto" w:sz="4"/>
+          <w:bottom w:val="single" w:color="auto" w:sz="4"/>
+          <w:right w:val="single" w:color="auto" w:sz="4"/>
+          <w:insideH w:val="single" w:color="auto" w:sz="4"/>
+          <w:insideV w:val="single" w:color="auto" w:sz="4"/>
+        </w:tblBorders>
+      </w:tblPr>
+      <w:tblGrid>
+        <w:gridCol w:w="1986"/>
+        <w:gridCol w:w="2347"/>
+        <w:gridCol w:w="2347"/>
+        <w:gridCol w:w="2347"/>
+      </w:tblGrid>
+      <w:tr>
+        <w:trPr>
+          <w:tblHeader/>
+        </w:trPr>
+        <w:tc>
+          <w:tcPr>
+            <w:tcW w:type="pct" w:w="1100"/>
+            <w:shd w:fill="EAF2F8" w:val="clear"/>
+          </w:tcPr>
+          <w:p>
+            <w:r>
+              <w:rPr>
+                <w:rFonts w:ascii="Cambria" w:cs="Cambria" w:eastAsia="Cambria" w:hAnsi="Cambria"/>
+                <w:b/>
+                <w:bCs/>
+                <w:color w:val="003366"/>
+                <w:sz w:val="20"/>
+                <w:szCs w:val="20"/>
+              </w:rPr>
+              <w:t xml:space="preserve">Experiment</w:t>
+            </w:r>
+          </w:p>
+        </w:tc>
+        <w:tc>
+          <w:tcPr>
+            <w:tcW w:type="pct" w:w="1300"/>
+            <w:shd w:fill="EAF2F8" w:val="clear"/>
+          </w:tcPr>
+          <w:p>
+            <w:r>
+              <w:rPr>
+                <w:rFonts w:ascii="Cambria" w:cs="Cambria" w:eastAsia="Cambria" w:hAnsi="Cambria"/>
+                <w:b/>
+                <w:bCs/>
+                <w:color w:val="003366"/>
+                <w:sz w:val="20"/>
+                <w:szCs w:val="20"/>
+              </w:rPr>
+              <w:t xml:space="preserve">Conditions</w:t>
+            </w:r>
+          </w:p>
+        </w:tc>
+        <w:tc>
+          <w:tcPr>
+            <w:tcW w:type="pct" w:w="1300"/>
+            <w:shd w:fill="EAF2F8" w:val="clear"/>
+          </w:tcPr>
+          <w:p>
+            <w:r>
+              <w:rPr>
+                <w:rFonts w:ascii="Cambria" w:cs="Cambria" w:eastAsia="Cambria" w:hAnsi="Cambria"/>
+                <w:b/>
+                <w:bCs/>
+                <w:color w:val="003366"/>
+                <w:sz w:val="20"/>
+                <w:szCs w:val="20"/>
+              </w:rPr>
+              <w:t xml:space="preserve">Result</w:t>
+            </w:r>
+          </w:p>
+        </w:tc>
+        <w:tc>
+          <w:tcPr>
+            <w:tcW w:type="pct" w:w="1300"/>
+            <w:shd w:fill="EAF2F8" w:val="clear"/>
+          </w:tcPr>
+          <w:p>
+            <w:r>
+              <w:rPr>
+                <w:rFonts w:ascii="Cambria" w:cs="Cambria" w:eastAsia="Cambria" w:hAnsi="Cambria"/>
+                <w:b/>
+                <w:bCs/>
+                <w:color w:val="003366"/>
+                <w:sz w:val="20"/>
+                <w:szCs w:val="20"/>
+              </w:rPr>
+              <w:t xml:space="preserve">Interpretation</w:t>
+            </w:r>
+          </w:p>
+        </w:tc>
+      </w:tr>
+      <w:tr>
+        <w:tc>
+          <w:tcPr>
+            <w:tcW w:type="pct" w:w="1100"/>
+          </w:tcPr>
+          <w:p>
+            <w:r>
+              <w:rPr>
+                <w:rFonts w:ascii="Cambria" w:cs="Cambria" w:eastAsia="Cambria" w:hAnsi="Cambria"/>
+                <w:sz w:val="19"/>
+                <w:szCs w:val="19"/>
+              </w:rPr>
+              <w:t xml:space="preserve">Clock skew tolerance</w:t>
+            </w:r>
+          </w:p>
+        </w:tc>
+        <w:tc>
+          <w:tcPr>
+            <w:tcW w:type="pct" w:w="1300"/>
+          </w:tcPr>
+          <w:p>
+            <w:r>
+              <w:rPr>
+                <w:rFonts w:ascii="Cambria" w:cs="Cambria" w:eastAsia="Cambria" w:hAnsi="Cambria"/>
+                <w:sz w:val="19"/>
+                <w:szCs w:val="19"/>
+              </w:rPr>
+              <w:t xml:space="preserve">Phone vs server time offsets</w:t>
+            </w:r>
+          </w:p>
+        </w:tc>
+        <w:tc>
+          <w:tcPr>
+            <w:tcW w:type="pct" w:w="1300"/>
+          </w:tcPr>
+          <w:p>
+            <w:r>
+              <w:rPr>
+                <w:rFonts w:ascii="Cambria" w:cs="Cambria" w:eastAsia="Cambria" w:hAnsi="Cambria"/>
+                <w:sz w:val="19"/>
+                <w:szCs w:val="19"/>
+              </w:rPr>
+              <w:t xml:space="preserve">Valid tokens accepted within ±15 min</w:t>
+            </w:r>
+          </w:p>
+        </w:tc>
+        <w:tc>
+          <w:tcPr>
+            <w:tcW w:type="pct" w:w="1300"/>
+          </w:tcPr>
+          <w:p>
+            <w:r>
+              <w:rPr>
+                <w:rFonts w:ascii="Cambria" w:cs="Cambria" w:eastAsia="Cambria" w:hAnsi="Cambria"/>
+                <w:sz w:val="19"/>
+                <w:szCs w:val="19"/>
+              </w:rPr>
+              <w:t xml:space="preserve">Removed false rejections of valid passes</w:t>
+            </w:r>
+          </w:p>
+        </w:tc>
+      </w:tr>
+      <w:tr>
+        <w:tc>
+          <w:tcPr>
+            <w:tcW w:type="pct" w:w="1100"/>
+          </w:tcPr>
+          <w:p>
+            <w:r>
+              <w:rPr>
+                <w:rFonts w:ascii="Cambria" w:cs="Cambria" w:eastAsia="Cambria" w:hAnsi="Cambria"/>
+                <w:sz w:val="19"/>
+                <w:szCs w:val="19"/>
+              </w:rPr>
+              <w:t xml:space="preserve">Multi-camera fallback</w:t>
+            </w:r>
+          </w:p>
+        </w:tc>
+        <w:tc>
+          <w:tcPr>
+            <w:tcW w:type="pct" w:w="1300"/>
+          </w:tcPr>
+          <w:p>
+            <w:r>
+              <w:rPr>
+                <w:rFonts w:ascii="Cambria" w:cs="Cambria" w:eastAsia="Cambria" w:hAnsi="Cambria"/>
+                <w:sz w:val="19"/>
+                <w:szCs w:val="19"/>
+              </w:rPr>
+              <w:t xml:space="preserve">Laptop, mobile, USB camera</w:t>
+            </w:r>
+          </w:p>
+        </w:tc>
+        <w:tc>
+          <w:tcPr>
+            <w:tcW w:type="pct" w:w="1300"/>
+          </w:tcPr>
+          <w:p>
+            <w:r>
+              <w:rPr>
+                <w:rFonts w:ascii="Cambria" w:cs="Cambria" w:eastAsia="Cambria" w:hAnsi="Cambria"/>
+                <w:sz w:val="19"/>
+                <w:szCs w:val="19"/>
+              </w:rPr>
+              <w:t xml:space="preserve">Camera opened on all tested devices</w:t>
+            </w:r>
+          </w:p>
+        </w:tc>
+        <w:tc>
+          <w:tcPr>
+            <w:tcW w:type="pct" w:w="1300"/>
+          </w:tcPr>
+          <w:p>
+            <w:r>
+              <w:rPr>
+                <w:rFonts w:ascii="Cambria" w:cs="Cambria" w:eastAsia="Cambria" w:hAnsi="Cambria"/>
+                <w:sz w:val="19"/>
+                <w:szCs w:val="19"/>
+              </w:rPr>
+              <w:t xml:space="preserve">Fallback hierarchy is reliable</w:t>
+            </w:r>
+          </w:p>
+        </w:tc>
+      </w:tr>
+      <w:tr>
+        <w:tc>
+          <w:tcPr>
+            <w:tcW w:type="pct" w:w="1100"/>
+          </w:tcPr>
+          <w:p>
+            <w:r>
+              <w:rPr>
+                <w:rFonts w:ascii="Cambria" w:cs="Cambria" w:eastAsia="Cambria" w:hAnsi="Cambria"/>
+                <w:sz w:val="19"/>
+                <w:szCs w:val="19"/>
+              </w:rPr>
+              <w:t xml:space="preserve">Continuous scanning</w:t>
+            </w:r>
+          </w:p>
+        </w:tc>
+        <w:tc>
+          <w:tcPr>
+            <w:tcW w:type="pct" w:w="1300"/>
+          </w:tcPr>
+          <w:p>
+            <w:r>
+              <w:rPr>
+                <w:rFonts w:ascii="Cambria" w:cs="Cambria" w:eastAsia="Cambria" w:hAnsi="Cambria"/>
+                <w:sz w:val="19"/>
+                <w:szCs w:val="19"/>
+              </w:rPr>
+              <w:t xml:space="preserve">Consecutive vehicle scans, 2.5 s debounce</w:t>
+            </w:r>
+          </w:p>
+        </w:tc>
+        <w:tc>
+          <w:tcPr>
+            <w:tcW w:type="pct" w:w="1300"/>
+          </w:tcPr>
+          <w:p>
+            <w:r>
+              <w:rPr>
+                <w:rFonts w:ascii="Cambria" w:cs="Cambria" w:eastAsia="Cambria" w:hAnsi="Cambria"/>
+                <w:sz w:val="19"/>
+                <w:szCs w:val="19"/>
+              </w:rPr>
+              <w:t xml:space="preserve">No duplicate scans or camera unmounting</w:t>
+            </w:r>
+          </w:p>
+        </w:tc>
+        <w:tc>
+          <w:tcPr>
+            <w:tcW w:type="pct" w:w="1300"/>
+          </w:tcPr>
+          <w:p>
+            <w:r>
+              <w:rPr>
+                <w:rFonts w:ascii="Cambria" w:cs="Cambria" w:eastAsia="Cambria" w:hAnsi="Cambria"/>
+                <w:sz w:val="19"/>
+                <w:szCs w:val="19"/>
+              </w:rPr>
+              <w:t xml:space="preserve">Suitable for high-traffic gates</w:t>
+            </w:r>
+          </w:p>
+        </w:tc>
+      </w:tr>
+      <w:tr>
+        <w:tc>
+          <w:tcPr>
+            <w:tcW w:type="pct" w:w="1100"/>
+          </w:tcPr>
+          <w:p>
+            <w:r>
+              <w:rPr>
+                <w:rFonts w:ascii="Cambria" w:cs="Cambria" w:eastAsia="Cambria" w:hAnsi="Cambria"/>
+                <w:sz w:val="19"/>
+                <w:szCs w:val="19"/>
+              </w:rPr>
+              <w:t xml:space="preserve">Case-insensitive HMAC</w:t>
+            </w:r>
+          </w:p>
+        </w:tc>
+        <w:tc>
+          <w:tcPr>
+            <w:tcW w:type="pct" w:w="1300"/>
+          </w:tcPr>
+          <w:p>
+            <w:r>
+              <w:rPr>
+                <w:rFonts w:ascii="Cambria" w:cs="Cambria" w:eastAsia="Cambria" w:hAnsi="Cambria"/>
+                <w:sz w:val="19"/>
+                <w:szCs w:val="19"/>
+              </w:rPr>
+              <w:t xml:space="preserve">Mixed-case hexadecimal hashes</w:t>
+            </w:r>
+          </w:p>
+        </w:tc>
+        <w:tc>
+          <w:tcPr>
+            <w:tcW w:type="pct" w:w="1300"/>
+          </w:tcPr>
+          <w:p>
+            <w:r>
+              <w:rPr>
+                <w:rFonts w:ascii="Cambria" w:cs="Cambria" w:eastAsia="Cambria" w:hAnsi="Cambria"/>
+                <w:sz w:val="19"/>
+                <w:szCs w:val="19"/>
+              </w:rPr>
+              <w:t xml:space="preserve">Hash matched correctly</w:t>
+            </w:r>
+          </w:p>
+        </w:tc>
+        <w:tc>
+          <w:tcPr>
+            <w:tcW w:type="pct" w:w="1300"/>
+          </w:tcPr>
+          <w:p>
+            <w:r>
+              <w:rPr>
+                <w:rFonts w:ascii="Cambria" w:cs="Cambria" w:eastAsia="Cambria" w:hAnsi="Cambria"/>
+                <w:sz w:val="19"/>
+                <w:szCs w:val="19"/>
+              </w:rPr>
+              <w:t xml:space="preserve">Eliminated hash mismatch errors</w:t>
             </w:r>
           </w:p>
         </w:tc>
@@ -25440,6 +28028,470 @@
                 <w:szCs w:val="19"/>
               </w:rPr>
               <w:t xml:space="preserve">Completed</w:t>
+            </w:r>
+          </w:p>
+        </w:tc>
+      </w:tr>
+    </w:tbl>
+    <w:p>
+      <w:pPr>
+        <w:pStyle w:val="Heading2"/>
+        <w:spacing w:after="100" w:before="220"/>
+      </w:pPr>
+      <w:r>
+        <w:t xml:space="preserve">Table 10.4: Comparative Results</w:t>
+      </w:r>
+      <w:r>
+        <w:rPr>
+          <w:rFonts w:ascii="Cambria" w:cs="Cambria" w:eastAsia="Cambria" w:hAnsi="Cambria"/>
+          <w:b/>
+          <w:bCs/>
+          <w:color w:val="1A252F"/>
+          <w:sz w:val="24"/>
+          <w:szCs w:val="24"/>
+        </w:rPr>
+        <w:t xml:space="preserve">Table 10.4: Comparative Results</w:t>
+      </w:r>
+    </w:p>
+    <w:p>
+      <w:pPr>
+        <w:spacing w:after="80" w:before="160"/>
+      </w:pPr>
+      <w:r>
+        <w:rPr>
+          <w:rFonts w:ascii="Cambria" w:cs="Cambria" w:eastAsia="Cambria" w:hAnsi="Cambria"/>
+          <w:b/>
+          <w:bCs/>
+          <w:color w:val="003366"/>
+          <w:sz w:val="22"/>
+          <w:szCs w:val="22"/>
+        </w:rPr>
+        <w:t xml:space="preserve">Table 10.4: Comparative Results</w:t>
+      </w:r>
+    </w:p>
+    <w:tbl>
+      <w:tblPr>
+        <w:tblW w:type="pct" w:w="5000"/>
+        <w:tblBorders>
+          <w:top w:val="single" w:color="auto" w:sz="4"/>
+          <w:left w:val="single" w:color="auto" w:sz="4"/>
+          <w:bottom w:val="single" w:color="auto" w:sz="4"/>
+          <w:right w:val="single" w:color="auto" w:sz="4"/>
+          <w:insideH w:val="single" w:color="auto" w:sz="4"/>
+          <w:insideV w:val="single" w:color="auto" w:sz="4"/>
+        </w:tblBorders>
+      </w:tblPr>
+      <w:tblGrid>
+        <w:gridCol w:w="1986"/>
+        <w:gridCol w:w="1354"/>
+        <w:gridCol w:w="1805"/>
+        <w:gridCol w:w="2076"/>
+        <w:gridCol w:w="1805"/>
+      </w:tblGrid>
+      <w:tr>
+        <w:trPr>
+          <w:tblHeader/>
+        </w:trPr>
+        <w:tc>
+          <w:tcPr>
+            <w:tcW w:type="pct" w:w="1100"/>
+            <w:shd w:fill="EAF2F8" w:val="clear"/>
+          </w:tcPr>
+          <w:p>
+            <w:r>
+              <w:rPr>
+                <w:rFonts w:ascii="Cambria" w:cs="Cambria" w:eastAsia="Cambria" w:hAnsi="Cambria"/>
+                <w:b/>
+                <w:bCs/>
+                <w:color w:val="003366"/>
+                <w:sz w:val="20"/>
+                <w:szCs w:val="20"/>
+              </w:rPr>
+              <w:t xml:space="preserve">Method / System</w:t>
+            </w:r>
+          </w:p>
+        </w:tc>
+        <w:tc>
+          <w:tcPr>
+            <w:tcW w:type="pct" w:w="750"/>
+            <w:shd w:fill="EAF2F8" w:val="clear"/>
+          </w:tcPr>
+          <w:p>
+            <w:r>
+              <w:rPr>
+                <w:rFonts w:ascii="Cambria" w:cs="Cambria" w:eastAsia="Cambria" w:hAnsi="Cambria"/>
+                <w:b/>
+                <w:bCs/>
+                <w:color w:val="003366"/>
+                <w:sz w:val="20"/>
+                <w:szCs w:val="20"/>
+              </w:rPr>
+              <w:t xml:space="preserve">Gate Time</w:t>
+            </w:r>
+          </w:p>
+        </w:tc>
+        <w:tc>
+          <w:tcPr>
+            <w:tcW w:type="pct" w:w="1000"/>
+            <w:shd w:fill="EAF2F8" w:val="clear"/>
+          </w:tcPr>
+          <w:p>
+            <w:r>
+              <w:rPr>
+                <w:rFonts w:ascii="Cambria" w:cs="Cambria" w:eastAsia="Cambria" w:hAnsi="Cambria"/>
+                <w:b/>
+                <w:bCs/>
+                <w:color w:val="003366"/>
+                <w:sz w:val="20"/>
+                <w:szCs w:val="20"/>
+              </w:rPr>
+              <w:t xml:space="preserve">Slot Pre-Booking</w:t>
+            </w:r>
+          </w:p>
+        </w:tc>
+        <w:tc>
+          <w:tcPr>
+            <w:tcW w:type="pct" w:w="1150"/>
+            <w:shd w:fill="EAF2F8" w:val="clear"/>
+          </w:tcPr>
+          <w:p>
+            <w:r>
+              <w:rPr>
+                <w:rFonts w:ascii="Cambria" w:cs="Cambria" w:eastAsia="Cambria" w:hAnsi="Cambria"/>
+                <w:b/>
+                <w:bCs/>
+                <w:color w:val="003366"/>
+                <w:sz w:val="20"/>
+                <w:szCs w:val="20"/>
+              </w:rPr>
+              <w:t xml:space="preserve">Pass Security</w:t>
+            </w:r>
+          </w:p>
+        </w:tc>
+        <w:tc>
+          <w:tcPr>
+            <w:tcW w:type="pct" w:w="1000"/>
+            <w:shd w:fill="EAF2F8" w:val="clear"/>
+          </w:tcPr>
+          <w:p>
+            <w:r>
+              <w:rPr>
+                <w:rFonts w:ascii="Cambria" w:cs="Cambria" w:eastAsia="Cambria" w:hAnsi="Cambria"/>
+                <w:b/>
+                <w:bCs/>
+                <w:color w:val="003366"/>
+                <w:sz w:val="20"/>
+                <w:szCs w:val="20"/>
+              </w:rPr>
+              <w:t xml:space="preserve">Observation</w:t>
+            </w:r>
+          </w:p>
+        </w:tc>
+      </w:tr>
+      <w:tr>
+        <w:tc>
+          <w:tcPr>
+            <w:tcW w:type="pct" w:w="1100"/>
+          </w:tcPr>
+          <w:p>
+            <w:r>
+              <w:rPr>
+                <w:rFonts w:ascii="Cambria" w:cs="Cambria" w:eastAsia="Cambria" w:hAnsi="Cambria"/>
+                <w:sz w:val="19"/>
+                <w:szCs w:val="19"/>
+              </w:rPr>
+              <w:t xml:space="preserve">Manual attendant</w:t>
+            </w:r>
+          </w:p>
+        </w:tc>
+        <w:tc>
+          <w:tcPr>
+            <w:tcW w:type="pct" w:w="750"/>
+          </w:tcPr>
+          <w:p>
+            <w:r>
+              <w:rPr>
+                <w:rFonts w:ascii="Cambria" w:cs="Cambria" w:eastAsia="Cambria" w:hAnsi="Cambria"/>
+                <w:sz w:val="19"/>
+                <w:szCs w:val="19"/>
+              </w:rPr>
+              <w:t xml:space="preserve">30–60 s</w:t>
+            </w:r>
+          </w:p>
+        </w:tc>
+        <w:tc>
+          <w:tcPr>
+            <w:tcW w:type="pct" w:w="1000"/>
+          </w:tcPr>
+          <w:p>
+            <w:r>
+              <w:rPr>
+                <w:rFonts w:ascii="Cambria" w:cs="Cambria" w:eastAsia="Cambria" w:hAnsi="Cambria"/>
+                <w:sz w:val="19"/>
+                <w:szCs w:val="19"/>
+              </w:rPr>
+              <w:t xml:space="preserve">Not possible</w:t>
+            </w:r>
+          </w:p>
+        </w:tc>
+        <w:tc>
+          <w:tcPr>
+            <w:tcW w:type="pct" w:w="1150"/>
+          </w:tcPr>
+          <w:p>
+            <w:r>
+              <w:rPr>
+                <w:rFonts w:ascii="Cambria" w:cs="Cambria" w:eastAsia="Cambria" w:hAnsi="Cambria"/>
+                <w:sz w:val="19"/>
+                <w:szCs w:val="19"/>
+              </w:rPr>
+              <w:t xml:space="preserve">Low (paper slip)</w:t>
+            </w:r>
+          </w:p>
+        </w:tc>
+        <w:tc>
+          <w:tcPr>
+            <w:tcW w:type="pct" w:w="1000"/>
+          </w:tcPr>
+          <w:p>
+            <w:r>
+              <w:rPr>
+                <w:rFonts w:ascii="Cambria" w:cs="Cambria" w:eastAsia="Cambria" w:hAnsi="Cambria"/>
+                <w:sz w:val="19"/>
+                <w:szCs w:val="19"/>
+              </w:rPr>
+              <w:t xml:space="preserve">Slow and error-prone</w:t>
+            </w:r>
+          </w:p>
+        </w:tc>
+      </w:tr>
+      <w:tr>
+        <w:tc>
+          <w:tcPr>
+            <w:tcW w:type="pct" w:w="1100"/>
+          </w:tcPr>
+          <w:p>
+            <w:r>
+              <w:rPr>
+                <w:rFonts w:ascii="Cambria" w:cs="Cambria" w:eastAsia="Cambria" w:hAnsi="Cambria"/>
+                <w:sz w:val="19"/>
+                <w:szCs w:val="19"/>
+              </w:rPr>
+              <w:t xml:space="preserve">Sensor-hardware system</w:t>
+            </w:r>
+          </w:p>
+        </w:tc>
+        <w:tc>
+          <w:tcPr>
+            <w:tcW w:type="pct" w:w="750"/>
+          </w:tcPr>
+          <w:p>
+            <w:r>
+              <w:rPr>
+                <w:rFonts w:ascii="Cambria" w:cs="Cambria" w:eastAsia="Cambria" w:hAnsi="Cambria"/>
+                <w:sz w:val="19"/>
+                <w:szCs w:val="19"/>
+              </w:rPr>
+              <w:t xml:space="preserve">5–10 s</w:t>
+            </w:r>
+          </w:p>
+        </w:tc>
+        <w:tc>
+          <w:tcPr>
+            <w:tcW w:type="pct" w:w="1000"/>
+          </w:tcPr>
+          <w:p>
+            <w:r>
+              <w:rPr>
+                <w:rFonts w:ascii="Cambria" w:cs="Cambria" w:eastAsia="Cambria" w:hAnsi="Cambria"/>
+                <w:sz w:val="19"/>
+                <w:szCs w:val="19"/>
+              </w:rPr>
+              <w:t xml:space="preserve">Select apps only</w:t>
+            </w:r>
+          </w:p>
+        </w:tc>
+        <w:tc>
+          <w:tcPr>
+            <w:tcW w:type="pct" w:w="1150"/>
+          </w:tcPr>
+          <w:p>
+            <w:r>
+              <w:rPr>
+                <w:rFonts w:ascii="Cambria" w:cs="Cambria" w:eastAsia="Cambria" w:hAnsi="Cambria"/>
+                <w:sz w:val="19"/>
+                <w:szCs w:val="19"/>
+              </w:rPr>
+              <w:t xml:space="preserve">Medium (RFID card)</w:t>
+            </w:r>
+          </w:p>
+        </w:tc>
+        <w:tc>
+          <w:tcPr>
+            <w:tcW w:type="pct" w:w="1000"/>
+          </w:tcPr>
+          <w:p>
+            <w:r>
+              <w:rPr>
+                <w:rFonts w:ascii="Cambria" w:cs="Cambria" w:eastAsia="Cambria" w:hAnsi="Cambria"/>
+                <w:sz w:val="19"/>
+                <w:szCs w:val="19"/>
+              </w:rPr>
+              <w:t xml:space="preserve">High hardware cost</w:t>
+            </w:r>
+          </w:p>
+        </w:tc>
+      </w:tr>
+      <w:tr>
+        <w:tc>
+          <w:tcPr>
+            <w:tcW w:type="pct" w:w="1100"/>
+          </w:tcPr>
+          <w:p>
+            <w:r>
+              <w:rPr>
+                <w:rFonts w:ascii="Cambria" w:cs="Cambria" w:eastAsia="Cambria" w:hAnsi="Cambria"/>
+                <w:sz w:val="19"/>
+                <w:szCs w:val="19"/>
+              </w:rPr>
+              <w:t xml:space="preserve">Static QR app</w:t>
+            </w:r>
+          </w:p>
+        </w:tc>
+        <w:tc>
+          <w:tcPr>
+            <w:tcW w:type="pct" w:w="750"/>
+          </w:tcPr>
+          <w:p>
+            <w:r>
+              <w:rPr>
+                <w:rFonts w:ascii="Cambria" w:cs="Cambria" w:eastAsia="Cambria" w:hAnsi="Cambria"/>
+                <w:sz w:val="19"/>
+                <w:szCs w:val="19"/>
+              </w:rPr>
+              <w:t xml:space="preserve">Fast</w:t>
+            </w:r>
+          </w:p>
+        </w:tc>
+        <w:tc>
+          <w:tcPr>
+            <w:tcW w:type="pct" w:w="1000"/>
+          </w:tcPr>
+          <w:p>
+            <w:r>
+              <w:rPr>
+                <w:rFonts w:ascii="Cambria" w:cs="Cambria" w:eastAsia="Cambria" w:hAnsi="Cambria"/>
+                <w:sz w:val="19"/>
+                <w:szCs w:val="19"/>
+              </w:rPr>
+              <w:t xml:space="preserve">Yes</w:t>
+            </w:r>
+          </w:p>
+        </w:tc>
+        <w:tc>
+          <w:tcPr>
+            <w:tcW w:type="pct" w:w="1150"/>
+          </w:tcPr>
+          <w:p>
+            <w:r>
+              <w:rPr>
+                <w:rFonts w:ascii="Cambria" w:cs="Cambria" w:eastAsia="Cambria" w:hAnsi="Cambria"/>
+                <w:sz w:val="19"/>
+                <w:szCs w:val="19"/>
+              </w:rPr>
+              <w:t xml:space="preserve">Low (shareable)</w:t>
+            </w:r>
+          </w:p>
+        </w:tc>
+        <w:tc>
+          <w:tcPr>
+            <w:tcW w:type="pct" w:w="1000"/>
+          </w:tcPr>
+          <w:p>
+            <w:r>
+              <w:rPr>
+                <w:rFonts w:ascii="Cambria" w:cs="Cambria" w:eastAsia="Cambria" w:hAnsi="Cambria"/>
+                <w:sz w:val="19"/>
+                <w:szCs w:val="19"/>
+              </w:rPr>
+              <w:t xml:space="preserve">Fraud risk via screenshots</w:t>
+            </w:r>
+          </w:p>
+        </w:tc>
+      </w:tr>
+      <w:tr>
+        <w:tc>
+          <w:tcPr>
+            <w:tcW w:type="pct" w:w="1100"/>
+          </w:tcPr>
+          <w:p>
+            <w:r>
+              <w:rPr>
+                <w:rFonts w:ascii="Cambria" w:cs="Cambria" w:eastAsia="Cambria" w:hAnsi="Cambria"/>
+                <w:sz w:val="19"/>
+                <w:szCs w:val="19"/>
+              </w:rPr>
+              <w:t xml:space="preserve">ParkSmart</w:t>
+            </w:r>
+          </w:p>
+        </w:tc>
+        <w:tc>
+          <w:tcPr>
+            <w:tcW w:type="pct" w:w="750"/>
+          </w:tcPr>
+          <w:p>
+            <w:r>
+              <w:rPr>
+                <w:rFonts w:ascii="Cambria" w:cs="Cambria" w:eastAsia="Cambria" w:hAnsi="Cambria"/>
+                <w:sz w:val="19"/>
+                <w:szCs w:val="19"/>
+              </w:rPr>
+              <w:t xml:space="preserve">&lt; 2 s</w:t>
+            </w:r>
+          </w:p>
+        </w:tc>
+        <w:tc>
+          <w:tcPr>
+            <w:tcW w:type="pct" w:w="1000"/>
+          </w:tcPr>
+          <w:p>
+            <w:r>
+              <w:rPr>
+                <w:rFonts w:ascii="Cambria" w:cs="Cambria" w:eastAsia="Cambria" w:hAnsi="Cambria"/>
+                <w:sz w:val="19"/>
+                <w:szCs w:val="19"/>
+              </w:rPr>
+              <w:t xml:space="preserve">Yes, live map</w:t>
+            </w:r>
+          </w:p>
+        </w:tc>
+        <w:tc>
+          <w:tcPr>
+            <w:tcW w:type="pct" w:w="1150"/>
+          </w:tcPr>
+          <w:p>
+            <w:r>
+              <w:rPr>
+                <w:rFonts w:ascii="Cambria" w:cs="Cambria" w:eastAsia="Cambria" w:hAnsi="Cambria"/>
+                <w:sz w:val="19"/>
+                <w:szCs w:val="19"/>
+              </w:rPr>
+              <w:t xml:space="preserve">High (rotating HMAC QR)</w:t>
+            </w:r>
+          </w:p>
+        </w:tc>
+        <w:tc>
+          <w:tcPr>
+            <w:tcW w:type="pct" w:w="1000"/>
+          </w:tcPr>
+          <w:p>
+            <w:r>
+              <w:rPr>
+                <w:rFonts w:ascii="Cambria" w:cs="Cambria" w:eastAsia="Cambria" w:hAnsi="Cambria"/>
+                <w:sz w:val="19"/>
+                <w:szCs w:val="19"/>
+              </w:rPr>
+              <w:t xml:space="preserve">Low cost and tamper-proof</w:t>
             </w:r>
           </w:p>
         </w:tc>

</xml_diff>

<commit_message>
docs: add Figure 6.3.5 Dynamic QR sequence diagram to reports
</commit_message>
<xml_diff>
--- a/ParkSmart_Final_Project_Report.docx
+++ b/ParkSmart_Final_Project_Report.docx
@@ -2474,7 +2474,7 @@
                 <w:sz w:val="19"/>
                 <w:szCs w:val="19"/>
               </w:rPr>
-              <w:t xml:space="preserve">Block Diagram - Driver Portal</w:t>
+              <w:t xml:space="preserve">Block Diagram of Customer Dashboard</w:t>
             </w:r>
           </w:p>
         </w:tc>
@@ -2506,6 +2506,53 @@
                 <w:sz w:val="19"/>
                 <w:szCs w:val="19"/>
               </w:rPr>
+              <w:t xml:space="preserve">Figure 6.3.5</w:t>
+            </w:r>
+          </w:p>
+        </w:tc>
+        <w:tc>
+          <w:tcPr>
+            <w:tcW w:type="pct" w:w="3350"/>
+          </w:tcPr>
+          <w:p>
+            <w:r>
+              <w:rPr>
+                <w:rFonts w:ascii="Cambria" w:cs="Cambria" w:eastAsia="Cambria" w:hAnsi="Cambria"/>
+                <w:sz w:val="19"/>
+                <w:szCs w:val="19"/>
+              </w:rPr>
+              <w:t xml:space="preserve">Dynamic QR Pass Generation &amp; Verification Sequence Diagram</w:t>
+            </w:r>
+          </w:p>
+        </w:tc>
+        <w:tc>
+          <w:tcPr>
+            <w:tcW w:type="pct" w:w="750"/>
+          </w:tcPr>
+          <w:p>
+            <w:r>
+              <w:rPr>
+                <w:rFonts w:ascii="Cambria" w:cs="Cambria" w:eastAsia="Cambria" w:hAnsi="Cambria"/>
+                <w:sz w:val="19"/>
+                <w:szCs w:val="19"/>
+              </w:rPr>
+              <w:t xml:space="preserve">29</w:t>
+            </w:r>
+          </w:p>
+        </w:tc>
+      </w:tr>
+      <w:tr>
+        <w:tc>
+          <w:tcPr>
+            <w:tcW w:type="pct" w:w="900"/>
+          </w:tcPr>
+          <w:p>
+            <w:r>
+              <w:rPr>
+                <w:rFonts w:ascii="Cambria" w:cs="Cambria" w:eastAsia="Cambria" w:hAnsi="Cambria"/>
+                <w:sz w:val="19"/>
+                <w:szCs w:val="19"/>
+              </w:rPr>
               <w:t xml:space="preserve">Figure 6.3.6</w:t>
             </w:r>
           </w:p>
@@ -2521,7 +2568,7 @@
                 <w:sz w:val="19"/>
                 <w:szCs w:val="19"/>
               </w:rPr>
-              <w:t xml:space="preserve">Dynamic QR Verification Sequence Diagram</w:t>
+              <w:t xml:space="preserve">Payment Gateway Sequence Diagram</w:t>
             </w:r>
           </w:p>
         </w:tc>
@@ -2536,7 +2583,7 @@
                 <w:sz w:val="19"/>
                 <w:szCs w:val="19"/>
               </w:rPr>
-              <w:t xml:space="preserve">29</w:t>
+              <w:t xml:space="preserve">30</w:t>
             </w:r>
           </w:p>
         </w:tc>
@@ -2583,7 +2630,7 @@
                 <w:sz w:val="19"/>
                 <w:szCs w:val="19"/>
               </w:rPr>
-              <w:t xml:space="preserve">30</w:t>
+              <w:t xml:space="preserve">31</w:t>
             </w:r>
           </w:p>
         </w:tc>
@@ -2630,7 +2677,7 @@
                 <w:sz w:val="19"/>
                 <w:szCs w:val="19"/>
               </w:rPr>
-              <w:t xml:space="preserve">31</w:t>
+              <w:t xml:space="preserve">32</w:t>
             </w:r>
           </w:p>
         </w:tc>
@@ -14219,6 +14266,92 @@
           <w:szCs w:val="20"/>
         </w:rPr>
         <w:t xml:space="preserve">Refer to User section in Block Diagram in Reporting 2: User connecting to Register, Login, View Slots, Book Slot, View History, and Manage Profile.</w:t>
+      </w:r>
+    </w:p>
+    <w:p>
+      <w:pPr>
+        <w:spacing w:after="60" w:before="160"/>
+        <w:jc w:val="center"/>
+      </w:pPr>
+      <w:r>
+        <w:rPr>
+          <w:rFonts w:ascii="Cambria" w:cs="Cambria" w:eastAsia="Cambria" w:hAnsi="Cambria"/>
+          <w:b/>
+          <w:bCs/>
+          <w:color w:val="7F8C8D"/>
+          <w:sz w:val="21"/>
+          <w:szCs w:val="21"/>
+        </w:rPr>
+        <w:t xml:space="preserve">[ INSERT SCREENSHOT / FIGURE HERE: Figure 6.3.5 ]</w:t>
+      </w:r>
+    </w:p>
+    <w:p>
+      <w:pPr>
+        <w:spacing w:after="60" w:before="40"/>
+        <w:jc w:val="center"/>
+      </w:pPr>
+      <w:r>
+        <w:rPr>
+          <w:rFonts w:ascii="Cambria" w:cs="Cambria" w:eastAsia="Cambria" w:hAnsi="Cambria"/>
+          <w:b/>
+          <w:bCs/>
+          <w:color w:val="003366"/>
+          <w:sz w:val="22"/>
+          <w:szCs w:val="22"/>
+        </w:rPr>
+        <w:t xml:space="preserve">Figure 6.3.5: Dynamic QR Pass Generation &amp; Verification Sequence Diagram</w:t>
+      </w:r>
+    </w:p>
+    <w:p>
+      <w:pPr>
+        <w:spacing w:after="60" w:before="40"/>
+        <w:jc w:val="both"/>
+      </w:pPr>
+      <w:r>
+        <w:rPr>
+          <w:rFonts w:ascii="Cambria" w:cs="Cambria" w:eastAsia="Cambria" w:hAnsi="Cambria"/>
+          <w:b/>
+          <w:bCs/>
+          <w:sz w:val="21"/>
+          <w:szCs w:val="21"/>
+        </w:rPr>
+        <w:t xml:space="preserve">Description: </w:t>
+      </w:r>
+      <w:r>
+        <w:rPr>
+          <w:rFonts w:ascii="Cambria" w:cs="Cambria" w:eastAsia="Cambria" w:hAnsi="Cambria"/>
+          <w:sz w:val="21"/>
+          <w:szCs w:val="21"/>
+        </w:rPr>
+        <w:t xml:space="preserve">UML sequence diagram illustrating the end-to-end 10-step dynamic pass issuance, clock-drift tolerance check, and boom barrier actuation.</w:t>
+      </w:r>
+    </w:p>
+    <w:p>
+      <w:pPr>
+        <w:spacing w:after="160" w:before="20"/>
+        <w:jc w:val="both"/>
+      </w:pPr>
+      <w:r>
+        <w:rPr>
+          <w:rFonts w:ascii="Cambria" w:cs="Cambria" w:eastAsia="Cambria" w:hAnsi="Cambria"/>
+          <w:b/>
+          <w:bCs/>
+          <w:color w:val="C0392B"/>
+          <w:sz w:val="20"/>
+          <w:szCs w:val="20"/>
+        </w:rPr>
+        <w:t xml:space="preserve">How to Capture: </w:t>
+      </w:r>
+      <w:r>
+        <w:rPr>
+          <w:rFonts w:ascii="Cambria" w:cs="Cambria" w:eastAsia="Cambria" w:hAnsi="Cambria"/>
+          <w:i/>
+          <w:iCs/>
+          <w:color w:val="555555"/>
+          <w:sz w:val="20"/>
+          <w:szCs w:val="20"/>
+        </w:rPr>
+        <w:t xml:space="preserve">Sequence: Driver Phone -&gt; React UI (Get Token) -&gt; Express Backend (HMAC-SHA256 Compute) -&gt; Render 30s Dynamic QR -&gt; Scan at Security Camera -&gt; Hash &amp; Clock Drift Check -&gt; Boom Barrier Open.</w:t>
       </w:r>
     </w:p>
     <w:p>

</xml_diff>